<commit_message>
Rombak sensor: LED merah + fototransistor SMD 1206, tanpa MCP23017, roda Ø34 (v14)
- Model mekanik v14 (CadQuery): 12 pasang LED merah + fototransistor SMD di sisi
  bawah PCB sensor capit, masker sensor 3D print, mux di atas palm PCB sensor,
  skid nilon pengganti ball caster; STEP/STL/DXF per bagian + render
- Wiring diagram: blok sensor baru (R 330 Ω LED, R 10k pull-up), MCP23017 dihapus,
  pin 1/10/12 kabel pita kosong
- Charter/RAB Rp859.500 (md + docx) dan generator docx disimpan di docs/charter-docx
- CLAUDE.md dan mechanical/README.md mencatat keputusan 20/10/2026

Co-Authored-By: Claude Opus 5.5 <noreply@anthropic.com>
Claude-Session: https://claude.ai/code/session_0155yf5wpAX58VAfqTZWuQQK
</commit_message>
<xml_diff>
--- a/docs/Project_Charter_PJBL.docx
+++ b/docs/Project_Charter_PJBL.docx
@@ -1006,7 +1006,7 @@
                 <w:sz w:val="24"/>
                 <w:szCs w:val="24"/>
               </w:rPr>
-              <w:t xml:space="preserve">Elektronik: 12 sensor garis TCRT5000 (PCB sensor bentuk jangkar) + multiplexer + LED indikator tiap sensor, motor DC + encoder, driver motor, OLED, catu daya baterai 2S (2× 18650)</w:t>
+              <w:t xml:space="preserve">Elektronik: 12 sensor garis (LED merah + fototransistor SMD, PCB sensor bentuk jangkar) + multiplexer, motor DC + encoder, driver motor, OLED, catu daya baterai 2S (2× 18650)</w:t>
             </w:r>
           </w:p>
           <w:p>
@@ -4136,7 +4136,7 @@
                 <w:sz w:val="20"/>
                 <w:szCs w:val="20"/>
               </w:rPr>
-              <w:t xml:space="preserve">OLED 1.3" 128×64 I2C</w:t>
+              <w:t xml:space="preserve">OLED 0.96" 128×64 I2C</w:t>
             </w:r>
           </w:p>
         </w:tc>
@@ -4168,7 +4168,7 @@
                 <w:sz w:val="20"/>
                 <w:szCs w:val="20"/>
               </w:rPr>
-              <w:t xml:space="preserve">Rp52.000</w:t>
+              <w:t xml:space="preserve">Rp33.000</w:t>
             </w:r>
           </w:p>
         </w:tc>
@@ -4264,7 +4264,7 @@
                 <w:sz w:val="20"/>
                 <w:szCs w:val="20"/>
               </w:rPr>
-              <w:t xml:space="preserve">Rp52.000</w:t>
+              <w:t xml:space="preserve">Rp33.000</w:t>
             </w:r>
           </w:p>
         </w:tc>
@@ -4301,7 +4301,7 @@
                 <w:sz w:val="20"/>
                 <w:szCs w:val="20"/>
               </w:rPr>
-              <w:t xml:space="preserve">Sensor IR TCRT5000 (12 titik + 1 cadangan)</w:t>
+              <w:t xml:space="preserve">LED SMD 1206 merah superbright (sensor, 12 + 3 cadangan)</w:t>
             </w:r>
           </w:p>
         </w:tc>
@@ -4333,7 +4333,7 @@
                 <w:sz w:val="20"/>
                 <w:szCs w:val="20"/>
               </w:rPr>
-              <w:t xml:space="preserve">Rp3.000</w:t>
+              <w:t xml:space="preserve">Rp500</w:t>
             </w:r>
           </w:p>
         </w:tc>
@@ -4365,7 +4365,7 @@
                 <w:sz w:val="20"/>
                 <w:szCs w:val="20"/>
               </w:rPr>
-              <w:t xml:space="preserve">13</w:t>
+              <w:t xml:space="preserve">15</w:t>
             </w:r>
           </w:p>
         </w:tc>
@@ -4429,7 +4429,7 @@
                 <w:sz w:val="20"/>
                 <w:szCs w:val="20"/>
               </w:rPr>
-              <w:t xml:space="preserve">Rp39.000</w:t>
+              <w:t xml:space="preserve">Rp7.500</w:t>
             </w:r>
           </w:p>
         </w:tc>
@@ -4466,7 +4466,7 @@
                 <w:sz w:val="20"/>
                 <w:szCs w:val="20"/>
               </w:rPr>
-              <w:t xml:space="preserve">Modul multiplexer analog CD74HC4067 16 kanal</w:t>
+              <w:t xml:space="preserve">Fototransistor SMD 1206 bening, impor (mis. Everlight PT15-21C; 12 + 3 cadangan)</w:t>
             </w:r>
           </w:p>
         </w:tc>
@@ -4498,7 +4498,7 @@
                 <w:sz w:val="20"/>
                 <w:szCs w:val="20"/>
               </w:rPr>
-              <w:t xml:space="preserve">Rp15.000</w:t>
+              <w:t xml:space="preserve">Rp4.000</w:t>
             </w:r>
           </w:p>
         </w:tc>
@@ -4530,7 +4530,7 @@
                 <w:sz w:val="20"/>
                 <w:szCs w:val="20"/>
               </w:rPr>
-              <w:t xml:space="preserve">1</w:t>
+              <w:t xml:space="preserve">15</w:t>
             </w:r>
           </w:p>
         </w:tc>
@@ -4594,7 +4594,7 @@
                 <w:sz w:val="20"/>
                 <w:szCs w:val="20"/>
               </w:rPr>
-              <w:t xml:space="preserve">Rp15.000</w:t>
+              <w:t xml:space="preserve">Rp60.000</w:t>
             </w:r>
           </w:p>
         </w:tc>
@@ -4631,7 +4631,7 @@
                 <w:sz w:val="20"/>
                 <w:szCs w:val="20"/>
               </w:rPr>
-              <w:t xml:space="preserve">IC MCP23017 DIP-28 + socket (LED indikator sensor)</w:t>
+              <w:t xml:space="preserve">Modul multiplexer analog CD74HC4067 16 kanal</w:t>
             </w:r>
           </w:p>
         </w:tc>
@@ -4663,7 +4663,7 @@
                 <w:sz w:val="20"/>
                 <w:szCs w:val="20"/>
               </w:rPr>
-              <w:t xml:space="preserve">Rp22.000</w:t>
+              <w:t xml:space="preserve">Rp15.000</w:t>
             </w:r>
           </w:p>
         </w:tc>
@@ -4759,7 +4759,7 @@
                 <w:sz w:val="20"/>
                 <w:szCs w:val="20"/>
               </w:rPr>
-              <w:t xml:space="preserve">Rp22.000</w:t>
+              <w:t xml:space="preserve">Rp15.000</w:t>
             </w:r>
           </w:p>
         </w:tc>
@@ -5291,7 +5291,7 @@
                 <w:sz w:val="20"/>
                 <w:szCs w:val="20"/>
               </w:rPr>
-              <w:t xml:space="preserve">LED SMD 0805 (indikator sensor, +3 cadangan)</w:t>
+              <w:t xml:space="preserve">Resistor SMD 0805 (330 Ω dan 10 kΩ untuk PCB sensor)</w:t>
             </w:r>
           </w:p>
         </w:tc>
@@ -5355,7 +5355,7 @@
                 <w:sz w:val="20"/>
                 <w:szCs w:val="20"/>
               </w:rPr>
-              <w:t xml:space="preserve">15</w:t>
+              <w:t xml:space="preserve">30</w:t>
             </w:r>
           </w:p>
         </w:tc>
@@ -5419,7 +5419,7 @@
                 <w:sz w:val="20"/>
                 <w:szCs w:val="20"/>
               </w:rPr>
-              <w:t xml:space="preserve">Rp1.500</w:t>
+              <w:t xml:space="preserve">Rp3.000</w:t>
             </w:r>
           </w:p>
         </w:tc>
@@ -5456,7 +5456,7 @@
                 <w:sz w:val="20"/>
                 <w:szCs w:val="20"/>
               </w:rPr>
-              <w:t xml:space="preserve">Resistor SMD 0805 (330 Ω &amp; 4,7 kΩ, PCB sensor)</w:t>
+              <w:t xml:space="preserve">Resistor 10 kΩ</w:t>
             </w:r>
           </w:p>
         </w:tc>
@@ -5488,7 +5488,7 @@
                 <w:sz w:val="20"/>
                 <w:szCs w:val="20"/>
               </w:rPr>
-              <w:t xml:space="preserve">Rp100</w:t>
+              <w:t xml:space="preserve">Rp200</w:t>
             </w:r>
           </w:p>
         </w:tc>
@@ -5520,7 +5520,7 @@
                 <w:sz w:val="20"/>
                 <w:szCs w:val="20"/>
               </w:rPr>
-              <w:t xml:space="preserve">40</w:t>
+              <w:t xml:space="preserve">10</w:t>
             </w:r>
           </w:p>
         </w:tc>
@@ -5584,7 +5584,7 @@
                 <w:sz w:val="20"/>
                 <w:szCs w:val="20"/>
               </w:rPr>
-              <w:t xml:space="preserve">Rp4.000</w:t>
+              <w:t xml:space="preserve">Rp2.000</w:t>
             </w:r>
           </w:p>
         </w:tc>
@@ -5621,7 +5621,7 @@
                 <w:sz w:val="20"/>
                 <w:szCs w:val="20"/>
               </w:rPr>
-              <w:t xml:space="preserve">Resistor 10k Ω</w:t>
+              <w:t xml:space="preserve">Buzzer</w:t>
             </w:r>
           </w:p>
         </w:tc>
@@ -5653,7 +5653,7 @@
                 <w:sz w:val="20"/>
                 <w:szCs w:val="20"/>
               </w:rPr>
-              <w:t xml:space="preserve">Rp200</w:t>
+              <w:t xml:space="preserve">Rp3.000</w:t>
             </w:r>
           </w:p>
         </w:tc>
@@ -5685,7 +5685,7 @@
                 <w:sz w:val="20"/>
                 <w:szCs w:val="20"/>
               </w:rPr>
-              <w:t xml:space="preserve">10</w:t>
+              <w:t xml:space="preserve">1</w:t>
             </w:r>
           </w:p>
         </w:tc>
@@ -5749,7 +5749,7 @@
                 <w:sz w:val="20"/>
                 <w:szCs w:val="20"/>
               </w:rPr>
-              <w:t xml:space="preserve">Rp2.000</w:t>
+              <w:t xml:space="preserve">Rp3.000</w:t>
             </w:r>
           </w:p>
         </w:tc>
@@ -5786,7 +5786,7 @@
                 <w:sz w:val="20"/>
                 <w:szCs w:val="20"/>
               </w:rPr>
-              <w:t xml:space="preserve">Buzzer</w:t>
+              <w:t xml:space="preserve">Baterai Li-ion 18650</w:t>
             </w:r>
           </w:p>
         </w:tc>
@@ -5818,7 +5818,7 @@
                 <w:sz w:val="20"/>
                 <w:szCs w:val="20"/>
               </w:rPr>
-              <w:t xml:space="preserve">Rp3.000</w:t>
+              <w:t xml:space="preserve">Rp40.000</w:t>
             </w:r>
           </w:p>
         </w:tc>
@@ -5850,7 +5850,7 @@
                 <w:sz w:val="20"/>
                 <w:szCs w:val="20"/>
               </w:rPr>
-              <w:t xml:space="preserve">1</w:t>
+              <w:t xml:space="preserve">2</w:t>
             </w:r>
           </w:p>
         </w:tc>
@@ -5914,7 +5914,7 @@
                 <w:sz w:val="20"/>
                 <w:szCs w:val="20"/>
               </w:rPr>
-              <w:t xml:space="preserve">Rp3.000</w:t>
+              <w:t xml:space="preserve">Rp80.000</w:t>
             </w:r>
           </w:p>
         </w:tc>
@@ -5951,7 +5951,7 @@
                 <w:sz w:val="20"/>
                 <w:szCs w:val="20"/>
               </w:rPr>
-              <w:t xml:space="preserve">Baterai Li-ion 18650</w:t>
+              <w:t xml:space="preserve">Holder baterai 2× 18650 (seri)</w:t>
             </w:r>
           </w:p>
         </w:tc>
@@ -5983,7 +5983,7 @@
                 <w:sz w:val="20"/>
                 <w:szCs w:val="20"/>
               </w:rPr>
-              <w:t xml:space="preserve">Rp40.000</w:t>
+              <w:t xml:space="preserve">Rp8.000</w:t>
             </w:r>
           </w:p>
         </w:tc>
@@ -6015,7 +6015,7 @@
                 <w:sz w:val="20"/>
                 <w:szCs w:val="20"/>
               </w:rPr>
-              <w:t xml:space="preserve">2</w:t>
+              <w:t xml:space="preserve">1</w:t>
             </w:r>
           </w:p>
         </w:tc>
@@ -6079,7 +6079,7 @@
                 <w:sz w:val="20"/>
                 <w:szCs w:val="20"/>
               </w:rPr>
-              <w:t xml:space="preserve">Rp80.000</w:t>
+              <w:t xml:space="preserve">Rp8.000</w:t>
             </w:r>
           </w:p>
         </w:tc>
@@ -6116,7 +6116,7 @@
                 <w:sz w:val="20"/>
                 <w:szCs w:val="20"/>
               </w:rPr>
-              <w:t xml:space="preserve">Holder baterai 2× 18650 (seri)</w:t>
+              <w:t xml:space="preserve">Modul BMS 2S</w:t>
             </w:r>
           </w:p>
         </w:tc>
@@ -6148,7 +6148,7 @@
                 <w:sz w:val="20"/>
                 <w:szCs w:val="20"/>
               </w:rPr>
-              <w:t xml:space="preserve">Rp8.000</w:t>
+              <w:t xml:space="preserve">Rp10.000</w:t>
             </w:r>
           </w:p>
         </w:tc>
@@ -6244,7 +6244,7 @@
                 <w:sz w:val="20"/>
                 <w:szCs w:val="20"/>
               </w:rPr>
-              <w:t xml:space="preserve">Rp8.000</w:t>
+              <w:t xml:space="preserve">Rp10.000</w:t>
             </w:r>
           </w:p>
         </w:tc>
@@ -6281,7 +6281,7 @@
                 <w:sz w:val="20"/>
                 <w:szCs w:val="20"/>
               </w:rPr>
-              <w:t xml:space="preserve">Modul BMS 2S</w:t>
+              <w:t xml:space="preserve">Modul charger 2S USB-C</w:t>
             </w:r>
           </w:p>
         </w:tc>
@@ -6313,7 +6313,7 @@
                 <w:sz w:val="20"/>
                 <w:szCs w:val="20"/>
               </w:rPr>
-              <w:t xml:space="preserve">Rp10.000</w:t>
+              <w:t xml:space="preserve">Rp25.000</w:t>
             </w:r>
           </w:p>
         </w:tc>
@@ -6409,7 +6409,7 @@
                 <w:sz w:val="20"/>
                 <w:szCs w:val="20"/>
               </w:rPr>
-              <w:t xml:space="preserve">Rp10.000</w:t>
+              <w:t xml:space="preserve">Rp25.000</w:t>
             </w:r>
           </w:p>
         </w:tc>
@@ -6446,7 +6446,7 @@
                 <w:sz w:val="20"/>
                 <w:szCs w:val="20"/>
               </w:rPr>
-              <w:t xml:space="preserve">Modul charger 2S USB-C</w:t>
+              <w:t xml:space="preserve">Modul buck converter 5 V (MP1584)</w:t>
             </w:r>
           </w:p>
         </w:tc>
@@ -6478,7 +6478,7 @@
                 <w:sz w:val="20"/>
                 <w:szCs w:val="20"/>
               </w:rPr>
-              <w:t xml:space="preserve">Rp25.000</w:t>
+              <w:t xml:space="preserve">Rp10.000</w:t>
             </w:r>
           </w:p>
         </w:tc>
@@ -6574,7 +6574,7 @@
                 <w:sz w:val="20"/>
                 <w:szCs w:val="20"/>
               </w:rPr>
-              <w:t xml:space="preserve">Rp25.000</w:t>
+              <w:t xml:space="preserve">Rp10.000</w:t>
             </w:r>
           </w:p>
         </w:tc>
@@ -6611,7 +6611,7 @@
                 <w:sz w:val="20"/>
                 <w:szCs w:val="20"/>
               </w:rPr>
-              <w:t xml:space="preserve">Modul buck converter 5 V (MP1584)</w:t>
+              <w:t xml:space="preserve">Saklar on/off</w:t>
             </w:r>
           </w:p>
         </w:tc>
@@ -6643,7 +6643,7 @@
                 <w:sz w:val="20"/>
                 <w:szCs w:val="20"/>
               </w:rPr>
-              <w:t xml:space="preserve">Rp10.000</w:t>
+              <w:t xml:space="preserve">Rp3.000</w:t>
             </w:r>
           </w:p>
         </w:tc>
@@ -6739,7 +6739,7 @@
                 <w:sz w:val="20"/>
                 <w:szCs w:val="20"/>
               </w:rPr>
-              <w:t xml:space="preserve">Rp10.000</w:t>
+              <w:t xml:space="preserve">Rp3.000</w:t>
             </w:r>
           </w:p>
         </w:tc>
@@ -6776,7 +6776,7 @@
                 <w:sz w:val="20"/>
                 <w:szCs w:val="20"/>
               </w:rPr>
-              <w:t xml:space="preserve">Saklar on/off</w:t>
+              <w:t xml:space="preserve">Konektor JST PH2.0 6 pin + header (motor encoder)</w:t>
             </w:r>
           </w:p>
         </w:tc>
@@ -6808,7 +6808,7 @@
                 <w:sz w:val="20"/>
                 <w:szCs w:val="20"/>
               </w:rPr>
-              <w:t xml:space="preserve">Rp3.000</w:t>
+              <w:t xml:space="preserve">Rp5.000</w:t>
             </w:r>
           </w:p>
         </w:tc>
@@ -6840,7 +6840,7 @@
                 <w:sz w:val="20"/>
                 <w:szCs w:val="20"/>
               </w:rPr>
-              <w:t xml:space="preserve">1</w:t>
+              <w:t xml:space="preserve">2</w:t>
             </w:r>
           </w:p>
         </w:tc>
@@ -6872,7 +6872,7 @@
                 <w:sz w:val="20"/>
                 <w:szCs w:val="20"/>
               </w:rPr>
-              <w:t xml:space="preserve">pcs</w:t>
+              <w:t xml:space="preserve">set</w:t>
             </w:r>
           </w:p>
         </w:tc>
@@ -6904,7 +6904,7 @@
                 <w:sz w:val="20"/>
                 <w:szCs w:val="20"/>
               </w:rPr>
-              <w:t xml:space="preserve">Rp3.000</w:t>
+              <w:t xml:space="preserve">Rp10.000</w:t>
             </w:r>
           </w:p>
         </w:tc>
@@ -6941,7 +6941,7 @@
                 <w:sz w:val="20"/>
                 <w:szCs w:val="20"/>
               </w:rPr>
-              <w:t xml:space="preserve">Konektor JST PH2.0 6 pin + header (motor encoder)</w:t>
+              <w:t xml:space="preserve">Kabel pita 12 pin + 2 box header IDC 2×6 + 2 konektor IDC</w:t>
             </w:r>
           </w:p>
         </w:tc>
@@ -6973,7 +6973,7 @@
                 <w:sz w:val="20"/>
                 <w:szCs w:val="20"/>
               </w:rPr>
-              <w:t xml:space="preserve">Rp5.000</w:t>
+              <w:t xml:space="preserve">Rp10.000</w:t>
             </w:r>
           </w:p>
         </w:tc>
@@ -7005,7 +7005,7 @@
                 <w:sz w:val="20"/>
                 <w:szCs w:val="20"/>
               </w:rPr>
-              <w:t xml:space="preserve">2</w:t>
+              <w:t xml:space="preserve">1</w:t>
             </w:r>
           </w:p>
         </w:tc>
@@ -7106,7 +7106,7 @@
                 <w:sz w:val="20"/>
                 <w:szCs w:val="20"/>
               </w:rPr>
-              <w:t xml:space="preserve">Kabel pita 12 pin + 2 box header IDC 2×6 + 2 konektor IDC</w:t>
+              <w:t xml:space="preserve">Fabrikasi PCB (papan utama + papan sensor) + ongkir</w:t>
             </w:r>
           </w:p>
         </w:tc>
@@ -7138,7 +7138,7 @@
                 <w:sz w:val="20"/>
                 <w:szCs w:val="20"/>
               </w:rPr>
-              <w:t xml:space="preserve">Rp10.000</w:t>
+              <w:t xml:space="preserve">Rp200.000</w:t>
             </w:r>
           </w:p>
         </w:tc>
@@ -7202,7 +7202,7 @@
                 <w:sz w:val="20"/>
                 <w:szCs w:val="20"/>
               </w:rPr>
-              <w:t xml:space="preserve">set</w:t>
+              <w:t xml:space="preserve">paket</w:t>
             </w:r>
           </w:p>
         </w:tc>
@@ -7234,7 +7234,7 @@
                 <w:sz w:val="20"/>
                 <w:szCs w:val="20"/>
               </w:rPr>
-              <w:t xml:space="preserve">Rp10.000</w:t>
+              <w:t xml:space="preserve">Rp200.000</w:t>
             </w:r>
           </w:p>
         </w:tc>
@@ -7271,7 +7271,7 @@
                 <w:sz w:val="20"/>
                 <w:szCs w:val="20"/>
               </w:rPr>
-              <w:t xml:space="preserve">Fabrikasi PCB (papan utama + papan sensor) + ongkir</w:t>
+              <w:t xml:space="preserve">Komponen pendukung minsys (header &amp; socket female, kapasitor, dioda 1N5819)</w:t>
             </w:r>
           </w:p>
         </w:tc>
@@ -7303,7 +7303,7 @@
                 <w:sz w:val="20"/>
                 <w:szCs w:val="20"/>
               </w:rPr>
-              <w:t xml:space="preserve">Rp200.000</w:t>
+              <w:t xml:space="preserve">Rp25.000</w:t>
             </w:r>
           </w:p>
         </w:tc>
@@ -7399,7 +7399,7 @@
                 <w:sz w:val="20"/>
                 <w:szCs w:val="20"/>
               </w:rPr>
-              <w:t xml:space="preserve">Rp200.000</w:t>
+              <w:t xml:space="preserve">Rp25.000</w:t>
             </w:r>
           </w:p>
         </w:tc>
@@ -7410,171 +7410,6 @@
         </w:trPr>
         <w:tc>
           <w:tcPr>
-            <w:tcW w:type="dxa" w:w="4100"/>
-            <w:tcBorders>
-              <w:top w:val="single" w:color="000000" w:sz="4"/>
-              <w:left w:val="single" w:color="000000" w:sz="4"/>
-              <w:bottom w:val="single" w:color="000000" w:sz="4"/>
-              <w:right w:val="single" w:color="000000" w:sz="4"/>
-            </w:tcBorders>
-            <w:tcMar>
-              <w:top w:type="dxa" w:w="40"/>
-              <w:left w:type="dxa" w:w="110"/>
-              <w:bottom w:type="dxa" w:w="40"/>
-              <w:right w:type="dxa" w:w="110"/>
-            </w:tcMar>
-            <w:vAlign w:val="center"/>
-          </w:tcPr>
-          <w:p>
-            <w:pPr>
-              <w:spacing w:after="0" w:before="0" w:line="264"/>
-              <w:jc w:val="center"/>
-            </w:pPr>
-            <w:r>
-              <w:rPr>
-                <w:rFonts w:ascii="Times New Roman" w:cs="Times New Roman" w:eastAsia="Times New Roman" w:hAnsi="Times New Roman"/>
-                <w:sz w:val="20"/>
-                <w:szCs w:val="20"/>
-              </w:rPr>
-              <w:t xml:space="preserve">Komponen pendukung minsys (header &amp; socket female, kapasitor, dioda 1N5819)</w:t>
-            </w:r>
-          </w:p>
-        </w:tc>
-        <w:tc>
-          <w:tcPr>
-            <w:tcW w:type="dxa" w:w="1700"/>
-            <w:tcBorders>
-              <w:top w:val="single" w:color="000000" w:sz="4"/>
-              <w:left w:val="single" w:color="000000" w:sz="4"/>
-              <w:bottom w:val="single" w:color="000000" w:sz="4"/>
-              <w:right w:val="single" w:color="000000" w:sz="4"/>
-            </w:tcBorders>
-            <w:tcMar>
-              <w:top w:type="dxa" w:w="40"/>
-              <w:left w:type="dxa" w:w="110"/>
-              <w:bottom w:type="dxa" w:w="40"/>
-              <w:right w:type="dxa" w:w="110"/>
-            </w:tcMar>
-            <w:vAlign w:val="center"/>
-          </w:tcPr>
-          <w:p>
-            <w:pPr>
-              <w:spacing w:after="0" w:before="0" w:line="264"/>
-              <w:jc w:val="center"/>
-            </w:pPr>
-            <w:r>
-              <w:rPr>
-                <w:rFonts w:ascii="Times New Roman" w:cs="Times New Roman" w:eastAsia="Times New Roman" w:hAnsi="Times New Roman"/>
-                <w:sz w:val="20"/>
-                <w:szCs w:val="20"/>
-              </w:rPr>
-              <w:t xml:space="preserve">Rp25.000</w:t>
-            </w:r>
-          </w:p>
-        </w:tc>
-        <w:tc>
-          <w:tcPr>
-            <w:tcW w:type="dxa" w:w="800"/>
-            <w:tcBorders>
-              <w:top w:val="single" w:color="000000" w:sz="4"/>
-              <w:left w:val="single" w:color="000000" w:sz="4"/>
-              <w:bottom w:val="single" w:color="000000" w:sz="4"/>
-              <w:right w:val="single" w:color="000000" w:sz="4"/>
-            </w:tcBorders>
-            <w:tcMar>
-              <w:top w:type="dxa" w:w="40"/>
-              <w:left w:type="dxa" w:w="110"/>
-              <w:bottom w:type="dxa" w:w="40"/>
-              <w:right w:type="dxa" w:w="110"/>
-            </w:tcMar>
-            <w:vAlign w:val="center"/>
-          </w:tcPr>
-          <w:p>
-            <w:pPr>
-              <w:spacing w:after="0" w:before="0" w:line="264"/>
-              <w:jc w:val="center"/>
-            </w:pPr>
-            <w:r>
-              <w:rPr>
-                <w:rFonts w:ascii="Times New Roman" w:cs="Times New Roman" w:eastAsia="Times New Roman" w:hAnsi="Times New Roman"/>
-                <w:sz w:val="20"/>
-                <w:szCs w:val="20"/>
-              </w:rPr>
-              <w:t xml:space="preserve">1</w:t>
-            </w:r>
-          </w:p>
-        </w:tc>
-        <w:tc>
-          <w:tcPr>
-            <w:tcW w:type="dxa" w:w="1160"/>
-            <w:tcBorders>
-              <w:top w:val="single" w:color="000000" w:sz="4"/>
-              <w:left w:val="single" w:color="000000" w:sz="4"/>
-              <w:bottom w:val="single" w:color="000000" w:sz="4"/>
-              <w:right w:val="single" w:color="000000" w:sz="4"/>
-            </w:tcBorders>
-            <w:tcMar>
-              <w:top w:type="dxa" w:w="40"/>
-              <w:left w:type="dxa" w:w="110"/>
-              <w:bottom w:type="dxa" w:w="40"/>
-              <w:right w:type="dxa" w:w="110"/>
-            </w:tcMar>
-            <w:vAlign w:val="center"/>
-          </w:tcPr>
-          <w:p>
-            <w:pPr>
-              <w:spacing w:after="0" w:before="0" w:line="264"/>
-              <w:jc w:val="center"/>
-            </w:pPr>
-            <w:r>
-              <w:rPr>
-                <w:rFonts w:ascii="Times New Roman" w:cs="Times New Roman" w:eastAsia="Times New Roman" w:hAnsi="Times New Roman"/>
-                <w:sz w:val="20"/>
-                <w:szCs w:val="20"/>
-              </w:rPr>
-              <w:t xml:space="preserve">paket</w:t>
-            </w:r>
-          </w:p>
-        </w:tc>
-        <w:tc>
-          <w:tcPr>
-            <w:tcW w:type="dxa" w:w="2300"/>
-            <w:tcBorders>
-              <w:top w:val="single" w:color="000000" w:sz="4"/>
-              <w:left w:val="single" w:color="000000" w:sz="4"/>
-              <w:bottom w:val="single" w:color="000000" w:sz="4"/>
-              <w:right w:val="single" w:color="000000" w:sz="4"/>
-            </w:tcBorders>
-            <w:tcMar>
-              <w:top w:type="dxa" w:w="40"/>
-              <w:left w:type="dxa" w:w="110"/>
-              <w:bottom w:type="dxa" w:w="40"/>
-              <w:right w:type="dxa" w:w="110"/>
-            </w:tcMar>
-            <w:vAlign w:val="center"/>
-          </w:tcPr>
-          <w:p>
-            <w:pPr>
-              <w:spacing w:after="0" w:before="0" w:line="264"/>
-              <w:jc w:val="center"/>
-            </w:pPr>
-            <w:r>
-              <w:rPr>
-                <w:rFonts w:ascii="Times New Roman" w:cs="Times New Roman" w:eastAsia="Times New Roman" w:hAnsi="Times New Roman"/>
-                <w:sz w:val="20"/>
-                <w:szCs w:val="20"/>
-              </w:rPr>
-              <w:t xml:space="preserve">Rp25.000</w:t>
-            </w:r>
-          </w:p>
-        </w:tc>
-      </w:tr>
-      <w:tr>
-        <w:trPr>
-          <w:cantSplit/>
-        </w:trPr>
-        <w:tc>
-          <w:tcPr>
             <w:tcW w:type="dxa" w:w="7760"/>
             <w:gridSpan w:val="4"/>
             <w:tcBorders>
@@ -7636,7 +7471,7 @@
                 <w:sz w:val="20"/>
                 <w:szCs w:val="20"/>
               </w:rPr>
-              <w:t xml:space="preserve">Rp734.500</w:t>
+              <w:t xml:space="preserve">Rp719.500</w:t>
             </w:r>
           </w:p>
         </w:tc>
@@ -8231,7 +8066,7 @@
                 <w:sz w:val="20"/>
                 <w:szCs w:val="20"/>
               </w:rPr>
-              <w:t xml:space="preserve">Ball caster mini (± 6 mm)</w:t>
+              <w:t xml:space="preserve">Skid nilon M3 (pengganti ball caster; baut, spacer, mur nilon)</w:t>
             </w:r>
           </w:p>
         </w:tc>
@@ -8263,7 +8098,7 @@
                 <w:sz w:val="20"/>
                 <w:szCs w:val="20"/>
               </w:rPr>
-              <w:t xml:space="preserve">Rp10.000</w:t>
+              <w:t xml:space="preserve">Rp5.000</w:t>
             </w:r>
           </w:p>
         </w:tc>
@@ -8327,7 +8162,7 @@
                 <w:sz w:val="20"/>
                 <w:szCs w:val="20"/>
               </w:rPr>
-              <w:t xml:space="preserve">pcs</w:t>
+              <w:t xml:space="preserve">paket</w:t>
             </w:r>
           </w:p>
         </w:tc>
@@ -8359,7 +8194,7 @@
                 <w:sz w:val="20"/>
                 <w:szCs w:val="20"/>
               </w:rPr>
-              <w:t xml:space="preserve">Rp10.000</w:t>
+              <w:t xml:space="preserve">Rp5.000</w:t>
             </w:r>
           </w:p>
         </w:tc>
@@ -8596,7 +8431,7 @@
                 <w:sz w:val="20"/>
                 <w:szCs w:val="20"/>
               </w:rPr>
-              <w:t xml:space="preserve">Rp60.000</w:t>
+              <w:t xml:space="preserve">Rp55.000</w:t>
             </w:r>
           </w:p>
         </w:tc>
@@ -9300,7 +9135,7 @@
                 <w:sz w:val="24"/>
                 <w:szCs w:val="24"/>
               </w:rPr>
-              <w:t xml:space="preserve">Rp879.500</w:t>
+              <w:t xml:space="preserve">Rp859.500</w:t>
             </w:r>
           </w:p>
         </w:tc>
@@ -9411,7 +9246,7 @@
                 <w:sz w:val="24"/>
                 <w:szCs w:val="24"/>
               </w:rPr>
-              <w:t xml:space="preserve">16 Oktober 2026</w:t>
+              <w:t xml:space="preserve">20 Oktober 2026</w:t>
             </w:r>
           </w:p>
           <w:p>
@@ -9504,7 +9339,7 @@
                 <w:sz w:val="24"/>
                 <w:szCs w:val="24"/>
               </w:rPr>
-              <w:t xml:space="preserve">16 Oktober 2026</w:t>
+              <w:t xml:space="preserve">20 Oktober 2026</w:t>
             </w:r>
           </w:p>
           <w:p>

</xml_diff>

<commit_message>
PCB sensor gaya JSumo XLINE dengan 12 QRE1113GR (mekanik v15)
- Model v15 (CadQuery): PCB sensor pita 13 mm bentuk sayap (tengah lurus + sayap
  30 derajat, jarak 9 mm, sensor 4 dan 9 di tekukan), 12 QRE1113GR + resistor di
  sisi bawah, mux + J1 di badan tengah, tab 2 baut, tanpa masker; STEP/STL/DXF,
  CSV posisi sensor, render + perbandingan dengan foto XLINE
- Wiring diagram: blok sensor QRE1113GR (R LED 220 Ω, pull-up 10k)
- Charter/RAB Rp867.000 (md + docx), risiko R1/R8 disesuaikan
- Foto referensi XLINE di docs/referensi, keputusan dicatat di CLAUDE.md

Co-Authored-By: Claude Opus 5.5 <noreply@anthropic.com>
Claude-Session: https://claude.ai/code/session_0155yf5wpAX58VAfqTZWuQQK
</commit_message>
<xml_diff>
--- a/docs/Project_Charter_PJBL.docx
+++ b/docs/Project_Charter_PJBL.docx
@@ -1006,7 +1006,7 @@
                 <w:sz w:val="24"/>
                 <w:szCs w:val="24"/>
               </w:rPr>
-              <w:t xml:space="preserve">Elektronik: 12 sensor garis (LED merah + fototransistor SMD, PCB sensor bentuk jangkar) + multiplexer, motor DC + encoder, driver motor, OLED, catu daya baterai 2S (2× 18650)</w:t>
+              <w:t xml:space="preserve">Elektronik: 12 sensor garis QRE1113GR (PCB sensor bentuk sayap) + multiplexer, motor DC + encoder, driver motor, OLED, catu daya baterai 2S (2× 18650)</w:t>
             </w:r>
           </w:p>
           <w:p>
@@ -4301,7 +4301,7 @@
                 <w:sz w:val="20"/>
                 <w:szCs w:val="20"/>
               </w:rPr>
-              <w:t xml:space="preserve">LED SMD 1206 merah superbright (sensor, 12 + 3 cadangan)</w:t>
+              <w:t xml:space="preserve">Sensor reflektif QRE1113GR SMD, impor (12 + 3 cadangan)</w:t>
             </w:r>
           </w:p>
         </w:tc>
@@ -4333,7 +4333,7 @@
                 <w:sz w:val="20"/>
                 <w:szCs w:val="20"/>
               </w:rPr>
-              <w:t xml:space="preserve">Rp500</w:t>
+              <w:t xml:space="preserve">Rp5.000</w:t>
             </w:r>
           </w:p>
         </w:tc>
@@ -4429,7 +4429,7 @@
                 <w:sz w:val="20"/>
                 <w:szCs w:val="20"/>
               </w:rPr>
-              <w:t xml:space="preserve">Rp7.500</w:t>
+              <w:t xml:space="preserve">Rp75.000</w:t>
             </w:r>
           </w:p>
         </w:tc>
@@ -4466,7 +4466,7 @@
                 <w:sz w:val="20"/>
                 <w:szCs w:val="20"/>
               </w:rPr>
-              <w:t xml:space="preserve">Fototransistor SMD 1206 bening, impor (mis. Everlight PT15-21C; 12 + 3 cadangan)</w:t>
+              <w:t xml:space="preserve">Modul multiplexer analog CD74HC4067 16 kanal</w:t>
             </w:r>
           </w:p>
         </w:tc>
@@ -4498,7 +4498,7 @@
                 <w:sz w:val="20"/>
                 <w:szCs w:val="20"/>
               </w:rPr>
-              <w:t xml:space="preserve">Rp4.000</w:t>
+              <w:t xml:space="preserve">Rp15.000</w:t>
             </w:r>
           </w:p>
         </w:tc>
@@ -4530,7 +4530,7 @@
                 <w:sz w:val="20"/>
                 <w:szCs w:val="20"/>
               </w:rPr>
-              <w:t xml:space="preserve">15</w:t>
+              <w:t xml:space="preserve">1</w:t>
             </w:r>
           </w:p>
         </w:tc>
@@ -4594,7 +4594,7 @@
                 <w:sz w:val="20"/>
                 <w:szCs w:val="20"/>
               </w:rPr>
-              <w:t xml:space="preserve">Rp60.000</w:t>
+              <w:t xml:space="preserve">Rp15.000</w:t>
             </w:r>
           </w:p>
         </w:tc>
@@ -4631,7 +4631,7 @@
                 <w:sz w:val="20"/>
                 <w:szCs w:val="20"/>
               </w:rPr>
-              <w:t xml:space="preserve">Modul multiplexer analog CD74HC4067 16 kanal</w:t>
+              <w:t xml:space="preserve">Modul driver motor TB6612FNG</w:t>
             </w:r>
           </w:p>
         </w:tc>
@@ -4663,7 +4663,7 @@
                 <w:sz w:val="20"/>
                 <w:szCs w:val="20"/>
               </w:rPr>
-              <w:t xml:space="preserve">Rp15.000</w:t>
+              <w:t xml:space="preserve">Rp25.000</w:t>
             </w:r>
           </w:p>
         </w:tc>
@@ -4759,7 +4759,7 @@
                 <w:sz w:val="20"/>
                 <w:szCs w:val="20"/>
               </w:rPr>
-              <w:t xml:space="preserve">Rp15.000</w:t>
+              <w:t xml:space="preserve">Rp25.000</w:t>
             </w:r>
           </w:p>
         </w:tc>
@@ -4796,7 +4796,7 @@
                 <w:sz w:val="20"/>
                 <w:szCs w:val="20"/>
               </w:rPr>
-              <w:t xml:space="preserve">Modul driver motor TB6612FNG</w:t>
+              <w:t xml:space="preserve">Motor N20 6V ± 500 RPM + encoder</w:t>
             </w:r>
           </w:p>
         </w:tc>
@@ -4828,7 +4828,7 @@
                 <w:sz w:val="20"/>
                 <w:szCs w:val="20"/>
               </w:rPr>
-              <w:t xml:space="preserve">Rp25.000</w:t>
+              <w:t xml:space="preserve">Rp55.000</w:t>
             </w:r>
           </w:p>
         </w:tc>
@@ -4860,7 +4860,7 @@
                 <w:sz w:val="20"/>
                 <w:szCs w:val="20"/>
               </w:rPr>
-              <w:t xml:space="preserve">1</w:t>
+              <w:t xml:space="preserve">2</w:t>
             </w:r>
           </w:p>
         </w:tc>
@@ -4924,7 +4924,7 @@
                 <w:sz w:val="20"/>
                 <w:szCs w:val="20"/>
               </w:rPr>
-              <w:t xml:space="preserve">Rp25.000</w:t>
+              <w:t xml:space="preserve">Rp110.000</w:t>
             </w:r>
           </w:p>
         </w:tc>
@@ -4961,7 +4961,7 @@
                 <w:sz w:val="20"/>
                 <w:szCs w:val="20"/>
               </w:rPr>
-              <w:t xml:space="preserve">Motor N20 6V ± 500 RPM + encoder</w:t>
+              <w:t xml:space="preserve">Push button</w:t>
             </w:r>
           </w:p>
         </w:tc>
@@ -4993,7 +4993,7 @@
                 <w:sz w:val="20"/>
                 <w:szCs w:val="20"/>
               </w:rPr>
-              <w:t xml:space="preserve">Rp55.000</w:t>
+              <w:t xml:space="preserve">Rp1.000</w:t>
             </w:r>
           </w:p>
         </w:tc>
@@ -5025,7 +5025,7 @@
                 <w:sz w:val="20"/>
                 <w:szCs w:val="20"/>
               </w:rPr>
-              <w:t xml:space="preserve">2</w:t>
+              <w:t xml:space="preserve">4</w:t>
             </w:r>
           </w:p>
         </w:tc>
@@ -5089,7 +5089,7 @@
                 <w:sz w:val="20"/>
                 <w:szCs w:val="20"/>
               </w:rPr>
-              <w:t xml:space="preserve">Rp110.000</w:t>
+              <w:t xml:space="preserve">Rp4.000</w:t>
             </w:r>
           </w:p>
         </w:tc>
@@ -5126,7 +5126,7 @@
                 <w:sz w:val="20"/>
                 <w:szCs w:val="20"/>
               </w:rPr>
-              <w:t xml:space="preserve">Push button</w:t>
+              <w:t xml:space="preserve">Resistor SMD 0805 (220 Ω dan 10 kΩ untuk PCB sensor)</w:t>
             </w:r>
           </w:p>
         </w:tc>
@@ -5158,7 +5158,7 @@
                 <w:sz w:val="20"/>
                 <w:szCs w:val="20"/>
               </w:rPr>
-              <w:t xml:space="preserve">Rp1.000</w:t>
+              <w:t xml:space="preserve">Rp100</w:t>
             </w:r>
           </w:p>
         </w:tc>
@@ -5190,7 +5190,7 @@
                 <w:sz w:val="20"/>
                 <w:szCs w:val="20"/>
               </w:rPr>
-              <w:t xml:space="preserve">4</w:t>
+              <w:t xml:space="preserve">30</w:t>
             </w:r>
           </w:p>
         </w:tc>
@@ -5254,7 +5254,7 @@
                 <w:sz w:val="20"/>
                 <w:szCs w:val="20"/>
               </w:rPr>
-              <w:t xml:space="preserve">Rp4.000</w:t>
+              <w:t xml:space="preserve">Rp3.000</w:t>
             </w:r>
           </w:p>
         </w:tc>
@@ -5291,7 +5291,7 @@
                 <w:sz w:val="20"/>
                 <w:szCs w:val="20"/>
               </w:rPr>
-              <w:t xml:space="preserve">Resistor SMD 0805 (330 Ω dan 10 kΩ untuk PCB sensor)</w:t>
+              <w:t xml:space="preserve">Resistor 10 kΩ</w:t>
             </w:r>
           </w:p>
         </w:tc>
@@ -5323,7 +5323,7 @@
                 <w:sz w:val="20"/>
                 <w:szCs w:val="20"/>
               </w:rPr>
-              <w:t xml:space="preserve">Rp100</w:t>
+              <w:t xml:space="preserve">Rp200</w:t>
             </w:r>
           </w:p>
         </w:tc>
@@ -5355,7 +5355,7 @@
                 <w:sz w:val="20"/>
                 <w:szCs w:val="20"/>
               </w:rPr>
-              <w:t xml:space="preserve">30</w:t>
+              <w:t xml:space="preserve">10</w:t>
             </w:r>
           </w:p>
         </w:tc>
@@ -5419,7 +5419,7 @@
                 <w:sz w:val="20"/>
                 <w:szCs w:val="20"/>
               </w:rPr>
-              <w:t xml:space="preserve">Rp3.000</w:t>
+              <w:t xml:space="preserve">Rp2.000</w:t>
             </w:r>
           </w:p>
         </w:tc>
@@ -5456,7 +5456,7 @@
                 <w:sz w:val="20"/>
                 <w:szCs w:val="20"/>
               </w:rPr>
-              <w:t xml:space="preserve">Resistor 10 kΩ</w:t>
+              <w:t xml:space="preserve">Buzzer</w:t>
             </w:r>
           </w:p>
         </w:tc>
@@ -5488,7 +5488,7 @@
                 <w:sz w:val="20"/>
                 <w:szCs w:val="20"/>
               </w:rPr>
-              <w:t xml:space="preserve">Rp200</w:t>
+              <w:t xml:space="preserve">Rp3.000</w:t>
             </w:r>
           </w:p>
         </w:tc>
@@ -5520,7 +5520,7 @@
                 <w:sz w:val="20"/>
                 <w:szCs w:val="20"/>
               </w:rPr>
-              <w:t xml:space="preserve">10</w:t>
+              <w:t xml:space="preserve">1</w:t>
             </w:r>
           </w:p>
         </w:tc>
@@ -5584,7 +5584,7 @@
                 <w:sz w:val="20"/>
                 <w:szCs w:val="20"/>
               </w:rPr>
-              <w:t xml:space="preserve">Rp2.000</w:t>
+              <w:t xml:space="preserve">Rp3.000</w:t>
             </w:r>
           </w:p>
         </w:tc>
@@ -5621,7 +5621,7 @@
                 <w:sz w:val="20"/>
                 <w:szCs w:val="20"/>
               </w:rPr>
-              <w:t xml:space="preserve">Buzzer</w:t>
+              <w:t xml:space="preserve">Baterai Li-ion 18650</w:t>
             </w:r>
           </w:p>
         </w:tc>
@@ -5653,7 +5653,7 @@
                 <w:sz w:val="20"/>
                 <w:szCs w:val="20"/>
               </w:rPr>
-              <w:t xml:space="preserve">Rp3.000</w:t>
+              <w:t xml:space="preserve">Rp40.000</w:t>
             </w:r>
           </w:p>
         </w:tc>
@@ -5685,7 +5685,7 @@
                 <w:sz w:val="20"/>
                 <w:szCs w:val="20"/>
               </w:rPr>
-              <w:t xml:space="preserve">1</w:t>
+              <w:t xml:space="preserve">2</w:t>
             </w:r>
           </w:p>
         </w:tc>
@@ -5749,7 +5749,7 @@
                 <w:sz w:val="20"/>
                 <w:szCs w:val="20"/>
               </w:rPr>
-              <w:t xml:space="preserve">Rp3.000</w:t>
+              <w:t xml:space="preserve">Rp80.000</w:t>
             </w:r>
           </w:p>
         </w:tc>
@@ -5786,7 +5786,7 @@
                 <w:sz w:val="20"/>
                 <w:szCs w:val="20"/>
               </w:rPr>
-              <w:t xml:space="preserve">Baterai Li-ion 18650</w:t>
+              <w:t xml:space="preserve">Holder baterai 2× 18650 (seri)</w:t>
             </w:r>
           </w:p>
         </w:tc>
@@ -5818,7 +5818,7 @@
                 <w:sz w:val="20"/>
                 <w:szCs w:val="20"/>
               </w:rPr>
-              <w:t xml:space="preserve">Rp40.000</w:t>
+              <w:t xml:space="preserve">Rp8.000</w:t>
             </w:r>
           </w:p>
         </w:tc>
@@ -5850,7 +5850,7 @@
                 <w:sz w:val="20"/>
                 <w:szCs w:val="20"/>
               </w:rPr>
-              <w:t xml:space="preserve">2</w:t>
+              <w:t xml:space="preserve">1</w:t>
             </w:r>
           </w:p>
         </w:tc>
@@ -5914,7 +5914,7 @@
                 <w:sz w:val="20"/>
                 <w:szCs w:val="20"/>
               </w:rPr>
-              <w:t xml:space="preserve">Rp80.000</w:t>
+              <w:t xml:space="preserve">Rp8.000</w:t>
             </w:r>
           </w:p>
         </w:tc>
@@ -5951,7 +5951,7 @@
                 <w:sz w:val="20"/>
                 <w:szCs w:val="20"/>
               </w:rPr>
-              <w:t xml:space="preserve">Holder baterai 2× 18650 (seri)</w:t>
+              <w:t xml:space="preserve">Modul BMS 2S</w:t>
             </w:r>
           </w:p>
         </w:tc>
@@ -5983,7 +5983,7 @@
                 <w:sz w:val="20"/>
                 <w:szCs w:val="20"/>
               </w:rPr>
-              <w:t xml:space="preserve">Rp8.000</w:t>
+              <w:t xml:space="preserve">Rp10.000</w:t>
             </w:r>
           </w:p>
         </w:tc>
@@ -6079,7 +6079,7 @@
                 <w:sz w:val="20"/>
                 <w:szCs w:val="20"/>
               </w:rPr>
-              <w:t xml:space="preserve">Rp8.000</w:t>
+              <w:t xml:space="preserve">Rp10.000</w:t>
             </w:r>
           </w:p>
         </w:tc>
@@ -6116,7 +6116,7 @@
                 <w:sz w:val="20"/>
                 <w:szCs w:val="20"/>
               </w:rPr>
-              <w:t xml:space="preserve">Modul BMS 2S</w:t>
+              <w:t xml:space="preserve">Modul charger 2S USB-C</w:t>
             </w:r>
           </w:p>
         </w:tc>
@@ -6148,7 +6148,7 @@
                 <w:sz w:val="20"/>
                 <w:szCs w:val="20"/>
               </w:rPr>
-              <w:t xml:space="preserve">Rp10.000</w:t>
+              <w:t xml:space="preserve">Rp25.000</w:t>
             </w:r>
           </w:p>
         </w:tc>
@@ -6244,7 +6244,7 @@
                 <w:sz w:val="20"/>
                 <w:szCs w:val="20"/>
               </w:rPr>
-              <w:t xml:space="preserve">Rp10.000</w:t>
+              <w:t xml:space="preserve">Rp25.000</w:t>
             </w:r>
           </w:p>
         </w:tc>
@@ -6281,7 +6281,7 @@
                 <w:sz w:val="20"/>
                 <w:szCs w:val="20"/>
               </w:rPr>
-              <w:t xml:space="preserve">Modul charger 2S USB-C</w:t>
+              <w:t xml:space="preserve">Modul buck converter 5 V (MP1584)</w:t>
             </w:r>
           </w:p>
         </w:tc>
@@ -6313,7 +6313,7 @@
                 <w:sz w:val="20"/>
                 <w:szCs w:val="20"/>
               </w:rPr>
-              <w:t xml:space="preserve">Rp25.000</w:t>
+              <w:t xml:space="preserve">Rp10.000</w:t>
             </w:r>
           </w:p>
         </w:tc>
@@ -6409,7 +6409,7 @@
                 <w:sz w:val="20"/>
                 <w:szCs w:val="20"/>
               </w:rPr>
-              <w:t xml:space="preserve">Rp25.000</w:t>
+              <w:t xml:space="preserve">Rp10.000</w:t>
             </w:r>
           </w:p>
         </w:tc>
@@ -6446,7 +6446,7 @@
                 <w:sz w:val="20"/>
                 <w:szCs w:val="20"/>
               </w:rPr>
-              <w:t xml:space="preserve">Modul buck converter 5 V (MP1584)</w:t>
+              <w:t xml:space="preserve">Saklar on/off</w:t>
             </w:r>
           </w:p>
         </w:tc>
@@ -6478,7 +6478,7 @@
                 <w:sz w:val="20"/>
                 <w:szCs w:val="20"/>
               </w:rPr>
-              <w:t xml:space="preserve">Rp10.000</w:t>
+              <w:t xml:space="preserve">Rp3.000</w:t>
             </w:r>
           </w:p>
         </w:tc>
@@ -6574,7 +6574,7 @@
                 <w:sz w:val="20"/>
                 <w:szCs w:val="20"/>
               </w:rPr>
-              <w:t xml:space="preserve">Rp10.000</w:t>
+              <w:t xml:space="preserve">Rp3.000</w:t>
             </w:r>
           </w:p>
         </w:tc>
@@ -6611,7 +6611,7 @@
                 <w:sz w:val="20"/>
                 <w:szCs w:val="20"/>
               </w:rPr>
-              <w:t xml:space="preserve">Saklar on/off</w:t>
+              <w:t xml:space="preserve">Konektor JST PH2.0 6 pin + header (motor encoder)</w:t>
             </w:r>
           </w:p>
         </w:tc>
@@ -6643,7 +6643,7 @@
                 <w:sz w:val="20"/>
                 <w:szCs w:val="20"/>
               </w:rPr>
-              <w:t xml:space="preserve">Rp3.000</w:t>
+              <w:t xml:space="preserve">Rp5.000</w:t>
             </w:r>
           </w:p>
         </w:tc>
@@ -6675,7 +6675,7 @@
                 <w:sz w:val="20"/>
                 <w:szCs w:val="20"/>
               </w:rPr>
-              <w:t xml:space="preserve">1</w:t>
+              <w:t xml:space="preserve">2</w:t>
             </w:r>
           </w:p>
         </w:tc>
@@ -6707,7 +6707,7 @@
                 <w:sz w:val="20"/>
                 <w:szCs w:val="20"/>
               </w:rPr>
-              <w:t xml:space="preserve">pcs</w:t>
+              <w:t xml:space="preserve">set</w:t>
             </w:r>
           </w:p>
         </w:tc>
@@ -6739,7 +6739,7 @@
                 <w:sz w:val="20"/>
                 <w:szCs w:val="20"/>
               </w:rPr>
-              <w:t xml:space="preserve">Rp3.000</w:t>
+              <w:t xml:space="preserve">Rp10.000</w:t>
             </w:r>
           </w:p>
         </w:tc>
@@ -6776,7 +6776,7 @@
                 <w:sz w:val="20"/>
                 <w:szCs w:val="20"/>
               </w:rPr>
-              <w:t xml:space="preserve">Konektor JST PH2.0 6 pin + header (motor encoder)</w:t>
+              <w:t xml:space="preserve">Kabel pita 12 pin + 2 box header IDC 2×6 + 2 konektor IDC</w:t>
             </w:r>
           </w:p>
         </w:tc>
@@ -6808,7 +6808,7 @@
                 <w:sz w:val="20"/>
                 <w:szCs w:val="20"/>
               </w:rPr>
-              <w:t xml:space="preserve">Rp5.000</w:t>
+              <w:t xml:space="preserve">Rp10.000</w:t>
             </w:r>
           </w:p>
         </w:tc>
@@ -6840,7 +6840,7 @@
                 <w:sz w:val="20"/>
                 <w:szCs w:val="20"/>
               </w:rPr>
-              <w:t xml:space="preserve">2</w:t>
+              <w:t xml:space="preserve">1</w:t>
             </w:r>
           </w:p>
         </w:tc>
@@ -6941,7 +6941,7 @@
                 <w:sz w:val="20"/>
                 <w:szCs w:val="20"/>
               </w:rPr>
-              <w:t xml:space="preserve">Kabel pita 12 pin + 2 box header IDC 2×6 + 2 konektor IDC</w:t>
+              <w:t xml:space="preserve">Fabrikasi PCB (papan utama + papan sensor) + ongkir</w:t>
             </w:r>
           </w:p>
         </w:tc>
@@ -6973,7 +6973,7 @@
                 <w:sz w:val="20"/>
                 <w:szCs w:val="20"/>
               </w:rPr>
-              <w:t xml:space="preserve">Rp10.000</w:t>
+              <w:t xml:space="preserve">Rp200.000</w:t>
             </w:r>
           </w:p>
         </w:tc>
@@ -7037,7 +7037,7 @@
                 <w:sz w:val="20"/>
                 <w:szCs w:val="20"/>
               </w:rPr>
-              <w:t xml:space="preserve">set</w:t>
+              <w:t xml:space="preserve">paket</w:t>
             </w:r>
           </w:p>
         </w:tc>
@@ -7069,7 +7069,7 @@
                 <w:sz w:val="20"/>
                 <w:szCs w:val="20"/>
               </w:rPr>
-              <w:t xml:space="preserve">Rp10.000</w:t>
+              <w:t xml:space="preserve">Rp200.000</w:t>
             </w:r>
           </w:p>
         </w:tc>
@@ -7106,7 +7106,7 @@
                 <w:sz w:val="20"/>
                 <w:szCs w:val="20"/>
               </w:rPr>
-              <w:t xml:space="preserve">Fabrikasi PCB (papan utama + papan sensor) + ongkir</w:t>
+              <w:t xml:space="preserve">Komponen pendukung minsys (header &amp; socket female, kapasitor, dioda 1N5819)</w:t>
             </w:r>
           </w:p>
         </w:tc>
@@ -7138,7 +7138,7 @@
                 <w:sz w:val="20"/>
                 <w:szCs w:val="20"/>
               </w:rPr>
-              <w:t xml:space="preserve">Rp200.000</w:t>
+              <w:t xml:space="preserve">Rp25.000</w:t>
             </w:r>
           </w:p>
         </w:tc>
@@ -7234,7 +7234,7 @@
                 <w:sz w:val="20"/>
                 <w:szCs w:val="20"/>
               </w:rPr>
-              <w:t xml:space="preserve">Rp200.000</w:t>
+              <w:t xml:space="preserve">Rp25.000</w:t>
             </w:r>
           </w:p>
         </w:tc>
@@ -7245,171 +7245,6 @@
         </w:trPr>
         <w:tc>
           <w:tcPr>
-            <w:tcW w:type="dxa" w:w="4100"/>
-            <w:tcBorders>
-              <w:top w:val="single" w:color="000000" w:sz="4"/>
-              <w:left w:val="single" w:color="000000" w:sz="4"/>
-              <w:bottom w:val="single" w:color="000000" w:sz="4"/>
-              <w:right w:val="single" w:color="000000" w:sz="4"/>
-            </w:tcBorders>
-            <w:tcMar>
-              <w:top w:type="dxa" w:w="40"/>
-              <w:left w:type="dxa" w:w="110"/>
-              <w:bottom w:type="dxa" w:w="40"/>
-              <w:right w:type="dxa" w:w="110"/>
-            </w:tcMar>
-            <w:vAlign w:val="center"/>
-          </w:tcPr>
-          <w:p>
-            <w:pPr>
-              <w:spacing w:after="0" w:before="0" w:line="264"/>
-              <w:jc w:val="center"/>
-            </w:pPr>
-            <w:r>
-              <w:rPr>
-                <w:rFonts w:ascii="Times New Roman" w:cs="Times New Roman" w:eastAsia="Times New Roman" w:hAnsi="Times New Roman"/>
-                <w:sz w:val="20"/>
-                <w:szCs w:val="20"/>
-              </w:rPr>
-              <w:t xml:space="preserve">Komponen pendukung minsys (header &amp; socket female, kapasitor, dioda 1N5819)</w:t>
-            </w:r>
-          </w:p>
-        </w:tc>
-        <w:tc>
-          <w:tcPr>
-            <w:tcW w:type="dxa" w:w="1700"/>
-            <w:tcBorders>
-              <w:top w:val="single" w:color="000000" w:sz="4"/>
-              <w:left w:val="single" w:color="000000" w:sz="4"/>
-              <w:bottom w:val="single" w:color="000000" w:sz="4"/>
-              <w:right w:val="single" w:color="000000" w:sz="4"/>
-            </w:tcBorders>
-            <w:tcMar>
-              <w:top w:type="dxa" w:w="40"/>
-              <w:left w:type="dxa" w:w="110"/>
-              <w:bottom w:type="dxa" w:w="40"/>
-              <w:right w:type="dxa" w:w="110"/>
-            </w:tcMar>
-            <w:vAlign w:val="center"/>
-          </w:tcPr>
-          <w:p>
-            <w:pPr>
-              <w:spacing w:after="0" w:before="0" w:line="264"/>
-              <w:jc w:val="center"/>
-            </w:pPr>
-            <w:r>
-              <w:rPr>
-                <w:rFonts w:ascii="Times New Roman" w:cs="Times New Roman" w:eastAsia="Times New Roman" w:hAnsi="Times New Roman"/>
-                <w:sz w:val="20"/>
-                <w:szCs w:val="20"/>
-              </w:rPr>
-              <w:t xml:space="preserve">Rp25.000</w:t>
-            </w:r>
-          </w:p>
-        </w:tc>
-        <w:tc>
-          <w:tcPr>
-            <w:tcW w:type="dxa" w:w="800"/>
-            <w:tcBorders>
-              <w:top w:val="single" w:color="000000" w:sz="4"/>
-              <w:left w:val="single" w:color="000000" w:sz="4"/>
-              <w:bottom w:val="single" w:color="000000" w:sz="4"/>
-              <w:right w:val="single" w:color="000000" w:sz="4"/>
-            </w:tcBorders>
-            <w:tcMar>
-              <w:top w:type="dxa" w:w="40"/>
-              <w:left w:type="dxa" w:w="110"/>
-              <w:bottom w:type="dxa" w:w="40"/>
-              <w:right w:type="dxa" w:w="110"/>
-            </w:tcMar>
-            <w:vAlign w:val="center"/>
-          </w:tcPr>
-          <w:p>
-            <w:pPr>
-              <w:spacing w:after="0" w:before="0" w:line="264"/>
-              <w:jc w:val="center"/>
-            </w:pPr>
-            <w:r>
-              <w:rPr>
-                <w:rFonts w:ascii="Times New Roman" w:cs="Times New Roman" w:eastAsia="Times New Roman" w:hAnsi="Times New Roman"/>
-                <w:sz w:val="20"/>
-                <w:szCs w:val="20"/>
-              </w:rPr>
-              <w:t xml:space="preserve">1</w:t>
-            </w:r>
-          </w:p>
-        </w:tc>
-        <w:tc>
-          <w:tcPr>
-            <w:tcW w:type="dxa" w:w="1160"/>
-            <w:tcBorders>
-              <w:top w:val="single" w:color="000000" w:sz="4"/>
-              <w:left w:val="single" w:color="000000" w:sz="4"/>
-              <w:bottom w:val="single" w:color="000000" w:sz="4"/>
-              <w:right w:val="single" w:color="000000" w:sz="4"/>
-            </w:tcBorders>
-            <w:tcMar>
-              <w:top w:type="dxa" w:w="40"/>
-              <w:left w:type="dxa" w:w="110"/>
-              <w:bottom w:type="dxa" w:w="40"/>
-              <w:right w:type="dxa" w:w="110"/>
-            </w:tcMar>
-            <w:vAlign w:val="center"/>
-          </w:tcPr>
-          <w:p>
-            <w:pPr>
-              <w:spacing w:after="0" w:before="0" w:line="264"/>
-              <w:jc w:val="center"/>
-            </w:pPr>
-            <w:r>
-              <w:rPr>
-                <w:rFonts w:ascii="Times New Roman" w:cs="Times New Roman" w:eastAsia="Times New Roman" w:hAnsi="Times New Roman"/>
-                <w:sz w:val="20"/>
-                <w:szCs w:val="20"/>
-              </w:rPr>
-              <w:t xml:space="preserve">paket</w:t>
-            </w:r>
-          </w:p>
-        </w:tc>
-        <w:tc>
-          <w:tcPr>
-            <w:tcW w:type="dxa" w:w="2300"/>
-            <w:tcBorders>
-              <w:top w:val="single" w:color="000000" w:sz="4"/>
-              <w:left w:val="single" w:color="000000" w:sz="4"/>
-              <w:bottom w:val="single" w:color="000000" w:sz="4"/>
-              <w:right w:val="single" w:color="000000" w:sz="4"/>
-            </w:tcBorders>
-            <w:tcMar>
-              <w:top w:type="dxa" w:w="40"/>
-              <w:left w:type="dxa" w:w="110"/>
-              <w:bottom w:type="dxa" w:w="40"/>
-              <w:right w:type="dxa" w:w="110"/>
-            </w:tcMar>
-            <w:vAlign w:val="center"/>
-          </w:tcPr>
-          <w:p>
-            <w:pPr>
-              <w:spacing w:after="0" w:before="0" w:line="264"/>
-              <w:jc w:val="center"/>
-            </w:pPr>
-            <w:r>
-              <w:rPr>
-                <w:rFonts w:ascii="Times New Roman" w:cs="Times New Roman" w:eastAsia="Times New Roman" w:hAnsi="Times New Roman"/>
-                <w:sz w:val="20"/>
-                <w:szCs w:val="20"/>
-              </w:rPr>
-              <w:t xml:space="preserve">Rp25.000</w:t>
-            </w:r>
-          </w:p>
-        </w:tc>
-      </w:tr>
-      <w:tr>
-        <w:trPr>
-          <w:cantSplit/>
-        </w:trPr>
-        <w:tc>
-          <w:tcPr>
             <w:tcW w:type="dxa" w:w="7760"/>
             <w:gridSpan w:val="4"/>
             <w:tcBorders>
@@ -7471,7 +7306,7 @@
                 <w:sz w:val="20"/>
                 <w:szCs w:val="20"/>
               </w:rPr>
-              <w:t xml:space="preserve">Rp719.500</w:t>
+              <w:t xml:space="preserve">Rp727.000</w:t>
             </w:r>
           </w:p>
         </w:tc>
@@ -8066,7 +7901,7 @@
                 <w:sz w:val="20"/>
                 <w:szCs w:val="20"/>
               </w:rPr>
-              <w:t xml:space="preserve">Skid nilon M3 (pengganti ball caster; baut, spacer, mur nilon)</w:t>
+              <w:t xml:space="preserve">Skid nilon (pengganti ball caster; baut M2/M3, spacer, mur nilon)</w:t>
             </w:r>
           </w:p>
         </w:tc>
@@ -9135,7 +8970,7 @@
                 <w:sz w:val="24"/>
                 <w:szCs w:val="24"/>
               </w:rPr>
-              <w:t xml:space="preserve">Rp859.500</w:t>
+              <w:t xml:space="preserve">Rp867.000</w:t>
             </w:r>
           </w:p>
         </w:tc>

</xml_diff>

<commit_message>
Mux jadi IC CD74HC4067 SOIC-24 di PCB sensor
- Model v15: modul mux di socket diganti IC SOIC-24 + C 100 nF di badan tengah
  (badan 34 mm), skid tengah pindah ke tab di belakang J1
- Wiring diagram blok 6: nomor pin IC (CD74HC4067M), E ke GND, I12-I15 ke GND
- RAB Rp887.000 (IC Rp35.000), charter md + docx

Co-Authored-By: Claude Opus 5.5 <noreply@anthropic.com>
Claude-Session: https://claude.ai/code/session_0155yf5wpAX58VAfqTZWuQQK
</commit_message>
<xml_diff>
--- a/docs/Project_Charter_PJBL.docx
+++ b/docs/Project_Charter_PJBL.docx
@@ -4466,7 +4466,7 @@
                 <w:sz w:val="20"/>
                 <w:szCs w:val="20"/>
               </w:rPr>
-              <w:t xml:space="preserve">Modul multiplexer analog CD74HC4067 16 kanal</w:t>
+              <w:t xml:space="preserve">IC multiplexer analog CD74HC4067 SOIC-24, 16 kanal</w:t>
             </w:r>
           </w:p>
         </w:tc>
@@ -4498,7 +4498,7 @@
                 <w:sz w:val="20"/>
                 <w:szCs w:val="20"/>
               </w:rPr>
-              <w:t xml:space="preserve">Rp15.000</w:t>
+              <w:t xml:space="preserve">Rp35.000</w:t>
             </w:r>
           </w:p>
         </w:tc>
@@ -4594,7 +4594,7 @@
                 <w:sz w:val="20"/>
                 <w:szCs w:val="20"/>
               </w:rPr>
-              <w:t xml:space="preserve">Rp15.000</w:t>
+              <w:t xml:space="preserve">Rp35.000</w:t>
             </w:r>
           </w:p>
         </w:tc>
@@ -7306,7 +7306,7 @@
                 <w:sz w:val="20"/>
                 <w:szCs w:val="20"/>
               </w:rPr>
-              <w:t xml:space="preserve">Rp727.000</w:t>
+              <w:t xml:space="preserve">Rp747.000</w:t>
             </w:r>
           </w:p>
         </w:tc>
@@ -8970,7 +8970,7 @@
                 <w:sz w:val="24"/>
                 <w:szCs w:val="24"/>
               </w:rPr>
-              <w:t xml:space="preserve">Rp867.000</w:t>
+              <w:t xml:space="preserve">Rp887.000</w:t>
             </w:r>
           </w:p>
         </w:tc>
@@ -9081,7 +9081,7 @@
                 <w:sz w:val="24"/>
                 <w:szCs w:val="24"/>
               </w:rPr>
-              <w:t xml:space="preserve">20 Oktober 2026</w:t>
+              <w:t xml:space="preserve">21 Oktober 2026</w:t>
             </w:r>
           </w:p>
           <w:p>
@@ -9174,7 +9174,7 @@
                 <w:sz w:val="24"/>
                 <w:szCs w:val="24"/>
               </w:rPr>
-              <w:t xml:space="preserve">20 Oktober 2026</w:t>
+              <w:t xml:space="preserve">21 Oktober 2026</w:t>
             </w:r>
           </w:p>
           <w:p>

</xml_diff>

<commit_message>
Charter docx dibuat ulang: RAB Rp902.000 (QRE lokal, JST XH 8 pin)
Node.js 24 LTS terpasang di laptop; node_modules/ di-gitignore.

Co-Authored-By: Claude Opus 5.5 <noreply@anthropic.com>
</commit_message>
<xml_diff>
--- a/docs/Project_Charter_PJBL.docx
+++ b/docs/Project_Charter_PJBL.docx
@@ -587,7 +587,7 @@
       </w:tr>
       <w:tr>
         <w:trPr>
-          <w:cantSplit w:val="false"/>
+          <w:cantSplit w:val="off"/>
         </w:trPr>
         <w:tc>
           <w:tcPr>
@@ -724,7 +724,7 @@
       </w:tr>
       <w:tr>
         <w:trPr>
-          <w:cantSplit w:val="false"/>
+          <w:cantSplit w:val="off"/>
         </w:trPr>
         <w:tc>
           <w:tcPr>
@@ -933,7 +933,7 @@
       </w:tr>
       <w:tr>
         <w:trPr>
-          <w:cantSplit w:val="false"/>
+          <w:cantSplit w:val="off"/>
         </w:trPr>
         <w:tc>
           <w:tcPr>
@@ -1006,7 +1006,7 @@
                 <w:sz w:val="24"/>
                 <w:szCs w:val="24"/>
               </w:rPr>
-              <w:t xml:space="preserve">Elektronik: 12 sensor garis QRE1113GR (PCB sensor bentuk sayap) + multiplexer, motor DC + encoder, driver motor, OLED, catu daya baterai 2S (2× 18650)</w:t>
+              <w:t xml:space="preserve">Elektronik: 12 sensor garis QRE1113GR (PCB sensor bentuk jangkar) + multiplexer, motor DC + encoder, driver motor, OLED, catu daya baterai 2S (2× 18650)</w:t>
             </w:r>
           </w:p>
           <w:p>
@@ -1947,7 +1947,7 @@
       </w:tr>
       <w:tr>
         <w:trPr>
-          <w:cantSplit w:val="false"/>
+          <w:cantSplit w:val="off"/>
         </w:trPr>
         <w:tc>
           <w:tcPr>
@@ -3756,7 +3756,7 @@
       <w:tr>
         <w:trPr>
           <w:cantSplit/>
-          <w:tblHeader w:val="false"/>
+          <w:tblHeader w:val="off"/>
         </w:trPr>
         <w:tc>
           <w:tcPr>
@@ -4301,7 +4301,7 @@
                 <w:sz w:val="20"/>
                 <w:szCs w:val="20"/>
               </w:rPr>
-              <w:t xml:space="preserve">Sensor reflektif QRE1113GR SMD, impor (12 + 3 cadangan)</w:t>
+              <w:t xml:space="preserve">Sensor reflektif QRE1113GR SMD, toko lokal (tanpa cadangan)</w:t>
             </w:r>
           </w:p>
         </w:tc>
@@ -4333,7 +4333,7 @@
                 <w:sz w:val="20"/>
                 <w:szCs w:val="20"/>
               </w:rPr>
-              <w:t xml:space="preserve">Rp5.000</w:t>
+              <w:t xml:space="preserve">Rp15.000</w:t>
             </w:r>
           </w:p>
         </w:tc>
@@ -4365,7 +4365,7 @@
                 <w:sz w:val="20"/>
                 <w:szCs w:val="20"/>
               </w:rPr>
-              <w:t xml:space="preserve">15</w:t>
+              <w:t xml:space="preserve">12</w:t>
             </w:r>
           </w:p>
         </w:tc>
@@ -4429,7 +4429,7 @@
                 <w:sz w:val="20"/>
                 <w:szCs w:val="20"/>
               </w:rPr>
-              <w:t xml:space="preserve">Rp75.000</w:t>
+              <w:t xml:space="preserve">Rp180.000</w:t>
             </w:r>
           </w:p>
         </w:tc>
@@ -6776,7 +6776,7 @@
                 <w:sz w:val="20"/>
                 <w:szCs w:val="20"/>
               </w:rPr>
-              <w:t xml:space="preserve">Kabel pita 12 pin + 2 box header IDC 2×6 + 2 konektor IDC</w:t>
+              <w:t xml:space="preserve">Konektor JST XH 2,5 mm 8 pin (2 header + 2 housing + terminal) + kabel</w:t>
             </w:r>
           </w:p>
         </w:tc>
@@ -6808,7 +6808,7 @@
                 <w:sz w:val="20"/>
                 <w:szCs w:val="20"/>
               </w:rPr>
-              <w:t xml:space="preserve">Rp10.000</w:t>
+              <w:t xml:space="preserve">Rp5.000</w:t>
             </w:r>
           </w:p>
         </w:tc>
@@ -6904,7 +6904,7 @@
                 <w:sz w:val="20"/>
                 <w:szCs w:val="20"/>
               </w:rPr>
-              <w:t xml:space="preserve">Rp10.000</w:t>
+              <w:t xml:space="preserve">Rp5.000</w:t>
             </w:r>
           </w:p>
         </w:tc>
@@ -7306,7 +7306,7 @@
                 <w:sz w:val="20"/>
                 <w:szCs w:val="20"/>
               </w:rPr>
-              <w:t xml:space="preserve">Rp747.000</w:t>
+              <w:t xml:space="preserve">Rp847.000</w:t>
             </w:r>
           </w:p>
         </w:tc>
@@ -7356,7 +7356,7 @@
       <w:tr>
         <w:trPr>
           <w:cantSplit/>
-          <w:tblHeader w:val="false"/>
+          <w:tblHeader w:val="off"/>
         </w:trPr>
         <w:tc>
           <w:tcPr>
@@ -8277,26 +8277,24 @@
         </w:trPr>
         <w:tc>
           <w:tcPr>
-            <w:tcW w:type="dxa" w:w="10060"/>
-            <w:gridSpan w:val="5"/>
-            <w:tcBorders>
-              <w:top w:val="single" w:color="000000" w:sz="4"/>
-              <w:left w:val="single" w:color="000000" w:sz="4"/>
-              <w:bottom w:val="single" w:color="000000" w:sz="4"/>
-              <w:right w:val="single" w:color="000000" w:sz="4"/>
-            </w:tcBorders>
-            <w:shd w:fill="D6EDF1" w:color="auto" w:val="clear"/>
-            <w:tcMar>
-              <w:top w:type="dxa" w:w="40"/>
-              <w:left w:type="dxa" w:w="110"/>
-              <w:bottom w:type="dxa" w:w="40"/>
-              <w:right w:type="dxa" w:w="110"/>
-            </w:tcMar>
-            <w:vAlign w:val="top"/>
-          </w:tcPr>
-          <w:p>
-            <w:pPr>
-              <w:keepNext/>
+            <w:tcW w:type="dxa" w:w="7760"/>
+            <w:gridSpan w:val="4"/>
+            <w:tcBorders>
+              <w:top w:val="single" w:color="000000" w:sz="4"/>
+              <w:left w:val="single" w:color="000000" w:sz="4"/>
+              <w:bottom w:val="single" w:color="000000" w:sz="4"/>
+              <w:right w:val="single" w:color="000000" w:sz="4"/>
+            </w:tcBorders>
+            <w:tcMar>
+              <w:top w:type="dxa" w:w="40"/>
+              <w:left w:type="dxa" w:w="110"/>
+              <w:bottom w:type="dxa" w:w="40"/>
+              <w:right w:type="dxa" w:w="110"/>
+            </w:tcMar>
+            <w:vAlign w:val="top"/>
+          </w:tcPr>
+          <w:p>
+            <w:pPr>
               <w:spacing w:after="0" w:before="0" w:line="264"/>
               <w:jc w:val="center"/>
             </w:pPr>
@@ -8308,37 +8306,29 @@
                 <w:sz w:val="24"/>
                 <w:szCs w:val="24"/>
               </w:rPr>
-              <w:t xml:space="preserve">Lain-Lain</w:t>
-            </w:r>
-          </w:p>
-        </w:tc>
-      </w:tr>
-      <w:tr>
-        <w:trPr>
-          <w:cantSplit/>
-          <w:tblHeader w:val="false"/>
-        </w:trPr>
-        <w:tc>
-          <w:tcPr>
-            <w:tcW w:type="dxa" w:w="4100"/>
-            <w:tcBorders>
-              <w:top w:val="single" w:color="000000" w:sz="4"/>
-              <w:left w:val="single" w:color="000000" w:sz="4"/>
-              <w:bottom w:val="single" w:color="000000" w:sz="4"/>
-              <w:right w:val="single" w:color="000000" w:sz="4"/>
-            </w:tcBorders>
-            <w:shd w:fill="D6EDF1" w:color="auto" w:val="clear"/>
-            <w:tcMar>
-              <w:top w:type="dxa" w:w="40"/>
-              <w:left w:type="dxa" w:w="110"/>
-              <w:bottom w:type="dxa" w:w="40"/>
-              <w:right w:type="dxa" w:w="110"/>
-            </w:tcMar>
-            <w:vAlign w:val="top"/>
-          </w:tcPr>
-          <w:p>
-            <w:pPr>
-              <w:keepNext/>
+              <w:t xml:space="preserve">TOTAL BUDGET</w:t>
+            </w:r>
+          </w:p>
+        </w:tc>
+        <w:tc>
+          <w:tcPr>
+            <w:tcW w:type="dxa" w:w="2300"/>
+            <w:tcBorders>
+              <w:top w:val="single" w:color="000000" w:sz="4"/>
+              <w:left w:val="single" w:color="000000" w:sz="4"/>
+              <w:bottom w:val="single" w:color="000000" w:sz="4"/>
+              <w:right w:val="single" w:color="000000" w:sz="4"/>
+            </w:tcBorders>
+            <w:tcMar>
+              <w:top w:type="dxa" w:w="40"/>
+              <w:left w:type="dxa" w:w="110"/>
+              <w:bottom w:type="dxa" w:w="40"/>
+              <w:right w:type="dxa" w:w="110"/>
+            </w:tcMar>
+            <w:vAlign w:val="top"/>
+          </w:tcPr>
+          <w:p>
+            <w:pPr>
               <w:spacing w:after="0" w:before="0" w:line="264"/>
               <w:jc w:val="center"/>
             </w:pPr>
@@ -8350,627 +8340,7 @@
                 <w:sz w:val="24"/>
                 <w:szCs w:val="24"/>
               </w:rPr>
-              <w:t xml:space="preserve">Item</w:t>
-            </w:r>
-          </w:p>
-        </w:tc>
-        <w:tc>
-          <w:tcPr>
-            <w:tcW w:type="dxa" w:w="1700"/>
-            <w:tcBorders>
-              <w:top w:val="single" w:color="000000" w:sz="4"/>
-              <w:left w:val="single" w:color="000000" w:sz="4"/>
-              <w:bottom w:val="single" w:color="000000" w:sz="4"/>
-              <w:right w:val="single" w:color="000000" w:sz="4"/>
-            </w:tcBorders>
-            <w:shd w:fill="D6EDF1" w:color="auto" w:val="clear"/>
-            <w:tcMar>
-              <w:top w:type="dxa" w:w="40"/>
-              <w:left w:type="dxa" w:w="110"/>
-              <w:bottom w:type="dxa" w:w="40"/>
-              <w:right w:type="dxa" w:w="110"/>
-            </w:tcMar>
-            <w:vAlign w:val="top"/>
-          </w:tcPr>
-          <w:p>
-            <w:pPr>
-              <w:keepNext/>
-              <w:spacing w:after="0" w:before="0" w:line="264"/>
-              <w:jc w:val="center"/>
-            </w:pPr>
-            <w:r>
-              <w:rPr>
-                <w:rFonts w:ascii="Times New Roman" w:cs="Times New Roman" w:eastAsia="Times New Roman" w:hAnsi="Times New Roman"/>
-                <w:b/>
-                <w:bCs/>
-                <w:sz w:val="24"/>
-                <w:szCs w:val="24"/>
-              </w:rPr>
-              <w:t xml:space="preserve">Price per unit</w:t>
-            </w:r>
-          </w:p>
-        </w:tc>
-        <w:tc>
-          <w:tcPr>
-            <w:tcW w:type="dxa" w:w="800"/>
-            <w:tcBorders>
-              <w:top w:val="single" w:color="000000" w:sz="4"/>
-              <w:left w:val="single" w:color="000000" w:sz="4"/>
-              <w:bottom w:val="single" w:color="000000" w:sz="4"/>
-              <w:right w:val="single" w:color="000000" w:sz="4"/>
-            </w:tcBorders>
-            <w:shd w:fill="D6EDF1" w:color="auto" w:val="clear"/>
-            <w:tcMar>
-              <w:top w:type="dxa" w:w="40"/>
-              <w:left w:type="dxa" w:w="110"/>
-              <w:bottom w:type="dxa" w:w="40"/>
-              <w:right w:type="dxa" w:w="110"/>
-            </w:tcMar>
-            <w:vAlign w:val="top"/>
-          </w:tcPr>
-          <w:p>
-            <w:pPr>
-              <w:keepNext/>
-              <w:spacing w:after="0" w:before="0" w:line="264"/>
-              <w:jc w:val="center"/>
-            </w:pPr>
-            <w:r>
-              <w:rPr>
-                <w:rFonts w:ascii="Times New Roman" w:cs="Times New Roman" w:eastAsia="Times New Roman" w:hAnsi="Times New Roman"/>
-                <w:b/>
-                <w:bCs/>
-                <w:sz w:val="24"/>
-                <w:szCs w:val="24"/>
-              </w:rPr>
-              <w:t xml:space="preserve">Qty</w:t>
-            </w:r>
-          </w:p>
-        </w:tc>
-        <w:tc>
-          <w:tcPr>
-            <w:tcW w:type="dxa" w:w="1160"/>
-            <w:tcBorders>
-              <w:top w:val="single" w:color="000000" w:sz="4"/>
-              <w:left w:val="single" w:color="000000" w:sz="4"/>
-              <w:bottom w:val="single" w:color="000000" w:sz="4"/>
-              <w:right w:val="single" w:color="000000" w:sz="4"/>
-            </w:tcBorders>
-            <w:shd w:fill="D6EDF1" w:color="auto" w:val="clear"/>
-            <w:tcMar>
-              <w:top w:type="dxa" w:w="40"/>
-              <w:left w:type="dxa" w:w="110"/>
-              <w:bottom w:type="dxa" w:w="40"/>
-              <w:right w:type="dxa" w:w="110"/>
-            </w:tcMar>
-            <w:vAlign w:val="top"/>
-          </w:tcPr>
-          <w:p>
-            <w:pPr>
-              <w:keepNext/>
-              <w:spacing w:after="0" w:before="0" w:line="264"/>
-              <w:jc w:val="center"/>
-            </w:pPr>
-            <w:r>
-              <w:rPr>
-                <w:rFonts w:ascii="Times New Roman" w:cs="Times New Roman" w:eastAsia="Times New Roman" w:hAnsi="Times New Roman"/>
-                <w:b/>
-                <w:bCs/>
-                <w:sz w:val="24"/>
-                <w:szCs w:val="24"/>
-              </w:rPr>
-              <w:t xml:space="preserve">Unit</w:t>
-            </w:r>
-          </w:p>
-        </w:tc>
-        <w:tc>
-          <w:tcPr>
-            <w:tcW w:type="dxa" w:w="2300"/>
-            <w:tcBorders>
-              <w:top w:val="single" w:color="000000" w:sz="4"/>
-              <w:left w:val="single" w:color="000000" w:sz="4"/>
-              <w:bottom w:val="single" w:color="000000" w:sz="4"/>
-              <w:right w:val="single" w:color="000000" w:sz="4"/>
-            </w:tcBorders>
-            <w:shd w:fill="D6EDF1" w:color="auto" w:val="clear"/>
-            <w:tcMar>
-              <w:top w:type="dxa" w:w="40"/>
-              <w:left w:type="dxa" w:w="110"/>
-              <w:bottom w:type="dxa" w:w="40"/>
-              <w:right w:type="dxa" w:w="110"/>
-            </w:tcMar>
-            <w:vAlign w:val="top"/>
-          </w:tcPr>
-          <w:p>
-            <w:pPr>
-              <w:keepNext/>
-              <w:spacing w:after="0" w:before="0" w:line="264"/>
-              <w:jc w:val="center"/>
-            </w:pPr>
-            <w:r>
-              <w:rPr>
-                <w:rFonts w:ascii="Times New Roman" w:cs="Times New Roman" w:eastAsia="Times New Roman" w:hAnsi="Times New Roman"/>
-                <w:b/>
-                <w:bCs/>
-                <w:sz w:val="24"/>
-                <w:szCs w:val="24"/>
-              </w:rPr>
-              <w:t xml:space="preserve">Total Price</w:t>
-            </w:r>
-          </w:p>
-        </w:tc>
-      </w:tr>
-      <w:tr>
-        <w:trPr>
-          <w:cantSplit/>
-        </w:trPr>
-        <w:tc>
-          <w:tcPr>
-            <w:tcW w:type="dxa" w:w="4100"/>
-            <w:tcBorders>
-              <w:top w:val="single" w:color="000000" w:sz="4"/>
-              <w:left w:val="single" w:color="000000" w:sz="4"/>
-              <w:bottom w:val="single" w:color="000000" w:sz="4"/>
-              <w:right w:val="single" w:color="000000" w:sz="4"/>
-            </w:tcBorders>
-            <w:tcMar>
-              <w:top w:type="dxa" w:w="40"/>
-              <w:left w:type="dxa" w:w="110"/>
-              <w:bottom w:type="dxa" w:w="40"/>
-              <w:right w:type="dxa" w:w="110"/>
-            </w:tcMar>
-            <w:vAlign w:val="center"/>
-          </w:tcPr>
-          <w:p>
-            <w:pPr>
-              <w:spacing w:after="0" w:before="0" w:line="264"/>
-              <w:jc w:val="center"/>
-            </w:pPr>
-            <w:r>
-              <w:rPr>
-                <w:rFonts w:ascii="Times New Roman" w:cs="Times New Roman" w:eastAsia="Times New Roman" w:hAnsi="Times New Roman"/>
-                <w:sz w:val="20"/>
-                <w:szCs w:val="20"/>
-              </w:rPr>
-              <w:t xml:space="preserve">Timah solder + flux</w:t>
-            </w:r>
-          </w:p>
-        </w:tc>
-        <w:tc>
-          <w:tcPr>
-            <w:tcW w:type="dxa" w:w="1700"/>
-            <w:tcBorders>
-              <w:top w:val="single" w:color="000000" w:sz="4"/>
-              <w:left w:val="single" w:color="000000" w:sz="4"/>
-              <w:bottom w:val="single" w:color="000000" w:sz="4"/>
-              <w:right w:val="single" w:color="000000" w:sz="4"/>
-            </w:tcBorders>
-            <w:tcMar>
-              <w:top w:type="dxa" w:w="40"/>
-              <w:left w:type="dxa" w:w="110"/>
-              <w:bottom w:type="dxa" w:w="40"/>
-              <w:right w:type="dxa" w:w="110"/>
-            </w:tcMar>
-            <w:vAlign w:val="center"/>
-          </w:tcPr>
-          <w:p>
-            <w:pPr>
-              <w:spacing w:after="0" w:before="0" w:line="264"/>
-              <w:jc w:val="center"/>
-            </w:pPr>
-            <w:r>
-              <w:rPr>
-                <w:rFonts w:ascii="Times New Roman" w:cs="Times New Roman" w:eastAsia="Times New Roman" w:hAnsi="Times New Roman"/>
-                <w:sz w:val="20"/>
-                <w:szCs w:val="20"/>
-              </w:rPr>
-              <w:t xml:space="preserve">Rp25.000</w:t>
-            </w:r>
-          </w:p>
-        </w:tc>
-        <w:tc>
-          <w:tcPr>
-            <w:tcW w:type="dxa" w:w="800"/>
-            <w:tcBorders>
-              <w:top w:val="single" w:color="000000" w:sz="4"/>
-              <w:left w:val="single" w:color="000000" w:sz="4"/>
-              <w:bottom w:val="single" w:color="000000" w:sz="4"/>
-              <w:right w:val="single" w:color="000000" w:sz="4"/>
-            </w:tcBorders>
-            <w:tcMar>
-              <w:top w:type="dxa" w:w="40"/>
-              <w:left w:type="dxa" w:w="110"/>
-              <w:bottom w:type="dxa" w:w="40"/>
-              <w:right w:type="dxa" w:w="110"/>
-            </w:tcMar>
-            <w:vAlign w:val="center"/>
-          </w:tcPr>
-          <w:p>
-            <w:pPr>
-              <w:spacing w:after="0" w:before="0" w:line="264"/>
-              <w:jc w:val="center"/>
-            </w:pPr>
-            <w:r>
-              <w:rPr>
-                <w:rFonts w:ascii="Times New Roman" w:cs="Times New Roman" w:eastAsia="Times New Roman" w:hAnsi="Times New Roman"/>
-                <w:sz w:val="20"/>
-                <w:szCs w:val="20"/>
-              </w:rPr>
-              <w:t xml:space="preserve">1</w:t>
-            </w:r>
-          </w:p>
-        </w:tc>
-        <w:tc>
-          <w:tcPr>
-            <w:tcW w:type="dxa" w:w="1160"/>
-            <w:tcBorders>
-              <w:top w:val="single" w:color="000000" w:sz="4"/>
-              <w:left w:val="single" w:color="000000" w:sz="4"/>
-              <w:bottom w:val="single" w:color="000000" w:sz="4"/>
-              <w:right w:val="single" w:color="000000" w:sz="4"/>
-            </w:tcBorders>
-            <w:tcMar>
-              <w:top w:type="dxa" w:w="40"/>
-              <w:left w:type="dxa" w:w="110"/>
-              <w:bottom w:type="dxa" w:w="40"/>
-              <w:right w:type="dxa" w:w="110"/>
-            </w:tcMar>
-            <w:vAlign w:val="center"/>
-          </w:tcPr>
-          <w:p>
-            <w:pPr>
-              <w:spacing w:after="0" w:before="0" w:line="264"/>
-              <w:jc w:val="center"/>
-            </w:pPr>
-            <w:r>
-              <w:rPr>
-                <w:rFonts w:ascii="Times New Roman" w:cs="Times New Roman" w:eastAsia="Times New Roman" w:hAnsi="Times New Roman"/>
-                <w:sz w:val="20"/>
-                <w:szCs w:val="20"/>
-              </w:rPr>
-              <w:t xml:space="preserve">paket</w:t>
-            </w:r>
-          </w:p>
-        </w:tc>
-        <w:tc>
-          <w:tcPr>
-            <w:tcW w:type="dxa" w:w="2300"/>
-            <w:tcBorders>
-              <w:top w:val="single" w:color="000000" w:sz="4"/>
-              <w:left w:val="single" w:color="000000" w:sz="4"/>
-              <w:bottom w:val="single" w:color="000000" w:sz="4"/>
-              <w:right w:val="single" w:color="000000" w:sz="4"/>
-            </w:tcBorders>
-            <w:tcMar>
-              <w:top w:type="dxa" w:w="40"/>
-              <w:left w:type="dxa" w:w="110"/>
-              <w:bottom w:type="dxa" w:w="40"/>
-              <w:right w:type="dxa" w:w="110"/>
-            </w:tcMar>
-            <w:vAlign w:val="center"/>
-          </w:tcPr>
-          <w:p>
-            <w:pPr>
-              <w:spacing w:after="0" w:before="0" w:line="264"/>
-              <w:jc w:val="center"/>
-            </w:pPr>
-            <w:r>
-              <w:rPr>
-                <w:rFonts w:ascii="Times New Roman" w:cs="Times New Roman" w:eastAsia="Times New Roman" w:hAnsi="Times New Roman"/>
-                <w:sz w:val="20"/>
-                <w:szCs w:val="20"/>
-              </w:rPr>
-              <w:t xml:space="preserve">Rp25.000</w:t>
-            </w:r>
-          </w:p>
-        </w:tc>
-      </w:tr>
-      <w:tr>
-        <w:trPr>
-          <w:cantSplit/>
-        </w:trPr>
-        <w:tc>
-          <w:tcPr>
-            <w:tcW w:type="dxa" w:w="4100"/>
-            <w:tcBorders>
-              <w:top w:val="single" w:color="000000" w:sz="4"/>
-              <w:left w:val="single" w:color="000000" w:sz="4"/>
-              <w:bottom w:val="single" w:color="000000" w:sz="4"/>
-              <w:right w:val="single" w:color="000000" w:sz="4"/>
-            </w:tcBorders>
-            <w:tcMar>
-              <w:top w:type="dxa" w:w="40"/>
-              <w:left w:type="dxa" w:w="110"/>
-              <w:bottom w:type="dxa" w:w="40"/>
-              <w:right w:type="dxa" w:w="110"/>
-            </w:tcMar>
-            <w:vAlign w:val="center"/>
-          </w:tcPr>
-          <w:p>
-            <w:pPr>
-              <w:spacing w:after="0" w:before="0" w:line="264"/>
-              <w:jc w:val="center"/>
-            </w:pPr>
-            <w:r>
-              <w:rPr>
-                <w:rFonts w:ascii="Times New Roman" w:cs="Times New Roman" w:eastAsia="Times New Roman" w:hAnsi="Times New Roman"/>
-                <w:sz w:val="20"/>
-                <w:szCs w:val="20"/>
-              </w:rPr>
-              <w:t xml:space="preserve">Breadboard + kabel jumper</w:t>
-            </w:r>
-          </w:p>
-        </w:tc>
-        <w:tc>
-          <w:tcPr>
-            <w:tcW w:type="dxa" w:w="1700"/>
-            <w:tcBorders>
-              <w:top w:val="single" w:color="000000" w:sz="4"/>
-              <w:left w:val="single" w:color="000000" w:sz="4"/>
-              <w:bottom w:val="single" w:color="000000" w:sz="4"/>
-              <w:right w:val="single" w:color="000000" w:sz="4"/>
-            </w:tcBorders>
-            <w:tcMar>
-              <w:top w:type="dxa" w:w="40"/>
-              <w:left w:type="dxa" w:w="110"/>
-              <w:bottom w:type="dxa" w:w="40"/>
-              <w:right w:type="dxa" w:w="110"/>
-            </w:tcMar>
-            <w:vAlign w:val="center"/>
-          </w:tcPr>
-          <w:p>
-            <w:pPr>
-              <w:spacing w:after="0" w:before="0" w:line="264"/>
-              <w:jc w:val="center"/>
-            </w:pPr>
-            <w:r>
-              <w:rPr>
-                <w:rFonts w:ascii="Times New Roman" w:cs="Times New Roman" w:eastAsia="Times New Roman" w:hAnsi="Times New Roman"/>
-                <w:sz w:val="20"/>
-                <w:szCs w:val="20"/>
-              </w:rPr>
-              <w:t xml:space="preserve">Rp60.000</w:t>
-            </w:r>
-          </w:p>
-        </w:tc>
-        <w:tc>
-          <w:tcPr>
-            <w:tcW w:type="dxa" w:w="800"/>
-            <w:tcBorders>
-              <w:top w:val="single" w:color="000000" w:sz="4"/>
-              <w:left w:val="single" w:color="000000" w:sz="4"/>
-              <w:bottom w:val="single" w:color="000000" w:sz="4"/>
-              <w:right w:val="single" w:color="000000" w:sz="4"/>
-            </w:tcBorders>
-            <w:tcMar>
-              <w:top w:type="dxa" w:w="40"/>
-              <w:left w:type="dxa" w:w="110"/>
-              <w:bottom w:type="dxa" w:w="40"/>
-              <w:right w:type="dxa" w:w="110"/>
-            </w:tcMar>
-            <w:vAlign w:val="center"/>
-          </w:tcPr>
-          <w:p>
-            <w:pPr>
-              <w:spacing w:after="0" w:before="0" w:line="264"/>
-              <w:jc w:val="center"/>
-            </w:pPr>
-            <w:r>
-              <w:rPr>
-                <w:rFonts w:ascii="Times New Roman" w:cs="Times New Roman" w:eastAsia="Times New Roman" w:hAnsi="Times New Roman"/>
-                <w:sz w:val="20"/>
-                <w:szCs w:val="20"/>
-              </w:rPr>
-              <w:t xml:space="preserve">1</w:t>
-            </w:r>
-          </w:p>
-        </w:tc>
-        <w:tc>
-          <w:tcPr>
-            <w:tcW w:type="dxa" w:w="1160"/>
-            <w:tcBorders>
-              <w:top w:val="single" w:color="000000" w:sz="4"/>
-              <w:left w:val="single" w:color="000000" w:sz="4"/>
-              <w:bottom w:val="single" w:color="000000" w:sz="4"/>
-              <w:right w:val="single" w:color="000000" w:sz="4"/>
-            </w:tcBorders>
-            <w:tcMar>
-              <w:top w:type="dxa" w:w="40"/>
-              <w:left w:type="dxa" w:w="110"/>
-              <w:bottom w:type="dxa" w:w="40"/>
-              <w:right w:type="dxa" w:w="110"/>
-            </w:tcMar>
-            <w:vAlign w:val="center"/>
-          </w:tcPr>
-          <w:p>
-            <w:pPr>
-              <w:spacing w:after="0" w:before="0" w:line="264"/>
-              <w:jc w:val="center"/>
-            </w:pPr>
-            <w:r>
-              <w:rPr>
-                <w:rFonts w:ascii="Times New Roman" w:cs="Times New Roman" w:eastAsia="Times New Roman" w:hAnsi="Times New Roman"/>
-                <w:sz w:val="20"/>
-                <w:szCs w:val="20"/>
-              </w:rPr>
-              <w:t xml:space="preserve">paket</w:t>
-            </w:r>
-          </w:p>
-        </w:tc>
-        <w:tc>
-          <w:tcPr>
-            <w:tcW w:type="dxa" w:w="2300"/>
-            <w:tcBorders>
-              <w:top w:val="single" w:color="000000" w:sz="4"/>
-              <w:left w:val="single" w:color="000000" w:sz="4"/>
-              <w:bottom w:val="single" w:color="000000" w:sz="4"/>
-              <w:right w:val="single" w:color="000000" w:sz="4"/>
-            </w:tcBorders>
-            <w:tcMar>
-              <w:top w:type="dxa" w:w="40"/>
-              <w:left w:type="dxa" w:w="110"/>
-              <w:bottom w:type="dxa" w:w="40"/>
-              <w:right w:type="dxa" w:w="110"/>
-            </w:tcMar>
-            <w:vAlign w:val="center"/>
-          </w:tcPr>
-          <w:p>
-            <w:pPr>
-              <w:spacing w:after="0" w:before="0" w:line="264"/>
-              <w:jc w:val="center"/>
-            </w:pPr>
-            <w:r>
-              <w:rPr>
-                <w:rFonts w:ascii="Times New Roman" w:cs="Times New Roman" w:eastAsia="Times New Roman" w:hAnsi="Times New Roman"/>
-                <w:sz w:val="20"/>
-                <w:szCs w:val="20"/>
-              </w:rPr>
-              <w:t xml:space="preserve">Rp60.000</w:t>
-            </w:r>
-          </w:p>
-        </w:tc>
-      </w:tr>
-      <w:tr>
-        <w:trPr>
-          <w:cantSplit/>
-        </w:trPr>
-        <w:tc>
-          <w:tcPr>
-            <w:tcW w:type="dxa" w:w="7760"/>
-            <w:gridSpan w:val="4"/>
-            <w:tcBorders>
-              <w:top w:val="single" w:color="000000" w:sz="4"/>
-              <w:left w:val="single" w:color="000000" w:sz="4"/>
-              <w:bottom w:val="single" w:color="000000" w:sz="4"/>
-              <w:right w:val="single" w:color="000000" w:sz="4"/>
-            </w:tcBorders>
-            <w:tcMar>
-              <w:top w:type="dxa" w:w="40"/>
-              <w:left w:type="dxa" w:w="110"/>
-              <w:bottom w:type="dxa" w:w="40"/>
-              <w:right w:type="dxa" w:w="110"/>
-            </w:tcMar>
-            <w:vAlign w:val="top"/>
-          </w:tcPr>
-          <w:p>
-            <w:pPr>
-              <w:spacing w:after="0" w:before="0" w:line="264"/>
-              <w:jc w:val="center"/>
-            </w:pPr>
-            <w:r>
-              <w:rPr>
-                <w:rFonts w:ascii="Times New Roman" w:cs="Times New Roman" w:eastAsia="Times New Roman" w:hAnsi="Times New Roman"/>
-                <w:sz w:val="20"/>
-                <w:szCs w:val="20"/>
-              </w:rPr>
-              <w:t xml:space="preserve">Sub Total</w:t>
-            </w:r>
-          </w:p>
-        </w:tc>
-        <w:tc>
-          <w:tcPr>
-            <w:tcW w:type="dxa" w:w="2300"/>
-            <w:tcBorders>
-              <w:top w:val="single" w:color="000000" w:sz="4"/>
-              <w:left w:val="single" w:color="000000" w:sz="4"/>
-              <w:bottom w:val="single" w:color="000000" w:sz="4"/>
-              <w:right w:val="single" w:color="000000" w:sz="4"/>
-            </w:tcBorders>
-            <w:tcMar>
-              <w:top w:type="dxa" w:w="40"/>
-              <w:left w:type="dxa" w:w="110"/>
-              <w:bottom w:type="dxa" w:w="40"/>
-              <w:right w:type="dxa" w:w="110"/>
-            </w:tcMar>
-            <w:vAlign w:val="top"/>
-          </w:tcPr>
-          <w:p>
-            <w:pPr>
-              <w:spacing w:after="0" w:before="0" w:line="264"/>
-              <w:jc w:val="center"/>
-            </w:pPr>
-            <w:r>
-              <w:rPr>
-                <w:rFonts w:ascii="Times New Roman" w:cs="Times New Roman" w:eastAsia="Times New Roman" w:hAnsi="Times New Roman"/>
-                <w:b/>
-                <w:bCs/>
-                <w:sz w:val="20"/>
-                <w:szCs w:val="20"/>
-              </w:rPr>
-              <w:t xml:space="preserve">Rp85.000</w:t>
-            </w:r>
-          </w:p>
-        </w:tc>
-      </w:tr>
-      <w:tr>
-        <w:trPr>
-          <w:cantSplit/>
-        </w:trPr>
-        <w:tc>
-          <w:tcPr>
-            <w:tcW w:type="dxa" w:w="7760"/>
-            <w:gridSpan w:val="4"/>
-            <w:tcBorders>
-              <w:top w:val="single" w:color="000000" w:sz="4"/>
-              <w:left w:val="single" w:color="000000" w:sz="4"/>
-              <w:bottom w:val="single" w:color="000000" w:sz="4"/>
-              <w:right w:val="single" w:color="000000" w:sz="4"/>
-            </w:tcBorders>
-            <w:tcMar>
-              <w:top w:type="dxa" w:w="40"/>
-              <w:left w:type="dxa" w:w="110"/>
-              <w:bottom w:type="dxa" w:w="40"/>
-              <w:right w:type="dxa" w:w="110"/>
-            </w:tcMar>
-            <w:vAlign w:val="top"/>
-          </w:tcPr>
-          <w:p>
-            <w:pPr>
-              <w:spacing w:after="0" w:before="0" w:line="264"/>
-              <w:jc w:val="center"/>
-            </w:pPr>
-            <w:r>
-              <w:rPr>
-                <w:rFonts w:ascii="Times New Roman" w:cs="Times New Roman" w:eastAsia="Times New Roman" w:hAnsi="Times New Roman"/>
-                <w:b/>
-                <w:bCs/>
-                <w:sz w:val="24"/>
-                <w:szCs w:val="24"/>
-              </w:rPr>
-              <w:t xml:space="preserve">TOTAL BUDGET</w:t>
-            </w:r>
-          </w:p>
-        </w:tc>
-        <w:tc>
-          <w:tcPr>
-            <w:tcW w:type="dxa" w:w="2300"/>
-            <w:tcBorders>
-              <w:top w:val="single" w:color="000000" w:sz="4"/>
-              <w:left w:val="single" w:color="000000" w:sz="4"/>
-              <w:bottom w:val="single" w:color="000000" w:sz="4"/>
-              <w:right w:val="single" w:color="000000" w:sz="4"/>
-            </w:tcBorders>
-            <w:tcMar>
-              <w:top w:type="dxa" w:w="40"/>
-              <w:left w:type="dxa" w:w="110"/>
-              <w:bottom w:type="dxa" w:w="40"/>
-              <w:right w:type="dxa" w:w="110"/>
-            </w:tcMar>
-            <w:vAlign w:val="top"/>
-          </w:tcPr>
-          <w:p>
-            <w:pPr>
-              <w:spacing w:after="0" w:before="0" w:line="264"/>
-              <w:jc w:val="center"/>
-            </w:pPr>
-            <w:r>
-              <w:rPr>
-                <w:rFonts w:ascii="Times New Roman" w:cs="Times New Roman" w:eastAsia="Times New Roman" w:hAnsi="Times New Roman"/>
-                <w:b/>
-                <w:bCs/>
-                <w:sz w:val="24"/>
-                <w:szCs w:val="24"/>
-              </w:rPr>
-              <w:t xml:space="preserve">Rp887.000</w:t>
+              <w:t xml:space="preserve">Rp902.000</w:t>
             </w:r>
           </w:p>
         </w:tc>
@@ -9310,7 +8680,7 @@
       </w:tr>
     </w:tbl>
     <w:sectPr>
-      <w:headerReference w:type="default" r:id="rId7"/>
+      <w:headerReference w:type="default" r:id="rId6"/>
       <w:pgSz w:w="11906" w:h="16838" w:orient="portrait"/>
       <w:pgMar w:top="1440" w:right="546" w:bottom="1300" w:left="1300" w:header="0" w:footer="500" w:gutter="0"/>
       <w:pgNumType/>
@@ -9318,10 +8688,6 @@
     </w:sectPr>
   </w:body>
 </w:document>
-</file>
-
-<file path=word/comments.xml><?xml version="1.0" encoding="utf-8"?>
-<w:comments xmlns:cx="http://schemas.microsoft.com/office/drawing/2014/chartex" xmlns:cx1="http://schemas.microsoft.com/office/drawing/2015/9/8/chartex" xmlns:cx2="http://schemas.microsoft.com/office/drawing/2015/10/21/chartex" xmlns:cx3="http://schemas.microsoft.com/office/drawing/2016/5/9/chartex" xmlns:cx4="http://schemas.microsoft.com/office/drawing/2016/5/10/chartex" xmlns:cx5="http://schemas.microsoft.com/office/drawing/2016/5/11/chartex" xmlns:cx6="http://schemas.microsoft.com/office/drawing/2016/5/12/chartex" xmlns:cx7="http://schemas.microsoft.com/office/drawing/2016/5/13/chartex" xmlns:cx8="http://schemas.microsoft.com/office/drawing/2016/5/14/chartex" xmlns:mc="http://schemas.openxmlformats.org/markup-compatibility/2006" xmlns:aink="http://schemas.microsoft.com/office/drawing/2016/ink" xmlns:am3d="http://schemas.microsoft.com/office/drawing/2017/model3d" xmlns:o="urn:schemas-microsoft-com:office:office" xmlns:r="http://schemas.openxmlformats.org/officeDocument/2006/relationships" xmlns:m="http://schemas.openxmlformats.org/officeDocument/2006/math" xmlns:v="urn:schemas-microsoft-com:vml" xmlns:wp14="http://schemas.microsoft.com/office/word/2010/wordprocessingDrawing" xmlns:wp="http://schemas.openxmlformats.org/drawingml/2006/wordprocessingDrawing" xmlns:w10="urn:schemas-microsoft-com:office:word" xmlns:w="http://schemas.openxmlformats.org/wordprocessingml/2006/main" xmlns:w14="http://schemas.microsoft.com/office/word/2010/wordml" xmlns:w15="http://schemas.microsoft.com/office/word/2012/wordml" xmlns:w16cex="http://schemas.microsoft.com/office/word/2018/wordml/cex" xmlns:w16cid="http://schemas.microsoft.com/office/word/2016/wordml/cid" xmlns:w16="http://schemas.microsoft.com/office/word/2018/wordml" xmlns:w16sdtdh="http://schemas.microsoft.com/office/word/2020/wordml/sdtdatahash" xmlns:w16se="http://schemas.microsoft.com/office/word/2015/wordml/symex" xmlns:wpg="http://schemas.microsoft.com/office/word/2010/wordprocessingGroup" xmlns:wpi="http://schemas.microsoft.com/office/word/2010/wordprocessingInk" xmlns:wne="http://schemas.microsoft.com/office/word/2006/wordml" xmlns:wps="http://schemas.microsoft.com/office/word/2010/wordprocessingShape"/>
 </file>
 
 <file path=word/endnotes.xml><?xml version="1.0" encoding="utf-8"?>
@@ -9414,7 +8780,7 @@
           <wp:extent cx="7562850" cy="504825"/>
           <wp:effectExtent t="0" r="0" b="0" l="0"/>
           <wp:wrapNone/>
-          <wp:docPr id="1" name="" descr="" title=""/>
+          <wp:docPr id="1" name=""/>
           <wp:cNvGraphicFramePr>
             <a:graphicFrameLocks xmlns:a="http://schemas.openxmlformats.org/drawingml/2006/main" noChangeAspect="1"/>
           </wp:cNvGraphicFramePr>
@@ -9457,7 +8823,7 @@
 <w:numbering xmlns:wpc="http://schemas.microsoft.com/office/word/2010/wordprocessingCanvas" xmlns:mc="http://schemas.openxmlformats.org/markup-compatibility/2006" xmlns:o="urn:schemas-microsoft-com:office:office" xmlns:r="http://schemas.openxmlformats.org/officeDocument/2006/relationships" xmlns:m="http://schemas.openxmlformats.org/officeDocument/2006/math" xmlns:v="urn:schemas-microsoft-com:vml" xmlns:wp14="http://schemas.microsoft.com/office/word/2010/wordprocessingDrawing" xmlns:wp="http://schemas.openxmlformats.org/drawingml/2006/wordprocessingDrawing" xmlns:w10="urn:schemas-microsoft-com:office:word" xmlns:w="http://schemas.openxmlformats.org/wordprocessingml/2006/main" xmlns:w14="http://schemas.microsoft.com/office/word/2010/wordml" xmlns:w15="http://schemas.microsoft.com/office/word/2012/wordml" xmlns:wpg="http://schemas.microsoft.com/office/word/2010/wordprocessingGroup" xmlns:wpi="http://schemas.microsoft.com/office/word/2010/wordprocessingInk" xmlns:wne="http://schemas.microsoft.com/office/word/2006/wordml" xmlns:wps="http://schemas.microsoft.com/office/word/2010/wordprocessingShape" mc:Ignorable="w14 w15 wp14">
   <w:abstractNum w:abstractNumId="1" w15:restartNumberingAfterBreak="0">
     <w:multiLevelType w:val="hybridMultilevel"/>
-    <w:lvl w:ilvl="0" w15:tentative="1">
+    <w:lvl w:ilvl="0" w:tentative="1">
       <w:start w:val="1"/>
       <w:numFmt w:val="bullet"/>
       <w:lvlText w:val="●"/>
@@ -9466,7 +8832,7 @@
         <w:ind w:left="720" w:hanging="360"/>
       </w:pPr>
     </w:lvl>
-    <w:lvl w:ilvl="1" w15:tentative="1">
+    <w:lvl w:ilvl="1" w:tentative="1">
       <w:start w:val="1"/>
       <w:numFmt w:val="bullet"/>
       <w:lvlText w:val="○"/>
@@ -9475,7 +8841,7 @@
         <w:ind w:left="1440" w:hanging="360"/>
       </w:pPr>
     </w:lvl>
-    <w:lvl w:ilvl="2" w15:tentative="1">
+    <w:lvl w:ilvl="2" w:tentative="1">
       <w:start w:val="1"/>
       <w:numFmt w:val="bullet"/>
       <w:lvlText w:val="■"/>
@@ -9484,7 +8850,7 @@
         <w:ind w:left="2160" w:hanging="360"/>
       </w:pPr>
     </w:lvl>
-    <w:lvl w:ilvl="3" w15:tentative="1">
+    <w:lvl w:ilvl="3" w:tentative="1">
       <w:start w:val="1"/>
       <w:numFmt w:val="bullet"/>
       <w:lvlText w:val="●"/>
@@ -9493,7 +8859,7 @@
         <w:ind w:left="2880" w:hanging="360"/>
       </w:pPr>
     </w:lvl>
-    <w:lvl w:ilvl="4" w15:tentative="1">
+    <w:lvl w:ilvl="4" w:tentative="1">
       <w:start w:val="1"/>
       <w:numFmt w:val="bullet"/>
       <w:lvlText w:val="○"/>
@@ -9502,7 +8868,7 @@
         <w:ind w:left="3600" w:hanging="360"/>
       </w:pPr>
     </w:lvl>
-    <w:lvl w:ilvl="5" w15:tentative="1">
+    <w:lvl w:ilvl="5" w:tentative="1">
       <w:start w:val="1"/>
       <w:numFmt w:val="bullet"/>
       <w:lvlText w:val="■"/>
@@ -9511,7 +8877,7 @@
         <w:ind w:left="4320" w:hanging="360"/>
       </w:pPr>
     </w:lvl>
-    <w:lvl w:ilvl="6" w15:tentative="1">
+    <w:lvl w:ilvl="6" w:tentative="1">
       <w:start w:val="1"/>
       <w:numFmt w:val="bullet"/>
       <w:lvlText w:val="●"/>
@@ -9520,7 +8886,7 @@
         <w:ind w:left="5040" w:hanging="360"/>
       </w:pPr>
     </w:lvl>
-    <w:lvl w:ilvl="7" w15:tentative="1">
+    <w:lvl w:ilvl="7" w:tentative="1">
       <w:start w:val="1"/>
       <w:numFmt w:val="bullet"/>
       <w:lvlText w:val="●"/>
@@ -9529,7 +8895,7 @@
         <w:ind w:left="5760" w:hanging="360"/>
       </w:pPr>
     </w:lvl>
-    <w:lvl w:ilvl="8" w15:tentative="1">
+    <w:lvl w:ilvl="8" w:tentative="1">
       <w:start w:val="1"/>
       <w:numFmt w:val="bullet"/>
       <w:lvlText w:val="●"/>
@@ -9541,7 +8907,7 @@
   </w:abstractNum>
   <w:abstractNum w:abstractNumId="2" w15:restartNumberingAfterBreak="0">
     <w:multiLevelType w:val="hybridMultilevel"/>
-    <w:lvl w:ilvl="0" w15:tentative="1">
+    <w:lvl w:ilvl="0" w:tentative="1">
       <w:start w:val="1"/>
       <w:numFmt w:val="decimal"/>
       <w:lvlText w:val="%1."/>
@@ -9553,7 +8919,7 @@
   </w:abstractNum>
   <w:abstractNum w:abstractNumId="3" w15:restartNumberingAfterBreak="0">
     <w:multiLevelType w:val="hybridMultilevel"/>
-    <w:lvl w:ilvl="0" w15:tentative="1">
+    <w:lvl w:ilvl="0" w:tentative="1">
       <w:start w:val="1"/>
       <w:numFmt w:val="decimal"/>
       <w:lvlText w:val="%1."/>
@@ -9570,7 +8936,7 @@
   </w:abstractNum>
   <w:abstractNum w:abstractNumId="4" w15:restartNumberingAfterBreak="0">
     <w:multiLevelType w:val="hybridMultilevel"/>
-    <w:lvl w:ilvl="0" w15:tentative="1">
+    <w:lvl w:ilvl="0" w:tentative="1">
       <w:start w:val="1"/>
       <w:numFmt w:val="decimal"/>
       <w:lvlText w:val="%1."/>
@@ -9582,7 +8948,7 @@
   </w:abstractNum>
   <w:abstractNum w:abstractNumId="5" w15:restartNumberingAfterBreak="0">
     <w:multiLevelType w:val="hybridMultilevel"/>
-    <w:lvl w:ilvl="0" w15:tentative="1">
+    <w:lvl w:ilvl="0" w:tentative="1">
       <w:start w:val="1"/>
       <w:numFmt w:val="bullet"/>
       <w:lvlText w:val="●"/>
@@ -9642,6 +9008,25 @@
     </w:rPrDefault>
     <w:pPrDefault/>
   </w:docDefaults>
+  <w:style w:type="paragraph" w:styleId="Normal" w:default="1">
+    <w:name w:val="Normal"/>
+    <w:qFormat/>
+  </w:style>
+  <w:style w:type="table" w:styleId="TableNormal" w:default="true">
+    <w:name w:val="Normal Table"/>
+    <w:uiPriority w:val="99"/>
+    <w:semiHidden/>
+    <w:unhideWhenUsed/>
+    <w:tblPr>
+      <w:tblInd w:type="dxa" w:w="0"/>
+      <w:tblCellMar>
+        <w:top w:type="dxa" w:w="0"/>
+        <w:left w:type="dxa" w:w="108"/>
+        <w:bottom w:type="dxa" w:w="0"/>
+        <w:right w:type="dxa" w:w="108"/>
+      </w:tblCellMar>
+    </w:tblPr>
+  </w:style>
   <w:style w:type="paragraph" w:styleId="Title">
     <w:name w:val="Title"/>
     <w:basedOn w:val="Normal"/>
@@ -9814,4 +9199,294 @@
     </w:rPr>
   </w:style>
 </w:styles>
+</file>
+
+<file path=word/theme/theme1.xml><?xml version="1.0" encoding="utf-8"?>
+<a:theme xmlns:a="http://schemas.openxmlformats.org/drawingml/2006/main" name="Office Theme">
+  <a:themeElements>
+    <a:clrScheme name="Office">
+      <a:dk1>
+        <a:sysClr val="windowText" lastClr="000000"/>
+      </a:dk1>
+      <a:lt1>
+        <a:sysClr val="window" lastClr="FFFFFF"/>
+      </a:lt1>
+      <a:dk2>
+        <a:srgbClr val="44546A"/>
+      </a:dk2>
+      <a:lt2>
+        <a:srgbClr val="E7E6E6"/>
+      </a:lt2>
+      <a:accent1>
+        <a:srgbClr val="4472C4"/>
+      </a:accent1>
+      <a:accent2>
+        <a:srgbClr val="ED7D31"/>
+      </a:accent2>
+      <a:accent3>
+        <a:srgbClr val="A5A5A5"/>
+      </a:accent3>
+      <a:accent4>
+        <a:srgbClr val="FFC000"/>
+      </a:accent4>
+      <a:accent5>
+        <a:srgbClr val="5B9BD5"/>
+      </a:accent5>
+      <a:accent6>
+        <a:srgbClr val="70AD47"/>
+      </a:accent6>
+      <a:hlink>
+        <a:srgbClr val="0563C1"/>
+      </a:hlink>
+      <a:folHlink>
+        <a:srgbClr val="954F72"/>
+      </a:folHlink>
+    </a:clrScheme>
+    <a:fontScheme name="Office">
+      <a:majorFont>
+        <a:latin typeface="Calibri Light" panose="020F0302020204030204"/>
+        <a:ea typeface=""/>
+        <a:cs typeface=""/>
+        <a:font script="Jpan" typeface="游ゴシック Light"/>
+        <a:font script="Hang" typeface="맑은 고딕"/>
+        <a:font script="Hans" typeface="等线 Light"/>
+        <a:font script="Hant" typeface="新細明體"/>
+        <a:font script="Arab" typeface="Times New Roman"/>
+        <a:font script="Hebr" typeface="Times New Roman"/>
+        <a:font script="Thai" typeface="Angsana New"/>
+        <a:font script="Ethi" typeface="Nyala"/>
+        <a:font script="Beng" typeface="Vrinda"/>
+        <a:font script="Gujr" typeface="Shruti"/>
+        <a:font script="Khmr" typeface="MoolBoran"/>
+        <a:font script="Knda" typeface="Tunga"/>
+        <a:font script="Guru" typeface="Raavi"/>
+        <a:font script="Cans" typeface="Euphemia"/>
+        <a:font script="Cher" typeface="Plantagenet Cherokee"/>
+        <a:font script="Yiii" typeface="Microsoft Yi Baiti"/>
+        <a:font script="Tibt" typeface="Microsoft Himalaya"/>
+        <a:font script="Thaa" typeface="MV Boli"/>
+        <a:font script="Deva" typeface="Mangal"/>
+        <a:font script="Telu" typeface="Gautami"/>
+        <a:font script="Taml" typeface="Latha"/>
+        <a:font script="Syrc" typeface="Estrangelo Edessa"/>
+        <a:font script="Orya" typeface="Kalinga"/>
+        <a:font script="Mlym" typeface="Kartika"/>
+        <a:font script="Laoo" typeface="DokChampa"/>
+        <a:font script="Sinh" typeface="Iskoola Pota"/>
+        <a:font script="Mong" typeface="Mongolian Baiti"/>
+        <a:font script="Viet" typeface="Times New Roman"/>
+        <a:font script="Uigh" typeface="Microsoft Uighur"/>
+        <a:font script="Geor" typeface="Sylfaen"/>
+        <a:font script="Armn" typeface="Arial"/>
+        <a:font script="Bugi" typeface="Leelawadee UI"/>
+        <a:font script="Bopo" typeface="Microsoft JhengHei"/>
+        <a:font script="Java" typeface="Javanese Text"/>
+        <a:font script="Lisu" typeface="Segoe UI"/>
+        <a:font script="Mymr" typeface="Myanmar Text"/>
+        <a:font script="Nkoo" typeface="Ebrima"/>
+        <a:font script="Olck" typeface="Nirmala UI"/>
+        <a:font script="Osma" typeface="Ebrima"/>
+        <a:font script="Phag" typeface="Phagspa"/>
+        <a:font script="Syrn" typeface="Estrangelo Edessa"/>
+        <a:font script="Syrj" typeface="Estrangelo Edessa"/>
+        <a:font script="Syre" typeface="Estrangelo Edessa"/>
+        <a:font script="Sora" typeface="Nirmala UI"/>
+        <a:font script="Tale" typeface="Microsoft Tai Le"/>
+        <a:font script="Talu" typeface="Microsoft New Tai Lue"/>
+        <a:font script="Tfng" typeface="Ebrima"/>
+      </a:majorFont>
+      <a:minorFont>
+        <a:latin typeface="Calibri" panose="020F0502020204030204"/>
+        <a:ea typeface=""/>
+        <a:cs typeface=""/>
+        <a:font script="Jpan" typeface="游明朝"/>
+        <a:font script="Hang" typeface="맑은 고딕"/>
+        <a:font script="Hans" typeface="等线"/>
+        <a:font script="Hant" typeface="新細明體"/>
+        <a:font script="Arab" typeface="Arial"/>
+        <a:font script="Hebr" typeface="Arial"/>
+        <a:font script="Thai" typeface="Cordia New"/>
+        <a:font script="Ethi" typeface="Nyala"/>
+        <a:font script="Beng" typeface="Vrinda"/>
+        <a:font script="Gujr" typeface="Shruti"/>
+        <a:font script="Khmr" typeface="DaunPenh"/>
+        <a:font script="Knda" typeface="Tunga"/>
+        <a:font script="Guru" typeface="Raavi"/>
+        <a:font script="Cans" typeface="Euphemia"/>
+        <a:font script="Cher" typeface="Plantagenet Cherokee"/>
+        <a:font script="Yiii" typeface="Microsoft Yi Baiti"/>
+        <a:font script="Tibt" typeface="Microsoft Himalaya"/>
+        <a:font script="Thaa" typeface="MV Boli"/>
+        <a:font script="Deva" typeface="Mangal"/>
+        <a:font script="Telu" typeface="Gautami"/>
+        <a:font script="Taml" typeface="Latha"/>
+        <a:font script="Syrc" typeface="Estrangelo Edessa"/>
+        <a:font script="Orya" typeface="Kalinga"/>
+        <a:font script="Mlym" typeface="Kartika"/>
+        <a:font script="Laoo" typeface="DokChampa"/>
+        <a:font script="Sinh" typeface="Iskoola Pota"/>
+        <a:font script="Mong" typeface="Mongolian Baiti"/>
+        <a:font script="Viet" typeface="Arial"/>
+        <a:font script="Uigh" typeface="Microsoft Uighur"/>
+        <a:font script="Geor" typeface="Sylfaen"/>
+        <a:font script="Armn" typeface="Arial"/>
+        <a:font script="Bugi" typeface="Leelawadee UI"/>
+        <a:font script="Bopo" typeface="Microsoft JhengHei"/>
+        <a:font script="Java" typeface="Javanese Text"/>
+        <a:font script="Lisu" typeface="Segoe UI"/>
+        <a:font script="Mymr" typeface="Myanmar Text"/>
+        <a:font script="Nkoo" typeface="Ebrima"/>
+        <a:font script="Olck" typeface="Nirmala UI"/>
+        <a:font script="Osma" typeface="Ebrima"/>
+        <a:font script="Phag" typeface="Phagspa"/>
+        <a:font script="Syrn" typeface="Estrangelo Edessa"/>
+        <a:font script="Syrj" typeface="Estrangelo Edessa"/>
+        <a:font script="Syre" typeface="Estrangelo Edessa"/>
+        <a:font script="Sora" typeface="Nirmala UI"/>
+        <a:font script="Tale" typeface="Microsoft Tai Le"/>
+        <a:font script="Talu" typeface="Microsoft New Tai Lue"/>
+        <a:font script="Tfng" typeface="Ebrima"/>
+      </a:minorFont>
+    </a:fontScheme>
+    <a:fmtScheme name="Office">
+      <a:fillStyleLst>
+        <a:solidFill>
+          <a:schemeClr val="phClr"/>
+        </a:solidFill>
+        <a:gradFill rotWithShape="true">
+          <a:gsLst>
+            <a:gs pos="0">
+              <a:schemeClr val="phClr">
+                <a:lumMod val="110000"/>
+                <a:satMod val="105000"/>
+                <a:tint val="67000"/>
+              </a:schemeClr>
+            </a:gs>
+            <a:gs pos="50000">
+              <a:schemeClr val="phClr">
+                <a:lumMod val="105000"/>
+                <a:satMod val="103000"/>
+                <a:tint val="73000"/>
+              </a:schemeClr>
+            </a:gs>
+            <a:gs pos="100000">
+              <a:schemeClr val="phClr">
+                <a:lumMod val="105000"/>
+                <a:satMod val="109000"/>
+                <a:tint val="81000"/>
+              </a:schemeClr>
+            </a:gs>
+          </a:gsLst>
+          <a:lin ang="5400000" scaled="false"/>
+        </a:gradFill>
+        <a:gradFill rotWithShape="true">
+          <a:gsLst>
+            <a:gs pos="0">
+              <a:schemeClr val="phClr">
+                <a:satMod val="103000"/>
+                <a:lumMod val="102000"/>
+                <a:tint val="94000"/>
+              </a:schemeClr>
+            </a:gs>
+            <a:gs pos="50000">
+              <a:schemeClr val="phClr">
+                <a:satMod val="110000"/>
+                <a:lumMod val="100000"/>
+                <a:shade val="100000"/>
+              </a:schemeClr>
+            </a:gs>
+            <a:gs pos="100000">
+              <a:schemeClr val="phClr">
+                <a:lumMod val="99000"/>
+                <a:satMod val="120000"/>
+                <a:shade val="78000"/>
+              </a:schemeClr>
+            </a:gs>
+          </a:gsLst>
+          <a:lin ang="5400000" scaled="false"/>
+        </a:gradFill>
+      </a:fillStyleLst>
+      <a:lnStyleLst>
+        <a:ln w="6350" cap="flat" cmpd="sng" algn="ctr">
+          <a:solidFill>
+            <a:schemeClr val="phClr"/>
+          </a:solidFill>
+          <a:prstDash val="solid"/>
+          <a:miter lim="800000"/>
+        </a:ln>
+        <a:ln w="12700" cap="flat" cmpd="sng" algn="ctr">
+          <a:solidFill>
+            <a:schemeClr val="phClr"/>
+          </a:solidFill>
+          <a:prstDash val="solid"/>
+          <a:miter lim="800000"/>
+        </a:ln>
+        <a:ln w="19050" cap="flat" cmpd="sng" algn="ctr">
+          <a:solidFill>
+            <a:schemeClr val="phClr"/>
+          </a:solidFill>
+          <a:prstDash val="solid"/>
+          <a:miter lim="800000"/>
+        </a:ln>
+      </a:lnStyleLst>
+      <a:effectStyleLst>
+        <a:effectStyle>
+          <a:effectLst/>
+        </a:effectStyle>
+        <a:effectStyle>
+          <a:effectLst/>
+        </a:effectStyle>
+        <a:effectStyle>
+          <a:effectLst>
+            <a:outerShdw blurRad="57150" dist="19050" dir="5400000" algn="ctr" rotWithShape="false">
+              <a:srgbClr val="000000">
+                <a:alpha val="63000"/>
+              </a:srgbClr>
+            </a:outerShdw>
+          </a:effectLst>
+        </a:effectStyle>
+      </a:effectStyleLst>
+      <a:bgFillStyleLst>
+        <a:solidFill>
+          <a:schemeClr val="phClr"/>
+        </a:solidFill>
+        <a:solidFill>
+          <a:schemeClr val="phClr">
+            <a:tint val="95000"/>
+            <a:satMod val="170000"/>
+          </a:schemeClr>
+        </a:solidFill>
+        <a:gradFill rotWithShape="true">
+          <a:gsLst>
+            <a:gs pos="0">
+              <a:schemeClr val="phClr">
+                <a:tint val="93000"/>
+                <a:satMod val="150000"/>
+                <a:shade val="98000"/>
+                <a:lumMod val="102000"/>
+              </a:schemeClr>
+            </a:gs>
+            <a:gs pos="50000">
+              <a:schemeClr val="phClr">
+                <a:tint val="98000"/>
+                <a:satMod val="130000"/>
+                <a:shade val="90000"/>
+                <a:lumMod val="103000"/>
+              </a:schemeClr>
+            </a:gs>
+            <a:gs pos="100000">
+              <a:schemeClr val="phClr">
+                <a:shade val="63000"/>
+                <a:satMod val="120000"/>
+              </a:schemeClr>
+            </a:gs>
+          </a:gsLst>
+          <a:lin ang="5400000" scaled="false"/>
+        </a:gradFill>
+      </a:bgFillStyleLst>
+    </a:fmtScheme>
+  </a:themeElements>
+  <a:objectDefaults/>
+  <a:extraClrSchemeLst/>
+</a:theme>
 </file>
</xml_diff>

<commit_message>
Charter docx dibuat ulang untuk pitching RAB (tanggal 27/10, RAB Rp902.000)
Co-Authored-By: Claude Opus 5.5 <noreply@anthropic.com>
Claude-Session: https://claude.ai/code/session_0155yf5wpAX58VAfqTZWuQQK
</commit_message>
<xml_diff>
--- a/docs/Project_Charter_PJBL.docx
+++ b/docs/Project_Charter_PJBL.docx
@@ -587,7 +587,7 @@
       </w:tr>
       <w:tr>
         <w:trPr>
-          <w:cantSplit w:val="off"/>
+          <w:cantSplit w:val="false"/>
         </w:trPr>
         <w:tc>
           <w:tcPr>
@@ -724,7 +724,7 @@
       </w:tr>
       <w:tr>
         <w:trPr>
-          <w:cantSplit w:val="off"/>
+          <w:cantSplit w:val="false"/>
         </w:trPr>
         <w:tc>
           <w:tcPr>
@@ -933,7 +933,7 @@
       </w:tr>
       <w:tr>
         <w:trPr>
-          <w:cantSplit w:val="off"/>
+          <w:cantSplit w:val="false"/>
         </w:trPr>
         <w:tc>
           <w:tcPr>
@@ -1947,7 +1947,7 @@
       </w:tr>
       <w:tr>
         <w:trPr>
-          <w:cantSplit w:val="off"/>
+          <w:cantSplit w:val="false"/>
         </w:trPr>
         <w:tc>
           <w:tcPr>
@@ -3756,7 +3756,7 @@
       <w:tr>
         <w:trPr>
           <w:cantSplit/>
-          <w:tblHeader w:val="off"/>
+          <w:tblHeader w:val="false"/>
         </w:trPr>
         <w:tc>
           <w:tcPr>
@@ -7356,7 +7356,7 @@
       <w:tr>
         <w:trPr>
           <w:cantSplit/>
-          <w:tblHeader w:val="off"/>
+          <w:tblHeader w:val="false"/>
         </w:trPr>
         <w:tc>
           <w:tcPr>
@@ -8451,7 +8451,7 @@
                 <w:sz w:val="24"/>
                 <w:szCs w:val="24"/>
               </w:rPr>
-              <w:t xml:space="preserve">21 Oktober 2026</w:t>
+              <w:t xml:space="preserve">27 Oktober 2026</w:t>
             </w:r>
           </w:p>
           <w:p>
@@ -8544,7 +8544,7 @@
                 <w:sz w:val="24"/>
                 <w:szCs w:val="24"/>
               </w:rPr>
-              <w:t xml:space="preserve">21 Oktober 2026</w:t>
+              <w:t xml:space="preserve">27 Oktober 2026</w:t>
             </w:r>
           </w:p>
           <w:p>
@@ -8680,7 +8680,7 @@
       </w:tr>
     </w:tbl>
     <w:sectPr>
-      <w:headerReference w:type="default" r:id="rId6"/>
+      <w:headerReference w:type="default" r:id="rId7"/>
       <w:pgSz w:w="11906" w:h="16838" w:orient="portrait"/>
       <w:pgMar w:top="1440" w:right="546" w:bottom="1300" w:left="1300" w:header="0" w:footer="500" w:gutter="0"/>
       <w:pgNumType/>
@@ -8688,6 +8688,10 @@
     </w:sectPr>
   </w:body>
 </w:document>
+</file>
+
+<file path=word/comments.xml><?xml version="1.0" encoding="utf-8"?>
+<w:comments xmlns:cx="http://schemas.microsoft.com/office/drawing/2014/chartex" xmlns:cx1="http://schemas.microsoft.com/office/drawing/2015/9/8/chartex" xmlns:cx2="http://schemas.microsoft.com/office/drawing/2015/10/21/chartex" xmlns:cx3="http://schemas.microsoft.com/office/drawing/2016/5/9/chartex" xmlns:cx4="http://schemas.microsoft.com/office/drawing/2016/5/10/chartex" xmlns:cx5="http://schemas.microsoft.com/office/drawing/2016/5/11/chartex" xmlns:cx6="http://schemas.microsoft.com/office/drawing/2016/5/12/chartex" xmlns:cx7="http://schemas.microsoft.com/office/drawing/2016/5/13/chartex" xmlns:cx8="http://schemas.microsoft.com/office/drawing/2016/5/14/chartex" xmlns:mc="http://schemas.openxmlformats.org/markup-compatibility/2006" xmlns:aink="http://schemas.microsoft.com/office/drawing/2016/ink" xmlns:am3d="http://schemas.microsoft.com/office/drawing/2017/model3d" xmlns:o="urn:schemas-microsoft-com:office:office" xmlns:r="http://schemas.openxmlformats.org/officeDocument/2006/relationships" xmlns:m="http://schemas.openxmlformats.org/officeDocument/2006/math" xmlns:v="urn:schemas-microsoft-com:vml" xmlns:wp14="http://schemas.microsoft.com/office/word/2010/wordprocessingDrawing" xmlns:wp="http://schemas.openxmlformats.org/drawingml/2006/wordprocessingDrawing" xmlns:w10="urn:schemas-microsoft-com:office:word" xmlns:w="http://schemas.openxmlformats.org/wordprocessingml/2006/main" xmlns:w14="http://schemas.microsoft.com/office/word/2010/wordml" xmlns:w15="http://schemas.microsoft.com/office/word/2012/wordml" xmlns:w16cex="http://schemas.microsoft.com/office/word/2018/wordml/cex" xmlns:w16cid="http://schemas.microsoft.com/office/word/2016/wordml/cid" xmlns:w16="http://schemas.microsoft.com/office/word/2018/wordml" xmlns:w16sdtdh="http://schemas.microsoft.com/office/word/2020/wordml/sdtdatahash" xmlns:w16se="http://schemas.microsoft.com/office/word/2015/wordml/symex" xmlns:wpg="http://schemas.microsoft.com/office/word/2010/wordprocessingGroup" xmlns:wpi="http://schemas.microsoft.com/office/word/2010/wordprocessingInk" xmlns:wne="http://schemas.microsoft.com/office/word/2006/wordml" xmlns:wps="http://schemas.microsoft.com/office/word/2010/wordprocessingShape"/>
 </file>
 
 <file path=word/endnotes.xml><?xml version="1.0" encoding="utf-8"?>
@@ -8780,7 +8784,7 @@
           <wp:extent cx="7562850" cy="504825"/>
           <wp:effectExtent t="0" r="0" b="0" l="0"/>
           <wp:wrapNone/>
-          <wp:docPr id="1" name=""/>
+          <wp:docPr id="1" name="" descr="" title=""/>
           <wp:cNvGraphicFramePr>
             <a:graphicFrameLocks xmlns:a="http://schemas.openxmlformats.org/drawingml/2006/main" noChangeAspect="1"/>
           </wp:cNvGraphicFramePr>
@@ -8823,7 +8827,7 @@
 <w:numbering xmlns:wpc="http://schemas.microsoft.com/office/word/2010/wordprocessingCanvas" xmlns:mc="http://schemas.openxmlformats.org/markup-compatibility/2006" xmlns:o="urn:schemas-microsoft-com:office:office" xmlns:r="http://schemas.openxmlformats.org/officeDocument/2006/relationships" xmlns:m="http://schemas.openxmlformats.org/officeDocument/2006/math" xmlns:v="urn:schemas-microsoft-com:vml" xmlns:wp14="http://schemas.microsoft.com/office/word/2010/wordprocessingDrawing" xmlns:wp="http://schemas.openxmlformats.org/drawingml/2006/wordprocessingDrawing" xmlns:w10="urn:schemas-microsoft-com:office:word" xmlns:w="http://schemas.openxmlformats.org/wordprocessingml/2006/main" xmlns:w14="http://schemas.microsoft.com/office/word/2010/wordml" xmlns:w15="http://schemas.microsoft.com/office/word/2012/wordml" xmlns:wpg="http://schemas.microsoft.com/office/word/2010/wordprocessingGroup" xmlns:wpi="http://schemas.microsoft.com/office/word/2010/wordprocessingInk" xmlns:wne="http://schemas.microsoft.com/office/word/2006/wordml" xmlns:wps="http://schemas.microsoft.com/office/word/2010/wordprocessingShape" mc:Ignorable="w14 w15 wp14">
   <w:abstractNum w:abstractNumId="1" w15:restartNumberingAfterBreak="0">
     <w:multiLevelType w:val="hybridMultilevel"/>
-    <w:lvl w:ilvl="0" w:tentative="1">
+    <w:lvl w:ilvl="0" w15:tentative="1">
       <w:start w:val="1"/>
       <w:numFmt w:val="bullet"/>
       <w:lvlText w:val="●"/>
@@ -8832,7 +8836,7 @@
         <w:ind w:left="720" w:hanging="360"/>
       </w:pPr>
     </w:lvl>
-    <w:lvl w:ilvl="1" w:tentative="1">
+    <w:lvl w:ilvl="1" w15:tentative="1">
       <w:start w:val="1"/>
       <w:numFmt w:val="bullet"/>
       <w:lvlText w:val="○"/>
@@ -8841,7 +8845,7 @@
         <w:ind w:left="1440" w:hanging="360"/>
       </w:pPr>
     </w:lvl>
-    <w:lvl w:ilvl="2" w:tentative="1">
+    <w:lvl w:ilvl="2" w15:tentative="1">
       <w:start w:val="1"/>
       <w:numFmt w:val="bullet"/>
       <w:lvlText w:val="■"/>
@@ -8850,7 +8854,7 @@
         <w:ind w:left="2160" w:hanging="360"/>
       </w:pPr>
     </w:lvl>
-    <w:lvl w:ilvl="3" w:tentative="1">
+    <w:lvl w:ilvl="3" w15:tentative="1">
       <w:start w:val="1"/>
       <w:numFmt w:val="bullet"/>
       <w:lvlText w:val="●"/>
@@ -8859,7 +8863,7 @@
         <w:ind w:left="2880" w:hanging="360"/>
       </w:pPr>
     </w:lvl>
-    <w:lvl w:ilvl="4" w:tentative="1">
+    <w:lvl w:ilvl="4" w15:tentative="1">
       <w:start w:val="1"/>
       <w:numFmt w:val="bullet"/>
       <w:lvlText w:val="○"/>
@@ -8868,7 +8872,7 @@
         <w:ind w:left="3600" w:hanging="360"/>
       </w:pPr>
     </w:lvl>
-    <w:lvl w:ilvl="5" w:tentative="1">
+    <w:lvl w:ilvl="5" w15:tentative="1">
       <w:start w:val="1"/>
       <w:numFmt w:val="bullet"/>
       <w:lvlText w:val="■"/>
@@ -8877,7 +8881,7 @@
         <w:ind w:left="4320" w:hanging="360"/>
       </w:pPr>
     </w:lvl>
-    <w:lvl w:ilvl="6" w:tentative="1">
+    <w:lvl w:ilvl="6" w15:tentative="1">
       <w:start w:val="1"/>
       <w:numFmt w:val="bullet"/>
       <w:lvlText w:val="●"/>
@@ -8886,7 +8890,7 @@
         <w:ind w:left="5040" w:hanging="360"/>
       </w:pPr>
     </w:lvl>
-    <w:lvl w:ilvl="7" w:tentative="1">
+    <w:lvl w:ilvl="7" w15:tentative="1">
       <w:start w:val="1"/>
       <w:numFmt w:val="bullet"/>
       <w:lvlText w:val="●"/>
@@ -8895,7 +8899,7 @@
         <w:ind w:left="5760" w:hanging="360"/>
       </w:pPr>
     </w:lvl>
-    <w:lvl w:ilvl="8" w:tentative="1">
+    <w:lvl w:ilvl="8" w15:tentative="1">
       <w:start w:val="1"/>
       <w:numFmt w:val="bullet"/>
       <w:lvlText w:val="●"/>
@@ -8907,7 +8911,7 @@
   </w:abstractNum>
   <w:abstractNum w:abstractNumId="2" w15:restartNumberingAfterBreak="0">
     <w:multiLevelType w:val="hybridMultilevel"/>
-    <w:lvl w:ilvl="0" w:tentative="1">
+    <w:lvl w:ilvl="0" w15:tentative="1">
       <w:start w:val="1"/>
       <w:numFmt w:val="decimal"/>
       <w:lvlText w:val="%1."/>
@@ -8919,7 +8923,7 @@
   </w:abstractNum>
   <w:abstractNum w:abstractNumId="3" w15:restartNumberingAfterBreak="0">
     <w:multiLevelType w:val="hybridMultilevel"/>
-    <w:lvl w:ilvl="0" w:tentative="1">
+    <w:lvl w:ilvl="0" w15:tentative="1">
       <w:start w:val="1"/>
       <w:numFmt w:val="decimal"/>
       <w:lvlText w:val="%1."/>
@@ -8936,7 +8940,7 @@
   </w:abstractNum>
   <w:abstractNum w:abstractNumId="4" w15:restartNumberingAfterBreak="0">
     <w:multiLevelType w:val="hybridMultilevel"/>
-    <w:lvl w:ilvl="0" w:tentative="1">
+    <w:lvl w:ilvl="0" w15:tentative="1">
       <w:start w:val="1"/>
       <w:numFmt w:val="decimal"/>
       <w:lvlText w:val="%1."/>
@@ -8948,7 +8952,7 @@
   </w:abstractNum>
   <w:abstractNum w:abstractNumId="5" w15:restartNumberingAfterBreak="0">
     <w:multiLevelType w:val="hybridMultilevel"/>
-    <w:lvl w:ilvl="0" w:tentative="1">
+    <w:lvl w:ilvl="0" w15:tentative="1">
       <w:start w:val="1"/>
       <w:numFmt w:val="bullet"/>
       <w:lvlText w:val="●"/>
@@ -9008,25 +9012,6 @@
     </w:rPrDefault>
     <w:pPrDefault/>
   </w:docDefaults>
-  <w:style w:type="paragraph" w:styleId="Normal" w:default="1">
-    <w:name w:val="Normal"/>
-    <w:qFormat/>
-  </w:style>
-  <w:style w:type="table" w:styleId="TableNormal" w:default="true">
-    <w:name w:val="Normal Table"/>
-    <w:uiPriority w:val="99"/>
-    <w:semiHidden/>
-    <w:unhideWhenUsed/>
-    <w:tblPr>
-      <w:tblInd w:type="dxa" w:w="0"/>
-      <w:tblCellMar>
-        <w:top w:type="dxa" w:w="0"/>
-        <w:left w:type="dxa" w:w="108"/>
-        <w:bottom w:type="dxa" w:w="0"/>
-        <w:right w:type="dxa" w:w="108"/>
-      </w:tblCellMar>
-    </w:tblPr>
-  </w:style>
   <w:style w:type="paragraph" w:styleId="Title">
     <w:name w:val="Title"/>
     <w:basedOn w:val="Normal"/>
@@ -9199,294 +9184,4 @@
     </w:rPr>
   </w:style>
 </w:styles>
-</file>
-
-<file path=word/theme/theme1.xml><?xml version="1.0" encoding="utf-8"?>
-<a:theme xmlns:a="http://schemas.openxmlformats.org/drawingml/2006/main" name="Office Theme">
-  <a:themeElements>
-    <a:clrScheme name="Office">
-      <a:dk1>
-        <a:sysClr val="windowText" lastClr="000000"/>
-      </a:dk1>
-      <a:lt1>
-        <a:sysClr val="window" lastClr="FFFFFF"/>
-      </a:lt1>
-      <a:dk2>
-        <a:srgbClr val="44546A"/>
-      </a:dk2>
-      <a:lt2>
-        <a:srgbClr val="E7E6E6"/>
-      </a:lt2>
-      <a:accent1>
-        <a:srgbClr val="4472C4"/>
-      </a:accent1>
-      <a:accent2>
-        <a:srgbClr val="ED7D31"/>
-      </a:accent2>
-      <a:accent3>
-        <a:srgbClr val="A5A5A5"/>
-      </a:accent3>
-      <a:accent4>
-        <a:srgbClr val="FFC000"/>
-      </a:accent4>
-      <a:accent5>
-        <a:srgbClr val="5B9BD5"/>
-      </a:accent5>
-      <a:accent6>
-        <a:srgbClr val="70AD47"/>
-      </a:accent6>
-      <a:hlink>
-        <a:srgbClr val="0563C1"/>
-      </a:hlink>
-      <a:folHlink>
-        <a:srgbClr val="954F72"/>
-      </a:folHlink>
-    </a:clrScheme>
-    <a:fontScheme name="Office">
-      <a:majorFont>
-        <a:latin typeface="Calibri Light" panose="020F0302020204030204"/>
-        <a:ea typeface=""/>
-        <a:cs typeface=""/>
-        <a:font script="Jpan" typeface="游ゴシック Light"/>
-        <a:font script="Hang" typeface="맑은 고딕"/>
-        <a:font script="Hans" typeface="等线 Light"/>
-        <a:font script="Hant" typeface="新細明體"/>
-        <a:font script="Arab" typeface="Times New Roman"/>
-        <a:font script="Hebr" typeface="Times New Roman"/>
-        <a:font script="Thai" typeface="Angsana New"/>
-        <a:font script="Ethi" typeface="Nyala"/>
-        <a:font script="Beng" typeface="Vrinda"/>
-        <a:font script="Gujr" typeface="Shruti"/>
-        <a:font script="Khmr" typeface="MoolBoran"/>
-        <a:font script="Knda" typeface="Tunga"/>
-        <a:font script="Guru" typeface="Raavi"/>
-        <a:font script="Cans" typeface="Euphemia"/>
-        <a:font script="Cher" typeface="Plantagenet Cherokee"/>
-        <a:font script="Yiii" typeface="Microsoft Yi Baiti"/>
-        <a:font script="Tibt" typeface="Microsoft Himalaya"/>
-        <a:font script="Thaa" typeface="MV Boli"/>
-        <a:font script="Deva" typeface="Mangal"/>
-        <a:font script="Telu" typeface="Gautami"/>
-        <a:font script="Taml" typeface="Latha"/>
-        <a:font script="Syrc" typeface="Estrangelo Edessa"/>
-        <a:font script="Orya" typeface="Kalinga"/>
-        <a:font script="Mlym" typeface="Kartika"/>
-        <a:font script="Laoo" typeface="DokChampa"/>
-        <a:font script="Sinh" typeface="Iskoola Pota"/>
-        <a:font script="Mong" typeface="Mongolian Baiti"/>
-        <a:font script="Viet" typeface="Times New Roman"/>
-        <a:font script="Uigh" typeface="Microsoft Uighur"/>
-        <a:font script="Geor" typeface="Sylfaen"/>
-        <a:font script="Armn" typeface="Arial"/>
-        <a:font script="Bugi" typeface="Leelawadee UI"/>
-        <a:font script="Bopo" typeface="Microsoft JhengHei"/>
-        <a:font script="Java" typeface="Javanese Text"/>
-        <a:font script="Lisu" typeface="Segoe UI"/>
-        <a:font script="Mymr" typeface="Myanmar Text"/>
-        <a:font script="Nkoo" typeface="Ebrima"/>
-        <a:font script="Olck" typeface="Nirmala UI"/>
-        <a:font script="Osma" typeface="Ebrima"/>
-        <a:font script="Phag" typeface="Phagspa"/>
-        <a:font script="Syrn" typeface="Estrangelo Edessa"/>
-        <a:font script="Syrj" typeface="Estrangelo Edessa"/>
-        <a:font script="Syre" typeface="Estrangelo Edessa"/>
-        <a:font script="Sora" typeface="Nirmala UI"/>
-        <a:font script="Tale" typeface="Microsoft Tai Le"/>
-        <a:font script="Talu" typeface="Microsoft New Tai Lue"/>
-        <a:font script="Tfng" typeface="Ebrima"/>
-      </a:majorFont>
-      <a:minorFont>
-        <a:latin typeface="Calibri" panose="020F0502020204030204"/>
-        <a:ea typeface=""/>
-        <a:cs typeface=""/>
-        <a:font script="Jpan" typeface="游明朝"/>
-        <a:font script="Hang" typeface="맑은 고딕"/>
-        <a:font script="Hans" typeface="等线"/>
-        <a:font script="Hant" typeface="新細明體"/>
-        <a:font script="Arab" typeface="Arial"/>
-        <a:font script="Hebr" typeface="Arial"/>
-        <a:font script="Thai" typeface="Cordia New"/>
-        <a:font script="Ethi" typeface="Nyala"/>
-        <a:font script="Beng" typeface="Vrinda"/>
-        <a:font script="Gujr" typeface="Shruti"/>
-        <a:font script="Khmr" typeface="DaunPenh"/>
-        <a:font script="Knda" typeface="Tunga"/>
-        <a:font script="Guru" typeface="Raavi"/>
-        <a:font script="Cans" typeface="Euphemia"/>
-        <a:font script="Cher" typeface="Plantagenet Cherokee"/>
-        <a:font script="Yiii" typeface="Microsoft Yi Baiti"/>
-        <a:font script="Tibt" typeface="Microsoft Himalaya"/>
-        <a:font script="Thaa" typeface="MV Boli"/>
-        <a:font script="Deva" typeface="Mangal"/>
-        <a:font script="Telu" typeface="Gautami"/>
-        <a:font script="Taml" typeface="Latha"/>
-        <a:font script="Syrc" typeface="Estrangelo Edessa"/>
-        <a:font script="Orya" typeface="Kalinga"/>
-        <a:font script="Mlym" typeface="Kartika"/>
-        <a:font script="Laoo" typeface="DokChampa"/>
-        <a:font script="Sinh" typeface="Iskoola Pota"/>
-        <a:font script="Mong" typeface="Mongolian Baiti"/>
-        <a:font script="Viet" typeface="Arial"/>
-        <a:font script="Uigh" typeface="Microsoft Uighur"/>
-        <a:font script="Geor" typeface="Sylfaen"/>
-        <a:font script="Armn" typeface="Arial"/>
-        <a:font script="Bugi" typeface="Leelawadee UI"/>
-        <a:font script="Bopo" typeface="Microsoft JhengHei"/>
-        <a:font script="Java" typeface="Javanese Text"/>
-        <a:font script="Lisu" typeface="Segoe UI"/>
-        <a:font script="Mymr" typeface="Myanmar Text"/>
-        <a:font script="Nkoo" typeface="Ebrima"/>
-        <a:font script="Olck" typeface="Nirmala UI"/>
-        <a:font script="Osma" typeface="Ebrima"/>
-        <a:font script="Phag" typeface="Phagspa"/>
-        <a:font script="Syrn" typeface="Estrangelo Edessa"/>
-        <a:font script="Syrj" typeface="Estrangelo Edessa"/>
-        <a:font script="Syre" typeface="Estrangelo Edessa"/>
-        <a:font script="Sora" typeface="Nirmala UI"/>
-        <a:font script="Tale" typeface="Microsoft Tai Le"/>
-        <a:font script="Talu" typeface="Microsoft New Tai Lue"/>
-        <a:font script="Tfng" typeface="Ebrima"/>
-      </a:minorFont>
-    </a:fontScheme>
-    <a:fmtScheme name="Office">
-      <a:fillStyleLst>
-        <a:solidFill>
-          <a:schemeClr val="phClr"/>
-        </a:solidFill>
-        <a:gradFill rotWithShape="true">
-          <a:gsLst>
-            <a:gs pos="0">
-              <a:schemeClr val="phClr">
-                <a:lumMod val="110000"/>
-                <a:satMod val="105000"/>
-                <a:tint val="67000"/>
-              </a:schemeClr>
-            </a:gs>
-            <a:gs pos="50000">
-              <a:schemeClr val="phClr">
-                <a:lumMod val="105000"/>
-                <a:satMod val="103000"/>
-                <a:tint val="73000"/>
-              </a:schemeClr>
-            </a:gs>
-            <a:gs pos="100000">
-              <a:schemeClr val="phClr">
-                <a:lumMod val="105000"/>
-                <a:satMod val="109000"/>
-                <a:tint val="81000"/>
-              </a:schemeClr>
-            </a:gs>
-          </a:gsLst>
-          <a:lin ang="5400000" scaled="false"/>
-        </a:gradFill>
-        <a:gradFill rotWithShape="true">
-          <a:gsLst>
-            <a:gs pos="0">
-              <a:schemeClr val="phClr">
-                <a:satMod val="103000"/>
-                <a:lumMod val="102000"/>
-                <a:tint val="94000"/>
-              </a:schemeClr>
-            </a:gs>
-            <a:gs pos="50000">
-              <a:schemeClr val="phClr">
-                <a:satMod val="110000"/>
-                <a:lumMod val="100000"/>
-                <a:shade val="100000"/>
-              </a:schemeClr>
-            </a:gs>
-            <a:gs pos="100000">
-              <a:schemeClr val="phClr">
-                <a:lumMod val="99000"/>
-                <a:satMod val="120000"/>
-                <a:shade val="78000"/>
-              </a:schemeClr>
-            </a:gs>
-          </a:gsLst>
-          <a:lin ang="5400000" scaled="false"/>
-        </a:gradFill>
-      </a:fillStyleLst>
-      <a:lnStyleLst>
-        <a:ln w="6350" cap="flat" cmpd="sng" algn="ctr">
-          <a:solidFill>
-            <a:schemeClr val="phClr"/>
-          </a:solidFill>
-          <a:prstDash val="solid"/>
-          <a:miter lim="800000"/>
-        </a:ln>
-        <a:ln w="12700" cap="flat" cmpd="sng" algn="ctr">
-          <a:solidFill>
-            <a:schemeClr val="phClr"/>
-          </a:solidFill>
-          <a:prstDash val="solid"/>
-          <a:miter lim="800000"/>
-        </a:ln>
-        <a:ln w="19050" cap="flat" cmpd="sng" algn="ctr">
-          <a:solidFill>
-            <a:schemeClr val="phClr"/>
-          </a:solidFill>
-          <a:prstDash val="solid"/>
-          <a:miter lim="800000"/>
-        </a:ln>
-      </a:lnStyleLst>
-      <a:effectStyleLst>
-        <a:effectStyle>
-          <a:effectLst/>
-        </a:effectStyle>
-        <a:effectStyle>
-          <a:effectLst/>
-        </a:effectStyle>
-        <a:effectStyle>
-          <a:effectLst>
-            <a:outerShdw blurRad="57150" dist="19050" dir="5400000" algn="ctr" rotWithShape="false">
-              <a:srgbClr val="000000">
-                <a:alpha val="63000"/>
-              </a:srgbClr>
-            </a:outerShdw>
-          </a:effectLst>
-        </a:effectStyle>
-      </a:effectStyleLst>
-      <a:bgFillStyleLst>
-        <a:solidFill>
-          <a:schemeClr val="phClr"/>
-        </a:solidFill>
-        <a:solidFill>
-          <a:schemeClr val="phClr">
-            <a:tint val="95000"/>
-            <a:satMod val="170000"/>
-          </a:schemeClr>
-        </a:solidFill>
-        <a:gradFill rotWithShape="true">
-          <a:gsLst>
-            <a:gs pos="0">
-              <a:schemeClr val="phClr">
-                <a:tint val="93000"/>
-                <a:satMod val="150000"/>
-                <a:shade val="98000"/>
-                <a:lumMod val="102000"/>
-              </a:schemeClr>
-            </a:gs>
-            <a:gs pos="50000">
-              <a:schemeClr val="phClr">
-                <a:tint val="98000"/>
-                <a:satMod val="130000"/>
-                <a:shade val="90000"/>
-                <a:lumMod val="103000"/>
-              </a:schemeClr>
-            </a:gs>
-            <a:gs pos="100000">
-              <a:schemeClr val="phClr">
-                <a:shade val="63000"/>
-                <a:satMod val="120000"/>
-              </a:schemeClr>
-            </a:gs>
-          </a:gsLst>
-          <a:lin ang="5400000" scaled="false"/>
-        </a:gradFill>
-      </a:bgFillStyleLst>
-    </a:fmtScheme>
-  </a:themeElements>
-  <a:objectDefaults/>
-  <a:extraClrSchemeLst/>
-</a:theme>
 </file>
</xml_diff>

<commit_message>
Path planning jadi pre-defined map by index (usulan dosen): charter, docx, deck, naskah
Peta grid 4x4 berindeks 1-16 ditentukan di awal; aksi per indeks lewat blok
+ rute terpendek otomatis (BFS). Robot tidak menjelajah.

Co-Authored-By: Claude Opus 5.5 <noreply@anthropic.com>
Claude-Session: https://claude.ai/code/session_0155yf5wpAX58VAfqTZWuQQK
</commit_message>
<xml_diff>
--- a/docs/Project_Charter_PJBL.docx
+++ b/docs/Project_Charter_PJBL.docx
@@ -242,7 +242,7 @@
                 <w:sz w:val="24"/>
                 <w:szCs w:val="24"/>
               </w:rPr>
-              <w:t xml:space="preserve">Robot line tracer edukasi untuk anak sekolah, hasil reverse engineering kit Ichiduino Pro, yang mampu mengikuti garis secara otomatis dan merencanakan rute terpendek (path planning) pada lintasan bercabang. Berbasis ESP32, dapat diprogram dengan block coding berbasis web, dan dibangun dengan anggaran maksimal Rp 900.000.</w:t>
+              <w:t xml:space="preserve">Robot line tracer edukasi untuk anak sekolah, hasil reverse engineering kit Ichiduino Pro, yang mampu mengikuti garis secara otomatis dan menjalankan path planning pada lintasan grid yang petanya ditentukan di awal (pre-defined map by index). Berbasis ESP32, dapat diprogram dengan block coding berbasis web, dan dibangun dengan anggaran maksimal Rp 900.000.</w:t>
             </w:r>
           </w:p>
         </w:tc>
@@ -645,7 +645,7 @@
                 <w:sz w:val="24"/>
                 <w:szCs w:val="24"/>
               </w:rPr>
-              <w:t xml:space="preserve">Proyek ini melakukan reverse engineering terhadap Ichiduino Pro: fungsi dan arsitekturnya dianalisis, lalu dirancang ulang dari nol dengan anggaran maksimal Rp 900.000. Fitur yang dipertahankan, diganti, atau ditiadakan dipilih berdasarkan kebutuhan edukasi dan batas anggaran. Selain mengikuti garis, robot memiliki kemampuan path planning, yaitu memetakan lintasan bercabang dan menentukan rute terpendek menuju titik tujuan, sehingga pengguna dapat belajar konsep algoritma dan navigasi melalui block coding berbasis web tanpa instalasi.</w:t>
+              <w:t xml:space="preserve">Proyek ini melakukan reverse engineering terhadap Ichiduino Pro: fungsi dan arsitekturnya dianalisis, lalu dirancang ulang dari nol dengan anggaran maksimal Rp 900.000. Fitur yang dipertahankan, diganti, atau ditiadakan dipilih berdasarkan kebutuhan edukasi dan batas anggaran. Selain mengikuti garis, robot memiliki kemampuan path planning dengan peta lintasan yang ditentukan di awal (pre-defined map by index): setiap persimpangan grid diberi nomor indeks, lalu rute disusun sebagai aksi per indeks atau dihitung otomatis sebagai rute terpendek menuju titik tujuan, sehingga pengguna dapat belajar konsep algoritma dan navigasi melalui block coding berbasis web tanpa instalasi.</w:t>
             </w:r>
           </w:p>
         </w:tc>
@@ -797,7 +797,7 @@
                 <w:sz w:val="24"/>
                 <w:szCs w:val="24"/>
               </w:rPr>
-              <w:t xml:space="preserve">Menerapkan path planning: robot mendeteksi persimpangan, menyimpan peta lintasan sebagai graf, serta menghitung dan menjalankan rute terpendek menuju titik tujuan.</w:t>
+              <w:t xml:space="preserve">Menerapkan path planning dengan peta lintasan yang ditentukan di awal (pre-defined map by index): setiap persimpangan grid diberi nomor indeks, robot menghitung persimpangan yang dilewati dan menjalankan aksi tiap indeks (belok kiri, belok kanan, lurus, berhenti), baik dari rute yang disusun pengguna maupun rute terpendek yang dihitung otomatis dari peta.</w:t>
             </w:r>
           </w:p>
           <w:p>
@@ -835,7 +835,7 @@
                 <w:sz w:val="24"/>
                 <w:szCs w:val="24"/>
               </w:rPr>
-              <w:t xml:space="preserve">Mengembangkan platform block coding berbasis web (Blockly), termasuk blok navigasi menuju titik tujuan.</w:t>
+              <w:t xml:space="preserve">Mengembangkan platform block coding berbasis web (Blockly), termasuk blok aksi per indeks dan blok rute terpendek menuju titik tujuan.</w:t>
             </w:r>
           </w:p>
           <w:p>
@@ -1044,7 +1044,7 @@
                 <w:sz w:val="24"/>
                 <w:szCs w:val="24"/>
               </w:rPr>
-              <w:t xml:space="preserve">Path planning: pemetaan lintasan bercabang dan pencarian rute terpendek ke titik tujuan</w:t>
+              <w:t xml:space="preserve">Path planning: peta grid yang ditentukan di awal (indeks persimpangan), rute berupa aksi per indeks atau rute terpendek otomatis ke titik tujuan</w:t>
             </w:r>
           </w:p>
           <w:p>
@@ -2100,15 +2100,15 @@
                 <w:sz w:val="24"/>
                 <w:szCs w:val="24"/>
               </w:rPr>
-              <w:t xml:space="preserve">Path planning menghasilkan rute terpendek pada 10 dari 10 percobaan.</w:t>
-            </w:r>
-            <w:r>
-              <w:rPr>
-                <w:rFonts w:ascii="Times New Roman" w:cs="Times New Roman" w:eastAsia="Times New Roman" w:hAnsi="Times New Roman"/>
-                <w:sz w:val="24"/>
-                <w:szCs w:val="24"/>
-              </w:rPr>
-              <w:t xml:space="preserve"> Diuji pada 10 pasang titik awal dan tujuan yang berbeda; rute yang dipilih robot dibandingkan dengan rute terpendek hasil hitung manual. Alat ukur: log serial.</w:t>
+              <w:t xml:space="preserve">Path planning dengan peta indeks benar pada 10 dari 10 percobaan.</w:t>
+            </w:r>
+            <w:r>
+              <w:rPr>
+                <w:rFonts w:ascii="Times New Roman" w:cs="Times New Roman" w:eastAsia="Times New Roman" w:hAnsi="Times New Roman"/>
+                <w:sz w:val="24"/>
+                <w:szCs w:val="24"/>
+              </w:rPr>
+              <w:t xml:space="preserve"> Diuji pada 10 pasang titik awal dan tujuan yang berbeda; robot harus menjalankan seluruh aksi indeks tanpa salah belok, dan rute yang dihitung otomatis dibandingkan dengan rute terpendek hasil hitung manual. Alat ukur: log serial dan video.</w:t>
             </w:r>
           </w:p>
           <w:p>

</xml_diff>

<commit_message>
Path planning: indeks = langkah rute (pola sensor → aksi → ikuti garis), sesuai blok Ichiduino
Co-Authored-By: Claude Opus 5.5 <noreply@anthropic.com>
Claude-Session: https://claude.ai/code/session_0155yf5wpAX58VAfqTZWuQQK
</commit_message>
<xml_diff>
--- a/docs/Project_Charter_PJBL.docx
+++ b/docs/Project_Charter_PJBL.docx
@@ -242,7 +242,7 @@
                 <w:sz w:val="24"/>
                 <w:szCs w:val="24"/>
               </w:rPr>
-              <w:t xml:space="preserve">Robot line tracer edukasi untuk anak sekolah, hasil reverse engineering kit Ichiduino Pro, yang mampu mengikuti garis secara otomatis dan menjalankan path planning pada lintasan grid yang petanya ditentukan di awal (pre-defined map by index). Berbasis ESP32, dapat diprogram dengan block coding berbasis web, dan dibangun dengan anggaran maksimal Rp 900.000.</w:t>
+              <w:t xml:space="preserve">Robot line tracer edukasi untuk anak sekolah, hasil reverse engineering kit Ichiduino Pro, yang mampu mengikuti garis secara otomatis dan menjalankan path planning dengan peta yang ditentukan di awal (pre-defined map by index). Berbasis ESP32, dapat diprogram dengan block coding berbasis web, dan dibangun dengan anggaran maksimal Rp 900.000.</w:t>
             </w:r>
           </w:p>
         </w:tc>
@@ -645,7 +645,7 @@
                 <w:sz w:val="24"/>
                 <w:szCs w:val="24"/>
               </w:rPr>
-              <w:t xml:space="preserve">Proyek ini melakukan reverse engineering terhadap Ichiduino Pro: fungsi dan arsitekturnya dianalisis, lalu dirancang ulang dari nol dengan anggaran maksimal Rp 900.000. Fitur yang dipertahankan, diganti, atau ditiadakan dipilih berdasarkan kebutuhan edukasi dan batas anggaran. Selain mengikuti garis, robot memiliki kemampuan path planning dengan peta lintasan yang ditentukan di awal (pre-defined map by index): setiap persimpangan grid diberi nomor indeks, lalu rute disusun sebagai aksi per indeks atau dihitung otomatis sebagai rute terpendek menuju titik tujuan, sehingga pengguna dapat belajar konsep algoritma dan navigasi melalui block coding berbasis web tanpa instalasi.</w:t>
+              <w:t xml:space="preserve">Proyek ini melakukan reverse engineering terhadap Ichiduino Pro: fungsi dan arsitekturnya dianalisis, lalu dirancang ulang dari nol dengan anggaran maksimal Rp 900.000. Fitur yang dipertahankan, diganti, atau ditiadakan dipilih berdasarkan kebutuhan edukasi dan batas anggaran. Selain mengikuti garis, robot memiliki kemampuan path planning dengan peta yang ditentukan di awal (pre-defined map by index): rute dituliskan sebagai urutan indeks, dan tiap indeks berisi pola sensor pemicu (misalnya persimpangan kiri, kanan, atau perempatan), aksi (maju, belok kiri, belok kanan), dan perintah mengikuti garis berikutnya. Pada lintasan grid, urutan indeks dapat dibuat otomatis dari rute terpendek menuju titik tujuan, sehingga pengguna dapat belajar konsep algoritma dan navigasi melalui block coding berbasis web tanpa instalasi.</w:t>
             </w:r>
           </w:p>
         </w:tc>
@@ -797,7 +797,7 @@
                 <w:sz w:val="24"/>
                 <w:szCs w:val="24"/>
               </w:rPr>
-              <w:t xml:space="preserve">Menerapkan path planning dengan peta lintasan yang ditentukan di awal (pre-defined map by index): setiap persimpangan grid diberi nomor indeks, robot menghitung persimpangan yang dilewati dan menjalankan aksi tiap indeks (belok kiri, belok kanan, lurus, berhenti), baik dari rute yang disusun pengguna maupun rute terpendek yang dihitung otomatis dari peta.</w:t>
+              <w:t xml:space="preserve">Menerapkan path planning dengan peta yang ditentukan di awal (pre-defined map by index): rute dituliskan sebagai urutan indeks; pada tiap indeks robot menunggu pola sensor pemicu, menjalankan aksi (maju, belok kiri, belok kanan, berhenti) dengan jarak dan sudut dari encoder, lalu kembali mengikuti garis. Pada lintasan grid, urutan indeks dapat dihitung otomatis sebagai rute terpendek menuju titik tujuan.</w:t>
             </w:r>
           </w:p>
           <w:p>
@@ -1044,7 +1044,7 @@
                 <w:sz w:val="24"/>
                 <w:szCs w:val="24"/>
               </w:rPr>
-              <w:t xml:space="preserve">Path planning: peta grid yang ditentukan di awal (indeks persimpangan), rute berupa aksi per indeks atau rute terpendek otomatis ke titik tujuan</w:t>
+              <w:t xml:space="preserve">Path planning: peta by index (urutan langkah pola sensor → aksi → ikuti garis) dan pembuatan urutan indeks otomatis dari rute terpendek pada lintasan grid</w:t>
             </w:r>
           </w:p>
           <w:p>

</xml_diff>

<commit_message>
Batas RAB jadi Rp1.000.000: charter + docx, deck (slide 3, 6, 13), naskah, README, CLAUDE.md
RAB Rp902.000 tetap, sekarang sisa Rp98.000.

Co-Authored-By: Claude Opus 5.5 <noreply@anthropic.com>
Claude-Session: https://claude.ai/code/session_0155yf5wpAX58VAfqTZWuQQK
</commit_message>
<xml_diff>
--- a/docs/Project_Charter_PJBL.docx
+++ b/docs/Project_Charter_PJBL.docx
@@ -242,7 +242,7 @@
                 <w:sz w:val="24"/>
                 <w:szCs w:val="24"/>
               </w:rPr>
-              <w:t xml:space="preserve">Robot line tracer edukasi untuk anak sekolah, hasil reverse engineering kit Ichiduino Pro, yang mampu mengikuti garis secara otomatis dan menjalankan path planning dengan peta yang ditentukan di awal (pre-defined map by index). Berbasis ESP32, dapat diprogram dengan block coding berbasis web, dan dibangun dengan anggaran maksimal Rp 900.000.</w:t>
+              <w:t xml:space="preserve">Robot line tracer edukasi untuk anak sekolah, hasil reverse engineering kit Ichiduino Pro, yang mampu mengikuti garis secara otomatis dan menjalankan path planning dengan peta yang ditentukan di awal (pre-defined map by index). Berbasis ESP32, dapat diprogram dengan block coding berbasis web, dan dibangun dengan anggaran maksimal Rp 1.000.000.</w:t>
             </w:r>
           </w:p>
         </w:tc>
@@ -645,7 +645,7 @@
                 <w:sz w:val="24"/>
                 <w:szCs w:val="24"/>
               </w:rPr>
-              <w:t xml:space="preserve">Proyek ini melakukan reverse engineering terhadap Ichiduino Pro: fungsi dan arsitekturnya dianalisis, lalu dirancang ulang dari nol dengan anggaran maksimal Rp 900.000. Fitur yang dipertahankan, diganti, atau ditiadakan dipilih berdasarkan kebutuhan edukasi dan batas anggaran. Selain mengikuti garis, robot memiliki kemampuan path planning dengan peta yang ditentukan di awal (pre-defined map by index): rute dituliskan sebagai urutan indeks, dan tiap indeks berisi pola sensor pemicu (misalnya persimpangan kiri, kanan, atau perempatan), aksi (maju, belok kiri, belok kanan), dan perintah mengikuti garis berikutnya. Pada lintasan grid, urutan indeks dapat dibuat otomatis dari rute terpendek menuju titik tujuan, sehingga pengguna dapat belajar konsep algoritma dan navigasi melalui block coding berbasis web tanpa instalasi.</w:t>
+              <w:t xml:space="preserve">Proyek ini melakukan reverse engineering terhadap Ichiduino Pro: fungsi dan arsitekturnya dianalisis, lalu dirancang ulang dari nol dengan anggaran maksimal Rp 1.000.000. Fitur yang dipertahankan, diganti, atau ditiadakan dipilih berdasarkan kebutuhan edukasi dan batas anggaran. Selain mengikuti garis, robot memiliki kemampuan path planning dengan peta yang ditentukan di awal (pre-defined map by index): rute dituliskan sebagai urutan indeks, dan tiap indeks berisi pola sensor pemicu (misalnya persimpangan kiri, kanan, atau perempatan), aksi (maju, belok kiri, belok kanan), dan perintah mengikuti garis berikutnya. Pada lintasan grid, urutan indeks dapat dibuat otomatis dari rute terpendek menuju titik tujuan, sehingga pengguna dapat belajar konsep algoritma dan navigasi melalui block coding berbasis web tanpa instalasi.</w:t>
             </w:r>
           </w:p>
         </w:tc>
@@ -759,7 +759,7 @@
                 <w:sz w:val="24"/>
                 <w:szCs w:val="24"/>
               </w:rPr>
-              <w:t xml:space="preserve">Melakukan reverse engineering kit Ichiduino Pro dan merancang ulang robot line tracer edukasi berbasis ESP32 dengan anggaran maksimal Rp 900.000.</w:t>
+              <w:t xml:space="preserve">Melakukan reverse engineering kit Ichiduino Pro dan merancang ulang robot line tracer edukasi berbasis ESP32 dengan anggaran maksimal Rp 1.000.000.</w:t>
             </w:r>
           </w:p>
           <w:p>
@@ -2216,7 +2216,7 @@
                 <w:sz w:val="24"/>
                 <w:szCs w:val="24"/>
               </w:rPr>
-              <w:t xml:space="preserve">Total biaya proyek ≤ Rp 900.000.</w:t>
+              <w:t xml:space="preserve">Total biaya proyek ≤ Rp 1.000.000.</w:t>
             </w:r>
             <w:r>
               <w:rPr>

</xml_diff>

<commit_message>
RAB jadi Rp887.000: mux CD74HC4067M SOP-24 Rp20.000 dari WKH Electronic (charter + docx, deck, naskah)
Toko lokal lain hanya punya versi SSOP yang tidak lolos aturan cetak; versi SOP-24 cocok dengan footprint
SOIC-24W, jadi PCB sensor tidak berubah. Subtotal lampiran A deck dibetulkan.

Co-Authored-By: Claude Opus 5.5 <noreply@anthropic.com>
Claude-Session: https://claude.ai/code/session_0155yf5wpAX58VAfqTZWuQQK
</commit_message>
<xml_diff>
--- a/docs/Project_Charter_PJBL.docx
+++ b/docs/Project_Charter_PJBL.docx
@@ -4466,7 +4466,7 @@
                 <w:sz w:val="20"/>
                 <w:szCs w:val="20"/>
               </w:rPr>
-              <w:t xml:space="preserve">IC multiplexer analog CD74HC4067 SOIC-24, 16 kanal</w:t>
+              <w:t xml:space="preserve">IC multiplexer analog CD74HC4067M SOP-24 (SOIC), 16 kanal, WKH Electronic (tanpa cadangan)</w:t>
             </w:r>
           </w:p>
         </w:tc>
@@ -4498,7 +4498,7 @@
                 <w:sz w:val="20"/>
                 <w:szCs w:val="20"/>
               </w:rPr>
-              <w:t xml:space="preserve">Rp35.000</w:t>
+              <w:t xml:space="preserve">Rp20.000</w:t>
             </w:r>
           </w:p>
         </w:tc>
@@ -4594,7 +4594,7 @@
                 <w:sz w:val="20"/>
                 <w:szCs w:val="20"/>
               </w:rPr>
-              <w:t xml:space="preserve">Rp35.000</w:t>
+              <w:t xml:space="preserve">Rp20.000</w:t>
             </w:r>
           </w:p>
         </w:tc>
@@ -7306,7 +7306,7 @@
                 <w:sz w:val="20"/>
                 <w:szCs w:val="20"/>
               </w:rPr>
-              <w:t xml:space="preserve">Rp847.000</w:t>
+              <w:t xml:space="preserve">Rp832.000</w:t>
             </w:r>
           </w:p>
         </w:tc>
@@ -8340,7 +8340,7 @@
                 <w:sz w:val="24"/>
                 <w:szCs w:val="24"/>
               </w:rPr>
-              <w:t xml:space="preserve">Rp902.000</w:t>
+              <w:t xml:space="preserve">Rp887.000</w:t>
             </w:r>
           </w:p>
         </w:tc>

</xml_diff>

<commit_message>
RAB jadi Rp937.390: harga hasil validasi marketplace dari spreadsheet kelompok (charter + docx, deck, naskah)
Sumber: RAB PJBL P01.ods. Electrical Rp862.390 + Mechanical Rp50.000 + Lain-lain (timah + flux)
Rp25.000, sisa Rp62.610 dari Rp1.000.000. Keputusan user: mux tetap IC CD74HC4067M WKH Rp20.000
(baris spreadsheet ternyata modul kakarobot Rp35.000), ball caster ganti skid nilon, bracket motor
dihapus, resistor THT masuk komponen pendukung, PCB utama nanti ikut barang di link (tombol 12x12 mm,
JST XH 6 pin untuk motor). Charter dapat tabel tautan toko. Deck diubah langsung di XML .pptx
(slide 4, 5, 12, 13, 14, 16, lampiran A-C, grafik, catatan); build.js disamakan.

Co-Authored-By: Claude Opus 5.5 <noreply@anthropic.com>
</commit_message>
<xml_diff>
--- a/docs/Project_Charter_PJBL.docx
+++ b/docs/Project_Charter_PJBL.docx
@@ -587,7 +587,7 @@
       </w:tr>
       <w:tr>
         <w:trPr>
-          <w:cantSplit w:val="false"/>
+          <w:cantSplit w:val="off"/>
         </w:trPr>
         <w:tc>
           <w:tcPr>
@@ -724,7 +724,7 @@
       </w:tr>
       <w:tr>
         <w:trPr>
-          <w:cantSplit w:val="false"/>
+          <w:cantSplit w:val="off"/>
         </w:trPr>
         <w:tc>
           <w:tcPr>
@@ -933,7 +933,7 @@
       </w:tr>
       <w:tr>
         <w:trPr>
-          <w:cantSplit w:val="false"/>
+          <w:cantSplit w:val="off"/>
         </w:trPr>
         <w:tc>
           <w:tcPr>
@@ -1947,7 +1947,7 @@
       </w:tr>
       <w:tr>
         <w:trPr>
-          <w:cantSplit w:val="false"/>
+          <w:cantSplit w:val="off"/>
         </w:trPr>
         <w:tc>
           <w:tcPr>
@@ -3756,7 +3756,7 @@
       <w:tr>
         <w:trPr>
           <w:cantSplit/>
-          <w:tblHeader w:val="false"/>
+          <w:tblHeader w:val="off"/>
         </w:trPr>
         <w:tc>
           <w:tcPr>
@@ -4003,7 +4003,7 @@
                 <w:sz w:val="20"/>
                 <w:szCs w:val="20"/>
               </w:rPr>
-              <w:t xml:space="preserve">Rp76.000</w:t>
+              <w:t xml:space="preserve">Rp65.900</w:t>
             </w:r>
           </w:p>
         </w:tc>
@@ -4099,7 +4099,7 @@
                 <w:sz w:val="20"/>
                 <w:szCs w:val="20"/>
               </w:rPr>
-              <w:t xml:space="preserve">Rp76.000</w:t>
+              <w:t xml:space="preserve">Rp65.900</w:t>
             </w:r>
           </w:p>
         </w:tc>
@@ -4168,7 +4168,7 @@
                 <w:sz w:val="20"/>
                 <w:szCs w:val="20"/>
               </w:rPr>
-              <w:t xml:space="preserve">Rp33.000</w:t>
+              <w:t xml:space="preserve">Rp36.500</w:t>
             </w:r>
           </w:p>
         </w:tc>
@@ -4264,7 +4264,7 @@
                 <w:sz w:val="20"/>
                 <w:szCs w:val="20"/>
               </w:rPr>
-              <w:t xml:space="preserve">Rp33.000</w:t>
+              <w:t xml:space="preserve">Rp36.500</w:t>
             </w:r>
           </w:p>
         </w:tc>
@@ -4301,7 +4301,7 @@
                 <w:sz w:val="20"/>
                 <w:szCs w:val="20"/>
               </w:rPr>
-              <w:t xml:space="preserve">Sensor reflektif QRE1113GR SMD, toko lokal (tanpa cadangan)</w:t>
+              <w:t xml:space="preserve">Sensor reflektif QRE1113GR SMD (tanpa cadangan)</w:t>
             </w:r>
           </w:p>
         </w:tc>
@@ -4663,7 +4663,7 @@
                 <w:sz w:val="20"/>
                 <w:szCs w:val="20"/>
               </w:rPr>
-              <w:t xml:space="preserve">Rp25.000</w:t>
+              <w:t xml:space="preserve">Rp50.000</w:t>
             </w:r>
           </w:p>
         </w:tc>
@@ -4759,7 +4759,7 @@
                 <w:sz w:val="20"/>
                 <w:szCs w:val="20"/>
               </w:rPr>
-              <w:t xml:space="preserve">Rp25.000</w:t>
+              <w:t xml:space="preserve">Rp50.000</w:t>
             </w:r>
           </w:p>
         </w:tc>
@@ -4961,7 +4961,7 @@
                 <w:sz w:val="20"/>
                 <w:szCs w:val="20"/>
               </w:rPr>
-              <w:t xml:space="preserve">Push button</w:t>
+              <w:t xml:space="preserve">Push button tactile 12×12 mm</w:t>
             </w:r>
           </w:p>
         </w:tc>
@@ -5025,7 +5025,7 @@
                 <w:sz w:val="20"/>
                 <w:szCs w:val="20"/>
               </w:rPr>
-              <w:t xml:space="preserve">4</w:t>
+              <w:t xml:space="preserve">3</w:t>
             </w:r>
           </w:p>
         </w:tc>
@@ -5089,7 +5089,7 @@
                 <w:sz w:val="20"/>
                 <w:szCs w:val="20"/>
               </w:rPr>
-              <w:t xml:space="preserve">Rp4.000</w:t>
+              <w:t xml:space="preserve">Rp3.000</w:t>
             </w:r>
           </w:p>
         </w:tc>
@@ -5291,7 +5291,7 @@
                 <w:sz w:val="20"/>
                 <w:szCs w:val="20"/>
               </w:rPr>
-              <w:t xml:space="preserve">Resistor 10 kΩ</w:t>
+              <w:t xml:space="preserve">Buzzer aktif 12 × 9,5 mm</w:t>
             </w:r>
           </w:p>
         </w:tc>
@@ -5323,7 +5323,7 @@
                 <w:sz w:val="20"/>
                 <w:szCs w:val="20"/>
               </w:rPr>
-              <w:t xml:space="preserve">Rp200</w:t>
+              <w:t xml:space="preserve">Rp3.000</w:t>
             </w:r>
           </w:p>
         </w:tc>
@@ -5355,7 +5355,7 @@
                 <w:sz w:val="20"/>
                 <w:szCs w:val="20"/>
               </w:rPr>
-              <w:t xml:space="preserve">10</w:t>
+              <w:t xml:space="preserve">1</w:t>
             </w:r>
           </w:p>
         </w:tc>
@@ -5419,7 +5419,7 @@
                 <w:sz w:val="20"/>
                 <w:szCs w:val="20"/>
               </w:rPr>
-              <w:t xml:space="preserve">Rp2.000</w:t>
+              <w:t xml:space="preserve">Rp3.000</w:t>
             </w:r>
           </w:p>
         </w:tc>
@@ -5456,7 +5456,7 @@
                 <w:sz w:val="20"/>
                 <w:szCs w:val="20"/>
               </w:rPr>
-              <w:t xml:space="preserve">Buzzer</w:t>
+              <w:t xml:space="preserve">Baterai Li-ion 18650 3000 mAh (1 paket isi 2)</w:t>
             </w:r>
           </w:p>
         </w:tc>
@@ -5488,7 +5488,7 @@
                 <w:sz w:val="20"/>
                 <w:szCs w:val="20"/>
               </w:rPr>
-              <w:t xml:space="preserve">Rp3.000</w:t>
+              <w:t xml:space="preserve">Rp94.990</w:t>
             </w:r>
           </w:p>
         </w:tc>
@@ -5552,7 +5552,7 @@
                 <w:sz w:val="20"/>
                 <w:szCs w:val="20"/>
               </w:rPr>
-              <w:t xml:space="preserve">pcs</w:t>
+              <w:t xml:space="preserve">paket</w:t>
             </w:r>
           </w:p>
         </w:tc>
@@ -5584,7 +5584,7 @@
                 <w:sz w:val="20"/>
                 <w:szCs w:val="20"/>
               </w:rPr>
-              <w:t xml:space="preserve">Rp3.000</w:t>
+              <w:t xml:space="preserve">Rp94.990</w:t>
             </w:r>
           </w:p>
         </w:tc>
@@ -5621,7 +5621,7 @@
                 <w:sz w:val="20"/>
                 <w:szCs w:val="20"/>
               </w:rPr>
-              <w:t xml:space="preserve">Baterai Li-ion 18650</w:t>
+              <w:t xml:space="preserve">Holder baterai 2× 18650 (seri)</w:t>
             </w:r>
           </w:p>
         </w:tc>
@@ -5653,7 +5653,7 @@
                 <w:sz w:val="20"/>
                 <w:szCs w:val="20"/>
               </w:rPr>
-              <w:t xml:space="preserve">Rp40.000</w:t>
+              <w:t xml:space="preserve">Rp8.000</w:t>
             </w:r>
           </w:p>
         </w:tc>
@@ -5685,7 +5685,7 @@
                 <w:sz w:val="20"/>
                 <w:szCs w:val="20"/>
               </w:rPr>
-              <w:t xml:space="preserve">2</w:t>
+              <w:t xml:space="preserve">1</w:t>
             </w:r>
           </w:p>
         </w:tc>
@@ -5749,7 +5749,7 @@
                 <w:sz w:val="20"/>
                 <w:szCs w:val="20"/>
               </w:rPr>
-              <w:t xml:space="preserve">Rp80.000</w:t>
+              <w:t xml:space="preserve">Rp8.000</w:t>
             </w:r>
           </w:p>
         </w:tc>
@@ -5786,7 +5786,7 @@
                 <w:sz w:val="20"/>
                 <w:szCs w:val="20"/>
               </w:rPr>
-              <w:t xml:space="preserve">Holder baterai 2× 18650 (seri)</w:t>
+              <w:t xml:space="preserve">Modul BMS 2S</w:t>
             </w:r>
           </w:p>
         </w:tc>
@@ -5818,7 +5818,7 @@
                 <w:sz w:val="20"/>
                 <w:szCs w:val="20"/>
               </w:rPr>
-              <w:t xml:space="preserve">Rp8.000</w:t>
+              <w:t xml:space="preserve">Rp10.000</w:t>
             </w:r>
           </w:p>
         </w:tc>
@@ -5914,7 +5914,7 @@
                 <w:sz w:val="20"/>
                 <w:szCs w:val="20"/>
               </w:rPr>
-              <w:t xml:space="preserve">Rp8.000</w:t>
+              <w:t xml:space="preserve">Rp10.000</w:t>
             </w:r>
           </w:p>
         </w:tc>
@@ -5951,7 +5951,7 @@
                 <w:sz w:val="20"/>
                 <w:szCs w:val="20"/>
               </w:rPr>
-              <w:t xml:space="preserve">Modul BMS 2S</w:t>
+              <w:t xml:space="preserve">Modul charger 2S USB-C</w:t>
             </w:r>
           </w:p>
         </w:tc>
@@ -5983,7 +5983,7 @@
                 <w:sz w:val="20"/>
                 <w:szCs w:val="20"/>
               </w:rPr>
-              <w:t xml:space="preserve">Rp10.000</w:t>
+              <w:t xml:space="preserve">Rp25.000</w:t>
             </w:r>
           </w:p>
         </w:tc>
@@ -6079,7 +6079,7 @@
                 <w:sz w:val="20"/>
                 <w:szCs w:val="20"/>
               </w:rPr>
-              <w:t xml:space="preserve">Rp10.000</w:t>
+              <w:t xml:space="preserve">Rp25.000</w:t>
             </w:r>
           </w:p>
         </w:tc>
@@ -6116,7 +6116,7 @@
                 <w:sz w:val="20"/>
                 <w:szCs w:val="20"/>
               </w:rPr>
-              <w:t xml:space="preserve">Modul charger 2S USB-C</w:t>
+              <w:t xml:space="preserve">Modul buck converter 5 V (MP1584)</w:t>
             </w:r>
           </w:p>
         </w:tc>
@@ -6148,7 +6148,7 @@
                 <w:sz w:val="20"/>
                 <w:szCs w:val="20"/>
               </w:rPr>
-              <w:t xml:space="preserve">Rp25.000</w:t>
+              <w:t xml:space="preserve">Rp10.000</w:t>
             </w:r>
           </w:p>
         </w:tc>
@@ -6244,7 +6244,7 @@
                 <w:sz w:val="20"/>
                 <w:szCs w:val="20"/>
               </w:rPr>
-              <w:t xml:space="preserve">Rp25.000</w:t>
+              <w:t xml:space="preserve">Rp10.000</w:t>
             </w:r>
           </w:p>
         </w:tc>
@@ -6281,7 +6281,7 @@
                 <w:sz w:val="20"/>
                 <w:szCs w:val="20"/>
               </w:rPr>
-              <w:t xml:space="preserve">Modul buck converter 5 V (MP1584)</w:t>
+              <w:t xml:space="preserve">Saklar on/off</w:t>
             </w:r>
           </w:p>
         </w:tc>
@@ -6313,7 +6313,7 @@
                 <w:sz w:val="20"/>
                 <w:szCs w:val="20"/>
               </w:rPr>
-              <w:t xml:space="preserve">Rp10.000</w:t>
+              <w:t xml:space="preserve">Rp3.000</w:t>
             </w:r>
           </w:p>
         </w:tc>
@@ -6409,7 +6409,7 @@
                 <w:sz w:val="20"/>
                 <w:szCs w:val="20"/>
               </w:rPr>
-              <w:t xml:space="preserve">Rp10.000</w:t>
+              <w:t xml:space="preserve">Rp3.000</w:t>
             </w:r>
           </w:p>
         </w:tc>
@@ -6446,7 +6446,7 @@
                 <w:sz w:val="20"/>
                 <w:szCs w:val="20"/>
               </w:rPr>
-              <w:t xml:space="preserve">Saklar on/off</w:t>
+              <w:t xml:space="preserve">Konektor JST XH 6 pin + header (motor encoder)</w:t>
             </w:r>
           </w:p>
         </w:tc>
@@ -6478,7 +6478,7 @@
                 <w:sz w:val="20"/>
                 <w:szCs w:val="20"/>
               </w:rPr>
-              <w:t xml:space="preserve">Rp3.000</w:t>
+              <w:t xml:space="preserve">Rp5.000</w:t>
             </w:r>
           </w:p>
         </w:tc>
@@ -6510,7 +6510,7 @@
                 <w:sz w:val="20"/>
                 <w:szCs w:val="20"/>
               </w:rPr>
-              <w:t xml:space="preserve">1</w:t>
+              <w:t xml:space="preserve">2</w:t>
             </w:r>
           </w:p>
         </w:tc>
@@ -6542,7 +6542,7 @@
                 <w:sz w:val="20"/>
                 <w:szCs w:val="20"/>
               </w:rPr>
-              <w:t xml:space="preserve">pcs</w:t>
+              <w:t xml:space="preserve">set</w:t>
             </w:r>
           </w:p>
         </w:tc>
@@ -6574,7 +6574,7 @@
                 <w:sz w:val="20"/>
                 <w:szCs w:val="20"/>
               </w:rPr>
-              <w:t xml:space="preserve">Rp3.000</w:t>
+              <w:t xml:space="preserve">Rp10.000</w:t>
             </w:r>
           </w:p>
         </w:tc>
@@ -6611,7 +6611,7 @@
                 <w:sz w:val="20"/>
                 <w:szCs w:val="20"/>
               </w:rPr>
-              <w:t xml:space="preserve">Konektor JST PH2.0 6 pin + header (motor encoder)</w:t>
+              <w:t xml:space="preserve">Konektor JST XH 2,5 mm 8 pin (2 header + 2 housing + terminal) + kabel</w:t>
             </w:r>
           </w:p>
         </w:tc>
@@ -6675,7 +6675,7 @@
                 <w:sz w:val="20"/>
                 <w:szCs w:val="20"/>
               </w:rPr>
-              <w:t xml:space="preserve">2</w:t>
+              <w:t xml:space="preserve">1</w:t>
             </w:r>
           </w:p>
         </w:tc>
@@ -6739,7 +6739,7 @@
                 <w:sz w:val="20"/>
                 <w:szCs w:val="20"/>
               </w:rPr>
-              <w:t xml:space="preserve">Rp10.000</w:t>
+              <w:t xml:space="preserve">Rp5.000</w:t>
             </w:r>
           </w:p>
         </w:tc>
@@ -6776,7 +6776,7 @@
                 <w:sz w:val="20"/>
                 <w:szCs w:val="20"/>
               </w:rPr>
-              <w:t xml:space="preserve">Konektor JST XH 2,5 mm 8 pin (2 header + 2 housing + terminal) + kabel</w:t>
+              <w:t xml:space="preserve">Fabrikasi PCB (papan utama + papan sensor) + ongkir</w:t>
             </w:r>
           </w:p>
         </w:tc>
@@ -6808,7 +6808,7 @@
                 <w:sz w:val="20"/>
                 <w:szCs w:val="20"/>
               </w:rPr>
-              <w:t xml:space="preserve">Rp5.000</w:t>
+              <w:t xml:space="preserve">Rp200.000</w:t>
             </w:r>
           </w:p>
         </w:tc>
@@ -6872,7 +6872,7 @@
                 <w:sz w:val="20"/>
                 <w:szCs w:val="20"/>
               </w:rPr>
-              <w:t xml:space="preserve">set</w:t>
+              <w:t xml:space="preserve">paket</w:t>
             </w:r>
           </w:p>
         </w:tc>
@@ -6904,7 +6904,7 @@
                 <w:sz w:val="20"/>
                 <w:szCs w:val="20"/>
               </w:rPr>
-              <w:t xml:space="preserve">Rp5.000</w:t>
+              <w:t xml:space="preserve">Rp200.000</w:t>
             </w:r>
           </w:p>
         </w:tc>
@@ -6941,7 +6941,7 @@
                 <w:sz w:val="20"/>
                 <w:szCs w:val="20"/>
               </w:rPr>
-              <w:t xml:space="preserve">Fabrikasi PCB (papan utama + papan sensor) + ongkir</w:t>
+              <w:t xml:space="preserve">Komponen pendukung minsys (header &amp; socket female, kapasitor, dioda 1N5819, resistor THT)</w:t>
             </w:r>
           </w:p>
         </w:tc>
@@ -6973,7 +6973,7 @@
                 <w:sz w:val="20"/>
                 <w:szCs w:val="20"/>
               </w:rPr>
-              <w:t xml:space="preserve">Rp200.000</w:t>
+              <w:t xml:space="preserve">Rp25.000</w:t>
             </w:r>
           </w:p>
         </w:tc>
@@ -7069,7 +7069,7 @@
                 <w:sz w:val="20"/>
                 <w:szCs w:val="20"/>
               </w:rPr>
-              <w:t xml:space="preserve">Rp200.000</w:t>
+              <w:t xml:space="preserve">Rp25.000</w:t>
             </w:r>
           </w:p>
         </w:tc>
@@ -7080,129 +7080,34 @@
         </w:trPr>
         <w:tc>
           <w:tcPr>
-            <w:tcW w:type="dxa" w:w="4100"/>
-            <w:tcBorders>
-              <w:top w:val="single" w:color="000000" w:sz="4"/>
-              <w:left w:val="single" w:color="000000" w:sz="4"/>
-              <w:bottom w:val="single" w:color="000000" w:sz="4"/>
-              <w:right w:val="single" w:color="000000" w:sz="4"/>
-            </w:tcBorders>
-            <w:tcMar>
-              <w:top w:type="dxa" w:w="40"/>
-              <w:left w:type="dxa" w:w="110"/>
-              <w:bottom w:type="dxa" w:w="40"/>
-              <w:right w:type="dxa" w:w="110"/>
-            </w:tcMar>
-            <w:vAlign w:val="center"/>
-          </w:tcPr>
-          <w:p>
-            <w:pPr>
-              <w:spacing w:after="0" w:before="0" w:line="264"/>
-              <w:jc w:val="center"/>
-            </w:pPr>
-            <w:r>
-              <w:rPr>
-                <w:rFonts w:ascii="Times New Roman" w:cs="Times New Roman" w:eastAsia="Times New Roman" w:hAnsi="Times New Roman"/>
-                <w:sz w:val="20"/>
-                <w:szCs w:val="20"/>
-              </w:rPr>
-              <w:t xml:space="preserve">Komponen pendukung minsys (header &amp; socket female, kapasitor, dioda 1N5819)</w:t>
-            </w:r>
-          </w:p>
-        </w:tc>
-        <w:tc>
-          <w:tcPr>
-            <w:tcW w:type="dxa" w:w="1700"/>
-            <w:tcBorders>
-              <w:top w:val="single" w:color="000000" w:sz="4"/>
-              <w:left w:val="single" w:color="000000" w:sz="4"/>
-              <w:bottom w:val="single" w:color="000000" w:sz="4"/>
-              <w:right w:val="single" w:color="000000" w:sz="4"/>
-            </w:tcBorders>
-            <w:tcMar>
-              <w:top w:type="dxa" w:w="40"/>
-              <w:left w:type="dxa" w:w="110"/>
-              <w:bottom w:type="dxa" w:w="40"/>
-              <w:right w:type="dxa" w:w="110"/>
-            </w:tcMar>
-            <w:vAlign w:val="center"/>
-          </w:tcPr>
-          <w:p>
-            <w:pPr>
-              <w:spacing w:after="0" w:before="0" w:line="264"/>
-              <w:jc w:val="center"/>
-            </w:pPr>
-            <w:r>
-              <w:rPr>
-                <w:rFonts w:ascii="Times New Roman" w:cs="Times New Roman" w:eastAsia="Times New Roman" w:hAnsi="Times New Roman"/>
-                <w:sz w:val="20"/>
-                <w:szCs w:val="20"/>
-              </w:rPr>
-              <w:t xml:space="preserve">Rp25.000</w:t>
-            </w:r>
-          </w:p>
-        </w:tc>
-        <w:tc>
-          <w:tcPr>
-            <w:tcW w:type="dxa" w:w="800"/>
-            <w:tcBorders>
-              <w:top w:val="single" w:color="000000" w:sz="4"/>
-              <w:left w:val="single" w:color="000000" w:sz="4"/>
-              <w:bottom w:val="single" w:color="000000" w:sz="4"/>
-              <w:right w:val="single" w:color="000000" w:sz="4"/>
-            </w:tcBorders>
-            <w:tcMar>
-              <w:top w:type="dxa" w:w="40"/>
-              <w:left w:type="dxa" w:w="110"/>
-              <w:bottom w:type="dxa" w:w="40"/>
-              <w:right w:type="dxa" w:w="110"/>
-            </w:tcMar>
-            <w:vAlign w:val="center"/>
-          </w:tcPr>
-          <w:p>
-            <w:pPr>
-              <w:spacing w:after="0" w:before="0" w:line="264"/>
-              <w:jc w:val="center"/>
-            </w:pPr>
-            <w:r>
-              <w:rPr>
-                <w:rFonts w:ascii="Times New Roman" w:cs="Times New Roman" w:eastAsia="Times New Roman" w:hAnsi="Times New Roman"/>
-                <w:sz w:val="20"/>
-                <w:szCs w:val="20"/>
-              </w:rPr>
-              <w:t xml:space="preserve">1</w:t>
-            </w:r>
-          </w:p>
-        </w:tc>
-        <w:tc>
-          <w:tcPr>
-            <w:tcW w:type="dxa" w:w="1160"/>
-            <w:tcBorders>
-              <w:top w:val="single" w:color="000000" w:sz="4"/>
-              <w:left w:val="single" w:color="000000" w:sz="4"/>
-              <w:bottom w:val="single" w:color="000000" w:sz="4"/>
-              <w:right w:val="single" w:color="000000" w:sz="4"/>
-            </w:tcBorders>
-            <w:tcMar>
-              <w:top w:type="dxa" w:w="40"/>
-              <w:left w:type="dxa" w:w="110"/>
-              <w:bottom w:type="dxa" w:w="40"/>
-              <w:right w:type="dxa" w:w="110"/>
-            </w:tcMar>
-            <w:vAlign w:val="center"/>
-          </w:tcPr>
-          <w:p>
-            <w:pPr>
-              <w:spacing w:after="0" w:before="0" w:line="264"/>
-              <w:jc w:val="center"/>
-            </w:pPr>
-            <w:r>
-              <w:rPr>
-                <w:rFonts w:ascii="Times New Roman" w:cs="Times New Roman" w:eastAsia="Times New Roman" w:hAnsi="Times New Roman"/>
-                <w:sz w:val="20"/>
-                <w:szCs w:val="20"/>
-              </w:rPr>
-              <w:t xml:space="preserve">paket</w:t>
+            <w:tcW w:type="dxa" w:w="7760"/>
+            <w:gridSpan w:val="4"/>
+            <w:tcBorders>
+              <w:top w:val="single" w:color="000000" w:sz="4"/>
+              <w:left w:val="single" w:color="000000" w:sz="4"/>
+              <w:bottom w:val="single" w:color="000000" w:sz="4"/>
+              <w:right w:val="single" w:color="000000" w:sz="4"/>
+            </w:tcBorders>
+            <w:tcMar>
+              <w:top w:type="dxa" w:w="40"/>
+              <w:left w:type="dxa" w:w="110"/>
+              <w:bottom w:type="dxa" w:w="40"/>
+              <w:right w:type="dxa" w:w="110"/>
+            </w:tcMar>
+            <w:vAlign w:val="top"/>
+          </w:tcPr>
+          <w:p>
+            <w:pPr>
+              <w:spacing w:after="0" w:before="0" w:line="264"/>
+              <w:jc w:val="center"/>
+            </w:pPr>
+            <w:r>
+              <w:rPr>
+                <w:rFonts w:ascii="Times New Roman" w:cs="Times New Roman" w:eastAsia="Times New Roman" w:hAnsi="Times New Roman"/>
+                <w:sz w:val="20"/>
+                <w:szCs w:val="20"/>
+              </w:rPr>
+              <w:t xml:space="preserve">Sub Total</w:t>
             </w:r>
           </w:p>
         </w:tc>
@@ -7221,20 +7126,22 @@
               <w:bottom w:type="dxa" w:w="40"/>
               <w:right w:type="dxa" w:w="110"/>
             </w:tcMar>
-            <w:vAlign w:val="center"/>
-          </w:tcPr>
-          <w:p>
-            <w:pPr>
-              <w:spacing w:after="0" w:before="0" w:line="264"/>
-              <w:jc w:val="center"/>
-            </w:pPr>
-            <w:r>
-              <w:rPr>
-                <w:rFonts w:ascii="Times New Roman" w:cs="Times New Roman" w:eastAsia="Times New Roman" w:hAnsi="Times New Roman"/>
-                <w:sz w:val="20"/>
-                <w:szCs w:val="20"/>
-              </w:rPr>
-              <w:t xml:space="preserve">Rp25.000</w:t>
+            <w:vAlign w:val="top"/>
+          </w:tcPr>
+          <w:p>
+            <w:pPr>
+              <w:spacing w:after="0" w:before="0" w:line="264"/>
+              <w:jc w:val="center"/>
+            </w:pPr>
+            <w:r>
+              <w:rPr>
+                <w:rFonts w:ascii="Times New Roman" w:cs="Times New Roman" w:eastAsia="Times New Roman" w:hAnsi="Times New Roman"/>
+                <w:b/>
+                <w:bCs/>
+                <w:sz w:val="20"/>
+                <w:szCs w:val="20"/>
+              </w:rPr>
+              <w:t xml:space="preserve">Rp862.390</w:t>
             </w:r>
           </w:p>
         </w:tc>
@@ -7245,56 +7152,26 @@
         </w:trPr>
         <w:tc>
           <w:tcPr>
-            <w:tcW w:type="dxa" w:w="7760"/>
-            <w:gridSpan w:val="4"/>
-            <w:tcBorders>
-              <w:top w:val="single" w:color="000000" w:sz="4"/>
-              <w:left w:val="single" w:color="000000" w:sz="4"/>
-              <w:bottom w:val="single" w:color="000000" w:sz="4"/>
-              <w:right w:val="single" w:color="000000" w:sz="4"/>
-            </w:tcBorders>
-            <w:tcMar>
-              <w:top w:type="dxa" w:w="40"/>
-              <w:left w:type="dxa" w:w="110"/>
-              <w:bottom w:type="dxa" w:w="40"/>
-              <w:right w:type="dxa" w:w="110"/>
-            </w:tcMar>
-            <w:vAlign w:val="top"/>
-          </w:tcPr>
-          <w:p>
-            <w:pPr>
-              <w:spacing w:after="0" w:before="0" w:line="264"/>
-              <w:jc w:val="center"/>
-            </w:pPr>
-            <w:r>
-              <w:rPr>
-                <w:rFonts w:ascii="Times New Roman" w:cs="Times New Roman" w:eastAsia="Times New Roman" w:hAnsi="Times New Roman"/>
-                <w:sz w:val="20"/>
-                <w:szCs w:val="20"/>
-              </w:rPr>
-              <w:t xml:space="preserve">Sub Total</w:t>
-            </w:r>
-          </w:p>
-        </w:tc>
-        <w:tc>
-          <w:tcPr>
-            <w:tcW w:type="dxa" w:w="2300"/>
-            <w:tcBorders>
-              <w:top w:val="single" w:color="000000" w:sz="4"/>
-              <w:left w:val="single" w:color="000000" w:sz="4"/>
-              <w:bottom w:val="single" w:color="000000" w:sz="4"/>
-              <w:right w:val="single" w:color="000000" w:sz="4"/>
-            </w:tcBorders>
-            <w:tcMar>
-              <w:top w:type="dxa" w:w="40"/>
-              <w:left w:type="dxa" w:w="110"/>
-              <w:bottom w:type="dxa" w:w="40"/>
-              <w:right w:type="dxa" w:w="110"/>
-            </w:tcMar>
-            <w:vAlign w:val="top"/>
-          </w:tcPr>
-          <w:p>
-            <w:pPr>
+            <w:tcW w:type="dxa" w:w="10060"/>
+            <w:gridSpan w:val="5"/>
+            <w:tcBorders>
+              <w:top w:val="single" w:color="000000" w:sz="4"/>
+              <w:left w:val="single" w:color="000000" w:sz="4"/>
+              <w:bottom w:val="single" w:color="000000" w:sz="4"/>
+              <w:right w:val="single" w:color="000000" w:sz="4"/>
+            </w:tcBorders>
+            <w:shd w:fill="D6EDF1" w:color="auto" w:val="clear"/>
+            <w:tcMar>
+              <w:top w:type="dxa" w:w="40"/>
+              <w:left w:type="dxa" w:w="110"/>
+              <w:bottom w:type="dxa" w:w="40"/>
+              <w:right w:type="dxa" w:w="110"/>
+            </w:tcMar>
+            <w:vAlign w:val="top"/>
+          </w:tcPr>
+          <w:p>
+            <w:pPr>
+              <w:keepNext/>
               <w:spacing w:after="0" w:before="0" w:line="264"/>
               <w:jc w:val="center"/>
             </w:pPr>
@@ -7303,10 +7180,196 @@
                 <w:rFonts w:ascii="Times New Roman" w:cs="Times New Roman" w:eastAsia="Times New Roman" w:hAnsi="Times New Roman"/>
                 <w:b/>
                 <w:bCs/>
-                <w:sz w:val="20"/>
-                <w:szCs w:val="20"/>
-              </w:rPr>
-              <w:t xml:space="preserve">Rp832.000</w:t>
+                <w:sz w:val="24"/>
+                <w:szCs w:val="24"/>
+              </w:rPr>
+              <w:t xml:space="preserve">Mechanical</w:t>
+            </w:r>
+          </w:p>
+        </w:tc>
+      </w:tr>
+      <w:tr>
+        <w:trPr>
+          <w:cantSplit/>
+          <w:tblHeader w:val="off"/>
+        </w:trPr>
+        <w:tc>
+          <w:tcPr>
+            <w:tcW w:type="dxa" w:w="4100"/>
+            <w:tcBorders>
+              <w:top w:val="single" w:color="000000" w:sz="4"/>
+              <w:left w:val="single" w:color="000000" w:sz="4"/>
+              <w:bottom w:val="single" w:color="000000" w:sz="4"/>
+              <w:right w:val="single" w:color="000000" w:sz="4"/>
+            </w:tcBorders>
+            <w:shd w:fill="D6EDF1" w:color="auto" w:val="clear"/>
+            <w:tcMar>
+              <w:top w:type="dxa" w:w="40"/>
+              <w:left w:type="dxa" w:w="110"/>
+              <w:bottom w:type="dxa" w:w="40"/>
+              <w:right w:type="dxa" w:w="110"/>
+            </w:tcMar>
+            <w:vAlign w:val="top"/>
+          </w:tcPr>
+          <w:p>
+            <w:pPr>
+              <w:keepNext/>
+              <w:spacing w:after="0" w:before="0" w:line="264"/>
+              <w:jc w:val="center"/>
+            </w:pPr>
+            <w:r>
+              <w:rPr>
+                <w:rFonts w:ascii="Times New Roman" w:cs="Times New Roman" w:eastAsia="Times New Roman" w:hAnsi="Times New Roman"/>
+                <w:b/>
+                <w:bCs/>
+                <w:sz w:val="24"/>
+                <w:szCs w:val="24"/>
+              </w:rPr>
+              <w:t xml:space="preserve">Item</w:t>
+            </w:r>
+          </w:p>
+        </w:tc>
+        <w:tc>
+          <w:tcPr>
+            <w:tcW w:type="dxa" w:w="1700"/>
+            <w:tcBorders>
+              <w:top w:val="single" w:color="000000" w:sz="4"/>
+              <w:left w:val="single" w:color="000000" w:sz="4"/>
+              <w:bottom w:val="single" w:color="000000" w:sz="4"/>
+              <w:right w:val="single" w:color="000000" w:sz="4"/>
+            </w:tcBorders>
+            <w:shd w:fill="D6EDF1" w:color="auto" w:val="clear"/>
+            <w:tcMar>
+              <w:top w:type="dxa" w:w="40"/>
+              <w:left w:type="dxa" w:w="110"/>
+              <w:bottom w:type="dxa" w:w="40"/>
+              <w:right w:type="dxa" w:w="110"/>
+            </w:tcMar>
+            <w:vAlign w:val="top"/>
+          </w:tcPr>
+          <w:p>
+            <w:pPr>
+              <w:keepNext/>
+              <w:spacing w:after="0" w:before="0" w:line="264"/>
+              <w:jc w:val="center"/>
+            </w:pPr>
+            <w:r>
+              <w:rPr>
+                <w:rFonts w:ascii="Times New Roman" w:cs="Times New Roman" w:eastAsia="Times New Roman" w:hAnsi="Times New Roman"/>
+                <w:b/>
+                <w:bCs/>
+                <w:sz w:val="24"/>
+                <w:szCs w:val="24"/>
+              </w:rPr>
+              <w:t xml:space="preserve">Price per unit</w:t>
+            </w:r>
+          </w:p>
+        </w:tc>
+        <w:tc>
+          <w:tcPr>
+            <w:tcW w:type="dxa" w:w="800"/>
+            <w:tcBorders>
+              <w:top w:val="single" w:color="000000" w:sz="4"/>
+              <w:left w:val="single" w:color="000000" w:sz="4"/>
+              <w:bottom w:val="single" w:color="000000" w:sz="4"/>
+              <w:right w:val="single" w:color="000000" w:sz="4"/>
+            </w:tcBorders>
+            <w:shd w:fill="D6EDF1" w:color="auto" w:val="clear"/>
+            <w:tcMar>
+              <w:top w:type="dxa" w:w="40"/>
+              <w:left w:type="dxa" w:w="110"/>
+              <w:bottom w:type="dxa" w:w="40"/>
+              <w:right w:type="dxa" w:w="110"/>
+            </w:tcMar>
+            <w:vAlign w:val="top"/>
+          </w:tcPr>
+          <w:p>
+            <w:pPr>
+              <w:keepNext/>
+              <w:spacing w:after="0" w:before="0" w:line="264"/>
+              <w:jc w:val="center"/>
+            </w:pPr>
+            <w:r>
+              <w:rPr>
+                <w:rFonts w:ascii="Times New Roman" w:cs="Times New Roman" w:eastAsia="Times New Roman" w:hAnsi="Times New Roman"/>
+                <w:b/>
+                <w:bCs/>
+                <w:sz w:val="24"/>
+                <w:szCs w:val="24"/>
+              </w:rPr>
+              <w:t xml:space="preserve">Qty</w:t>
+            </w:r>
+          </w:p>
+        </w:tc>
+        <w:tc>
+          <w:tcPr>
+            <w:tcW w:type="dxa" w:w="1160"/>
+            <w:tcBorders>
+              <w:top w:val="single" w:color="000000" w:sz="4"/>
+              <w:left w:val="single" w:color="000000" w:sz="4"/>
+              <w:bottom w:val="single" w:color="000000" w:sz="4"/>
+              <w:right w:val="single" w:color="000000" w:sz="4"/>
+            </w:tcBorders>
+            <w:shd w:fill="D6EDF1" w:color="auto" w:val="clear"/>
+            <w:tcMar>
+              <w:top w:type="dxa" w:w="40"/>
+              <w:left w:type="dxa" w:w="110"/>
+              <w:bottom w:type="dxa" w:w="40"/>
+              <w:right w:type="dxa" w:w="110"/>
+            </w:tcMar>
+            <w:vAlign w:val="top"/>
+          </w:tcPr>
+          <w:p>
+            <w:pPr>
+              <w:keepNext/>
+              <w:spacing w:after="0" w:before="0" w:line="264"/>
+              <w:jc w:val="center"/>
+            </w:pPr>
+            <w:r>
+              <w:rPr>
+                <w:rFonts w:ascii="Times New Roman" w:cs="Times New Roman" w:eastAsia="Times New Roman" w:hAnsi="Times New Roman"/>
+                <w:b/>
+                <w:bCs/>
+                <w:sz w:val="24"/>
+                <w:szCs w:val="24"/>
+              </w:rPr>
+              <w:t xml:space="preserve">Unit</w:t>
+            </w:r>
+          </w:p>
+        </w:tc>
+        <w:tc>
+          <w:tcPr>
+            <w:tcW w:type="dxa" w:w="2300"/>
+            <w:tcBorders>
+              <w:top w:val="single" w:color="000000" w:sz="4"/>
+              <w:left w:val="single" w:color="000000" w:sz="4"/>
+              <w:bottom w:val="single" w:color="000000" w:sz="4"/>
+              <w:right w:val="single" w:color="000000" w:sz="4"/>
+            </w:tcBorders>
+            <w:shd w:fill="D6EDF1" w:color="auto" w:val="clear"/>
+            <w:tcMar>
+              <w:top w:type="dxa" w:w="40"/>
+              <w:left w:type="dxa" w:w="110"/>
+              <w:bottom w:type="dxa" w:w="40"/>
+              <w:right w:type="dxa" w:w="110"/>
+            </w:tcMar>
+            <w:vAlign w:val="top"/>
+          </w:tcPr>
+          <w:p>
+            <w:pPr>
+              <w:keepNext/>
+              <w:spacing w:after="0" w:before="0" w:line="264"/>
+              <w:jc w:val="center"/>
+            </w:pPr>
+            <w:r>
+              <w:rPr>
+                <w:rFonts w:ascii="Times New Roman" w:cs="Times New Roman" w:eastAsia="Times New Roman" w:hAnsi="Times New Roman"/>
+                <w:b/>
+                <w:bCs/>
+                <w:sz w:val="24"/>
+                <w:szCs w:val="24"/>
+              </w:rPr>
+              <w:t xml:space="preserve">Total Price</w:t>
             </w:r>
           </w:p>
         </w:tc>
@@ -7317,49 +7380,6 @@
         </w:trPr>
         <w:tc>
           <w:tcPr>
-            <w:tcW w:type="dxa" w:w="10060"/>
-            <w:gridSpan w:val="5"/>
-            <w:tcBorders>
-              <w:top w:val="single" w:color="000000" w:sz="4"/>
-              <w:left w:val="single" w:color="000000" w:sz="4"/>
-              <w:bottom w:val="single" w:color="000000" w:sz="4"/>
-              <w:right w:val="single" w:color="000000" w:sz="4"/>
-            </w:tcBorders>
-            <w:shd w:fill="D6EDF1" w:color="auto" w:val="clear"/>
-            <w:tcMar>
-              <w:top w:type="dxa" w:w="40"/>
-              <w:left w:type="dxa" w:w="110"/>
-              <w:bottom w:type="dxa" w:w="40"/>
-              <w:right w:type="dxa" w:w="110"/>
-            </w:tcMar>
-            <w:vAlign w:val="top"/>
-          </w:tcPr>
-          <w:p>
-            <w:pPr>
-              <w:keepNext/>
-              <w:spacing w:after="0" w:before="0" w:line="264"/>
-              <w:jc w:val="center"/>
-            </w:pPr>
-            <w:r>
-              <w:rPr>
-                <w:rFonts w:ascii="Times New Roman" w:cs="Times New Roman" w:eastAsia="Times New Roman" w:hAnsi="Times New Roman"/>
-                <w:b/>
-                <w:bCs/>
-                <w:sz w:val="24"/>
-                <w:szCs w:val="24"/>
-              </w:rPr>
-              <w:t xml:space="preserve">Mechanical</w:t>
-            </w:r>
-          </w:p>
-        </w:tc>
-      </w:tr>
-      <w:tr>
-        <w:trPr>
-          <w:cantSplit/>
-          <w:tblHeader w:val="false"/>
-        </w:trPr>
-        <w:tc>
-          <w:tcPr>
             <w:tcW w:type="dxa" w:w="4100"/>
             <w:tcBorders>
               <w:top w:val="single" w:color="000000" w:sz="4"/>
@@ -7367,30 +7387,26 @@
               <w:bottom w:val="single" w:color="000000" w:sz="4"/>
               <w:right w:val="single" w:color="000000" w:sz="4"/>
             </w:tcBorders>
-            <w:shd w:fill="D6EDF1" w:color="auto" w:val="clear"/>
-            <w:tcMar>
-              <w:top w:type="dxa" w:w="40"/>
-              <w:left w:type="dxa" w:w="110"/>
-              <w:bottom w:type="dxa" w:w="40"/>
-              <w:right w:type="dxa" w:w="110"/>
-            </w:tcMar>
-            <w:vAlign w:val="top"/>
-          </w:tcPr>
-          <w:p>
-            <w:pPr>
-              <w:keepNext/>
-              <w:spacing w:after="0" w:before="0" w:line="264"/>
-              <w:jc w:val="center"/>
-            </w:pPr>
-            <w:r>
-              <w:rPr>
-                <w:rFonts w:ascii="Times New Roman" w:cs="Times New Roman" w:eastAsia="Times New Roman" w:hAnsi="Times New Roman"/>
-                <w:b/>
-                <w:bCs/>
-                <w:sz w:val="24"/>
-                <w:szCs w:val="24"/>
-              </w:rPr>
-              <w:t xml:space="preserve">Item</w:t>
+            <w:tcMar>
+              <w:top w:type="dxa" w:w="40"/>
+              <w:left w:type="dxa" w:w="110"/>
+              <w:bottom w:type="dxa" w:w="40"/>
+              <w:right w:type="dxa" w:w="110"/>
+            </w:tcMar>
+            <w:vAlign w:val="center"/>
+          </w:tcPr>
+          <w:p>
+            <w:pPr>
+              <w:spacing w:after="0" w:before="0" w:line="264"/>
+              <w:jc w:val="center"/>
+            </w:pPr>
+            <w:r>
+              <w:rPr>
+                <w:rFonts w:ascii="Times New Roman" w:cs="Times New Roman" w:eastAsia="Times New Roman" w:hAnsi="Times New Roman"/>
+                <w:sz w:val="20"/>
+                <w:szCs w:val="20"/>
+              </w:rPr>
+              <w:t xml:space="preserve">Roda N20 Ø34 mm</w:t>
             </w:r>
           </w:p>
         </w:tc>
@@ -7403,30 +7419,26 @@
               <w:bottom w:val="single" w:color="000000" w:sz="4"/>
               <w:right w:val="single" w:color="000000" w:sz="4"/>
             </w:tcBorders>
-            <w:shd w:fill="D6EDF1" w:color="auto" w:val="clear"/>
-            <w:tcMar>
-              <w:top w:type="dxa" w:w="40"/>
-              <w:left w:type="dxa" w:w="110"/>
-              <w:bottom w:type="dxa" w:w="40"/>
-              <w:right w:type="dxa" w:w="110"/>
-            </w:tcMar>
-            <w:vAlign w:val="top"/>
-          </w:tcPr>
-          <w:p>
-            <w:pPr>
-              <w:keepNext/>
-              <w:spacing w:after="0" w:before="0" w:line="264"/>
-              <w:jc w:val="center"/>
-            </w:pPr>
-            <w:r>
-              <w:rPr>
-                <w:rFonts w:ascii="Times New Roman" w:cs="Times New Roman" w:eastAsia="Times New Roman" w:hAnsi="Times New Roman"/>
-                <w:b/>
-                <w:bCs/>
-                <w:sz w:val="24"/>
-                <w:szCs w:val="24"/>
-              </w:rPr>
-              <w:t xml:space="preserve">Price per unit</w:t>
+            <w:tcMar>
+              <w:top w:type="dxa" w:w="40"/>
+              <w:left w:type="dxa" w:w="110"/>
+              <w:bottom w:type="dxa" w:w="40"/>
+              <w:right w:type="dxa" w:w="110"/>
+            </w:tcMar>
+            <w:vAlign w:val="center"/>
+          </w:tcPr>
+          <w:p>
+            <w:pPr>
+              <w:spacing w:after="0" w:before="0" w:line="264"/>
+              <w:jc w:val="center"/>
+            </w:pPr>
+            <w:r>
+              <w:rPr>
+                <w:rFonts w:ascii="Times New Roman" w:cs="Times New Roman" w:eastAsia="Times New Roman" w:hAnsi="Times New Roman"/>
+                <w:sz w:val="20"/>
+                <w:szCs w:val="20"/>
+              </w:rPr>
+              <w:t xml:space="preserve">Rp25.000</w:t>
             </w:r>
           </w:p>
         </w:tc>
@@ -7439,30 +7451,26 @@
               <w:bottom w:val="single" w:color="000000" w:sz="4"/>
               <w:right w:val="single" w:color="000000" w:sz="4"/>
             </w:tcBorders>
-            <w:shd w:fill="D6EDF1" w:color="auto" w:val="clear"/>
-            <w:tcMar>
-              <w:top w:type="dxa" w:w="40"/>
-              <w:left w:type="dxa" w:w="110"/>
-              <w:bottom w:type="dxa" w:w="40"/>
-              <w:right w:type="dxa" w:w="110"/>
-            </w:tcMar>
-            <w:vAlign w:val="top"/>
-          </w:tcPr>
-          <w:p>
-            <w:pPr>
-              <w:keepNext/>
-              <w:spacing w:after="0" w:before="0" w:line="264"/>
-              <w:jc w:val="center"/>
-            </w:pPr>
-            <w:r>
-              <w:rPr>
-                <w:rFonts w:ascii="Times New Roman" w:cs="Times New Roman" w:eastAsia="Times New Roman" w:hAnsi="Times New Roman"/>
-                <w:b/>
-                <w:bCs/>
-                <w:sz w:val="24"/>
-                <w:szCs w:val="24"/>
-              </w:rPr>
-              <w:t xml:space="preserve">Qty</w:t>
+            <w:tcMar>
+              <w:top w:type="dxa" w:w="40"/>
+              <w:left w:type="dxa" w:w="110"/>
+              <w:bottom w:type="dxa" w:w="40"/>
+              <w:right w:type="dxa" w:w="110"/>
+            </w:tcMar>
+            <w:vAlign w:val="center"/>
+          </w:tcPr>
+          <w:p>
+            <w:pPr>
+              <w:spacing w:after="0" w:before="0" w:line="264"/>
+              <w:jc w:val="center"/>
+            </w:pPr>
+            <w:r>
+              <w:rPr>
+                <w:rFonts w:ascii="Times New Roman" w:cs="Times New Roman" w:eastAsia="Times New Roman" w:hAnsi="Times New Roman"/>
+                <w:sz w:val="20"/>
+                <w:szCs w:val="20"/>
+              </w:rPr>
+              <w:t xml:space="preserve">1</w:t>
             </w:r>
           </w:p>
         </w:tc>
@@ -7475,30 +7483,26 @@
               <w:bottom w:val="single" w:color="000000" w:sz="4"/>
               <w:right w:val="single" w:color="000000" w:sz="4"/>
             </w:tcBorders>
-            <w:shd w:fill="D6EDF1" w:color="auto" w:val="clear"/>
-            <w:tcMar>
-              <w:top w:type="dxa" w:w="40"/>
-              <w:left w:type="dxa" w:w="110"/>
-              <w:bottom w:type="dxa" w:w="40"/>
-              <w:right w:type="dxa" w:w="110"/>
-            </w:tcMar>
-            <w:vAlign w:val="top"/>
-          </w:tcPr>
-          <w:p>
-            <w:pPr>
-              <w:keepNext/>
-              <w:spacing w:after="0" w:before="0" w:line="264"/>
-              <w:jc w:val="center"/>
-            </w:pPr>
-            <w:r>
-              <w:rPr>
-                <w:rFonts w:ascii="Times New Roman" w:cs="Times New Roman" w:eastAsia="Times New Roman" w:hAnsi="Times New Roman"/>
-                <w:b/>
-                <w:bCs/>
-                <w:sz w:val="24"/>
-                <w:szCs w:val="24"/>
-              </w:rPr>
-              <w:t xml:space="preserve">Unit</w:t>
+            <w:tcMar>
+              <w:top w:type="dxa" w:w="40"/>
+              <w:left w:type="dxa" w:w="110"/>
+              <w:bottom w:type="dxa" w:w="40"/>
+              <w:right w:type="dxa" w:w="110"/>
+            </w:tcMar>
+            <w:vAlign w:val="center"/>
+          </w:tcPr>
+          <w:p>
+            <w:pPr>
+              <w:spacing w:after="0" w:before="0" w:line="264"/>
+              <w:jc w:val="center"/>
+            </w:pPr>
+            <w:r>
+              <w:rPr>
+                <w:rFonts w:ascii="Times New Roman" w:cs="Times New Roman" w:eastAsia="Times New Roman" w:hAnsi="Times New Roman"/>
+                <w:sz w:val="20"/>
+                <w:szCs w:val="20"/>
+              </w:rPr>
+              <w:t xml:space="preserve">pasang</w:t>
             </w:r>
           </w:p>
         </w:tc>
@@ -7511,30 +7515,26 @@
               <w:bottom w:val="single" w:color="000000" w:sz="4"/>
               <w:right w:val="single" w:color="000000" w:sz="4"/>
             </w:tcBorders>
-            <w:shd w:fill="D6EDF1" w:color="auto" w:val="clear"/>
-            <w:tcMar>
-              <w:top w:type="dxa" w:w="40"/>
-              <w:left w:type="dxa" w:w="110"/>
-              <w:bottom w:type="dxa" w:w="40"/>
-              <w:right w:type="dxa" w:w="110"/>
-            </w:tcMar>
-            <w:vAlign w:val="top"/>
-          </w:tcPr>
-          <w:p>
-            <w:pPr>
-              <w:keepNext/>
-              <w:spacing w:after="0" w:before="0" w:line="264"/>
-              <w:jc w:val="center"/>
-            </w:pPr>
-            <w:r>
-              <w:rPr>
-                <w:rFonts w:ascii="Times New Roman" w:cs="Times New Roman" w:eastAsia="Times New Roman" w:hAnsi="Times New Roman"/>
-                <w:b/>
-                <w:bCs/>
-                <w:sz w:val="24"/>
-                <w:szCs w:val="24"/>
-              </w:rPr>
-              <w:t xml:space="preserve">Total Price</w:t>
+            <w:tcMar>
+              <w:top w:type="dxa" w:w="40"/>
+              <w:left w:type="dxa" w:w="110"/>
+              <w:bottom w:type="dxa" w:w="40"/>
+              <w:right w:type="dxa" w:w="110"/>
+            </w:tcMar>
+            <w:vAlign w:val="center"/>
+          </w:tcPr>
+          <w:p>
+            <w:pPr>
+              <w:spacing w:after="0" w:before="0" w:line="264"/>
+              <w:jc w:val="center"/>
+            </w:pPr>
+            <w:r>
+              <w:rPr>
+                <w:rFonts w:ascii="Times New Roman" w:cs="Times New Roman" w:eastAsia="Times New Roman" w:hAnsi="Times New Roman"/>
+                <w:sz w:val="20"/>
+                <w:szCs w:val="20"/>
+              </w:rPr>
+              <w:t xml:space="preserve">Rp25.000</w:t>
             </w:r>
           </w:p>
         </w:tc>
@@ -7571,7 +7571,7 @@
                 <w:sz w:val="20"/>
                 <w:szCs w:val="20"/>
               </w:rPr>
-              <w:t xml:space="preserve">Roda N20 Ø34 mm</w:t>
+              <w:t xml:space="preserve">Ball caster</w:t>
             </w:r>
           </w:p>
         </w:tc>
@@ -7603,7 +7603,7 @@
                 <w:sz w:val="20"/>
                 <w:szCs w:val="20"/>
               </w:rPr>
-              <w:t xml:space="preserve">Rp25.000</w:t>
+              <w:t xml:space="preserve">Rp10.000</w:t>
             </w:r>
           </w:p>
         </w:tc>
@@ -7667,7 +7667,7 @@
                 <w:sz w:val="20"/>
                 <w:szCs w:val="20"/>
               </w:rPr>
-              <w:t xml:space="preserve">pasang</w:t>
+              <w:t xml:space="preserve">pcs</w:t>
             </w:r>
           </w:p>
         </w:tc>
@@ -7699,7 +7699,7 @@
                 <w:sz w:val="20"/>
                 <w:szCs w:val="20"/>
               </w:rPr>
-              <w:t xml:space="preserve">Rp25.000</w:t>
+              <w:t xml:space="preserve">Rp10.000</w:t>
             </w:r>
           </w:p>
         </w:tc>
@@ -7736,7 +7736,7 @@
                 <w:sz w:val="20"/>
                 <w:szCs w:val="20"/>
               </w:rPr>
-              <w:t xml:space="preserve">Bracket motor N20</w:t>
+              <w:t xml:space="preserve">Baut, mur, spacer</w:t>
             </w:r>
           </w:p>
         </w:tc>
@@ -7768,7 +7768,7 @@
                 <w:sz w:val="20"/>
                 <w:szCs w:val="20"/>
               </w:rPr>
-              <w:t xml:space="preserve">Rp10.000</w:t>
+              <w:t xml:space="preserve">Rp15.000</w:t>
             </w:r>
           </w:p>
         </w:tc>
@@ -7832,7 +7832,7 @@
                 <w:sz w:val="20"/>
                 <w:szCs w:val="20"/>
               </w:rPr>
-              <w:t xml:space="preserve">pasang</w:t>
+              <w:t xml:space="preserve">paket</w:t>
             </w:r>
           </w:p>
         </w:tc>
@@ -7864,7 +7864,7 @@
                 <w:sz w:val="20"/>
                 <w:szCs w:val="20"/>
               </w:rPr>
-              <w:t xml:space="preserve">Rp10.000</w:t>
+              <w:t xml:space="preserve">Rp15.000</w:t>
             </w:r>
           </w:p>
         </w:tc>
@@ -7875,129 +7875,34 @@
         </w:trPr>
         <w:tc>
           <w:tcPr>
-            <w:tcW w:type="dxa" w:w="4100"/>
-            <w:tcBorders>
-              <w:top w:val="single" w:color="000000" w:sz="4"/>
-              <w:left w:val="single" w:color="000000" w:sz="4"/>
-              <w:bottom w:val="single" w:color="000000" w:sz="4"/>
-              <w:right w:val="single" w:color="000000" w:sz="4"/>
-            </w:tcBorders>
-            <w:tcMar>
-              <w:top w:type="dxa" w:w="40"/>
-              <w:left w:type="dxa" w:w="110"/>
-              <w:bottom w:type="dxa" w:w="40"/>
-              <w:right w:type="dxa" w:w="110"/>
-            </w:tcMar>
-            <w:vAlign w:val="center"/>
-          </w:tcPr>
-          <w:p>
-            <w:pPr>
-              <w:spacing w:after="0" w:before="0" w:line="264"/>
-              <w:jc w:val="center"/>
-            </w:pPr>
-            <w:r>
-              <w:rPr>
-                <w:rFonts w:ascii="Times New Roman" w:cs="Times New Roman" w:eastAsia="Times New Roman" w:hAnsi="Times New Roman"/>
-                <w:sz w:val="20"/>
-                <w:szCs w:val="20"/>
-              </w:rPr>
-              <w:t xml:space="preserve">Skid nilon (pengganti ball caster; baut M2/M3, spacer, mur nilon)</w:t>
-            </w:r>
-          </w:p>
-        </w:tc>
-        <w:tc>
-          <w:tcPr>
-            <w:tcW w:type="dxa" w:w="1700"/>
-            <w:tcBorders>
-              <w:top w:val="single" w:color="000000" w:sz="4"/>
-              <w:left w:val="single" w:color="000000" w:sz="4"/>
-              <w:bottom w:val="single" w:color="000000" w:sz="4"/>
-              <w:right w:val="single" w:color="000000" w:sz="4"/>
-            </w:tcBorders>
-            <w:tcMar>
-              <w:top w:type="dxa" w:w="40"/>
-              <w:left w:type="dxa" w:w="110"/>
-              <w:bottom w:type="dxa" w:w="40"/>
-              <w:right w:type="dxa" w:w="110"/>
-            </w:tcMar>
-            <w:vAlign w:val="center"/>
-          </w:tcPr>
-          <w:p>
-            <w:pPr>
-              <w:spacing w:after="0" w:before="0" w:line="264"/>
-              <w:jc w:val="center"/>
-            </w:pPr>
-            <w:r>
-              <w:rPr>
-                <w:rFonts w:ascii="Times New Roman" w:cs="Times New Roman" w:eastAsia="Times New Roman" w:hAnsi="Times New Roman"/>
-                <w:sz w:val="20"/>
-                <w:szCs w:val="20"/>
-              </w:rPr>
-              <w:t xml:space="preserve">Rp5.000</w:t>
-            </w:r>
-          </w:p>
-        </w:tc>
-        <w:tc>
-          <w:tcPr>
-            <w:tcW w:type="dxa" w:w="800"/>
-            <w:tcBorders>
-              <w:top w:val="single" w:color="000000" w:sz="4"/>
-              <w:left w:val="single" w:color="000000" w:sz="4"/>
-              <w:bottom w:val="single" w:color="000000" w:sz="4"/>
-              <w:right w:val="single" w:color="000000" w:sz="4"/>
-            </w:tcBorders>
-            <w:tcMar>
-              <w:top w:type="dxa" w:w="40"/>
-              <w:left w:type="dxa" w:w="110"/>
-              <w:bottom w:type="dxa" w:w="40"/>
-              <w:right w:type="dxa" w:w="110"/>
-            </w:tcMar>
-            <w:vAlign w:val="center"/>
-          </w:tcPr>
-          <w:p>
-            <w:pPr>
-              <w:spacing w:after="0" w:before="0" w:line="264"/>
-              <w:jc w:val="center"/>
-            </w:pPr>
-            <w:r>
-              <w:rPr>
-                <w:rFonts w:ascii="Times New Roman" w:cs="Times New Roman" w:eastAsia="Times New Roman" w:hAnsi="Times New Roman"/>
-                <w:sz w:val="20"/>
-                <w:szCs w:val="20"/>
-              </w:rPr>
-              <w:t xml:space="preserve">1</w:t>
-            </w:r>
-          </w:p>
-        </w:tc>
-        <w:tc>
-          <w:tcPr>
-            <w:tcW w:type="dxa" w:w="1160"/>
-            <w:tcBorders>
-              <w:top w:val="single" w:color="000000" w:sz="4"/>
-              <w:left w:val="single" w:color="000000" w:sz="4"/>
-              <w:bottom w:val="single" w:color="000000" w:sz="4"/>
-              <w:right w:val="single" w:color="000000" w:sz="4"/>
-            </w:tcBorders>
-            <w:tcMar>
-              <w:top w:type="dxa" w:w="40"/>
-              <w:left w:type="dxa" w:w="110"/>
-              <w:bottom w:type="dxa" w:w="40"/>
-              <w:right w:type="dxa" w:w="110"/>
-            </w:tcMar>
-            <w:vAlign w:val="center"/>
-          </w:tcPr>
-          <w:p>
-            <w:pPr>
-              <w:spacing w:after="0" w:before="0" w:line="264"/>
-              <w:jc w:val="center"/>
-            </w:pPr>
-            <w:r>
-              <w:rPr>
-                <w:rFonts w:ascii="Times New Roman" w:cs="Times New Roman" w:eastAsia="Times New Roman" w:hAnsi="Times New Roman"/>
-                <w:sz w:val="20"/>
-                <w:szCs w:val="20"/>
-              </w:rPr>
-              <w:t xml:space="preserve">paket</w:t>
+            <w:tcW w:type="dxa" w:w="7760"/>
+            <w:gridSpan w:val="4"/>
+            <w:tcBorders>
+              <w:top w:val="single" w:color="000000" w:sz="4"/>
+              <w:left w:val="single" w:color="000000" w:sz="4"/>
+              <w:bottom w:val="single" w:color="000000" w:sz="4"/>
+              <w:right w:val="single" w:color="000000" w:sz="4"/>
+            </w:tcBorders>
+            <w:tcMar>
+              <w:top w:type="dxa" w:w="40"/>
+              <w:left w:type="dxa" w:w="110"/>
+              <w:bottom w:type="dxa" w:w="40"/>
+              <w:right w:type="dxa" w:w="110"/>
+            </w:tcMar>
+            <w:vAlign w:val="top"/>
+          </w:tcPr>
+          <w:p>
+            <w:pPr>
+              <w:spacing w:after="0" w:before="0" w:line="264"/>
+              <w:jc w:val="center"/>
+            </w:pPr>
+            <w:r>
+              <w:rPr>
+                <w:rFonts w:ascii="Times New Roman" w:cs="Times New Roman" w:eastAsia="Times New Roman" w:hAnsi="Times New Roman"/>
+                <w:sz w:val="20"/>
+                <w:szCs w:val="20"/>
+              </w:rPr>
+              <w:t xml:space="preserve">Sub Total</w:t>
             </w:r>
           </w:p>
         </w:tc>
@@ -8016,20 +7921,22 @@
               <w:bottom w:type="dxa" w:w="40"/>
               <w:right w:type="dxa" w:w="110"/>
             </w:tcMar>
-            <w:vAlign w:val="center"/>
-          </w:tcPr>
-          <w:p>
-            <w:pPr>
-              <w:spacing w:after="0" w:before="0" w:line="264"/>
-              <w:jc w:val="center"/>
-            </w:pPr>
-            <w:r>
-              <w:rPr>
-                <w:rFonts w:ascii="Times New Roman" w:cs="Times New Roman" w:eastAsia="Times New Roman" w:hAnsi="Times New Roman"/>
-                <w:sz w:val="20"/>
-                <w:szCs w:val="20"/>
-              </w:rPr>
-              <w:t xml:space="preserve">Rp5.000</w:t>
+            <w:vAlign w:val="top"/>
+          </w:tcPr>
+          <w:p>
+            <w:pPr>
+              <w:spacing w:after="0" w:before="0" w:line="264"/>
+              <w:jc w:val="center"/>
+            </w:pPr>
+            <w:r>
+              <w:rPr>
+                <w:rFonts w:ascii="Times New Roman" w:cs="Times New Roman" w:eastAsia="Times New Roman" w:hAnsi="Times New Roman"/>
+                <w:b/>
+                <w:bCs/>
+                <w:sz w:val="20"/>
+                <w:szCs w:val="20"/>
+              </w:rPr>
+              <w:t xml:space="preserve">Rp50.000</w:t>
             </w:r>
           </w:p>
         </w:tc>
@@ -8040,6 +7947,49 @@
         </w:trPr>
         <w:tc>
           <w:tcPr>
+            <w:tcW w:type="dxa" w:w="10060"/>
+            <w:gridSpan w:val="5"/>
+            <w:tcBorders>
+              <w:top w:val="single" w:color="000000" w:sz="4"/>
+              <w:left w:val="single" w:color="000000" w:sz="4"/>
+              <w:bottom w:val="single" w:color="000000" w:sz="4"/>
+              <w:right w:val="single" w:color="000000" w:sz="4"/>
+            </w:tcBorders>
+            <w:shd w:fill="D6EDF1" w:color="auto" w:val="clear"/>
+            <w:tcMar>
+              <w:top w:type="dxa" w:w="40"/>
+              <w:left w:type="dxa" w:w="110"/>
+              <w:bottom w:type="dxa" w:w="40"/>
+              <w:right w:type="dxa" w:w="110"/>
+            </w:tcMar>
+            <w:vAlign w:val="top"/>
+          </w:tcPr>
+          <w:p>
+            <w:pPr>
+              <w:keepNext/>
+              <w:spacing w:after="0" w:before="0" w:line="264"/>
+              <w:jc w:val="center"/>
+            </w:pPr>
+            <w:r>
+              <w:rPr>
+                <w:rFonts w:ascii="Times New Roman" w:cs="Times New Roman" w:eastAsia="Times New Roman" w:hAnsi="Times New Roman"/>
+                <w:b/>
+                <w:bCs/>
+                <w:sz w:val="24"/>
+                <w:szCs w:val="24"/>
+              </w:rPr>
+              <w:t xml:space="preserve">Lain-lain</w:t>
+            </w:r>
+          </w:p>
+        </w:tc>
+      </w:tr>
+      <w:tr>
+        <w:trPr>
+          <w:cantSplit/>
+          <w:tblHeader w:val="off"/>
+        </w:trPr>
+        <w:tc>
+          <w:tcPr>
             <w:tcW w:type="dxa" w:w="4100"/>
             <w:tcBorders>
               <w:top w:val="single" w:color="000000" w:sz="4"/>
@@ -8047,26 +7997,30 @@
               <w:bottom w:val="single" w:color="000000" w:sz="4"/>
               <w:right w:val="single" w:color="000000" w:sz="4"/>
             </w:tcBorders>
-            <w:tcMar>
-              <w:top w:type="dxa" w:w="40"/>
-              <w:left w:type="dxa" w:w="110"/>
-              <w:bottom w:type="dxa" w:w="40"/>
-              <w:right w:type="dxa" w:w="110"/>
-            </w:tcMar>
-            <w:vAlign w:val="center"/>
-          </w:tcPr>
-          <w:p>
-            <w:pPr>
-              <w:spacing w:after="0" w:before="0" w:line="264"/>
-              <w:jc w:val="center"/>
-            </w:pPr>
-            <w:r>
-              <w:rPr>
-                <w:rFonts w:ascii="Times New Roman" w:cs="Times New Roman" w:eastAsia="Times New Roman" w:hAnsi="Times New Roman"/>
-                <w:sz w:val="20"/>
-                <w:szCs w:val="20"/>
-              </w:rPr>
-              <w:t xml:space="preserve">Baut, mur, spacer</w:t>
+            <w:shd w:fill="D6EDF1" w:color="auto" w:val="clear"/>
+            <w:tcMar>
+              <w:top w:type="dxa" w:w="40"/>
+              <w:left w:type="dxa" w:w="110"/>
+              <w:bottom w:type="dxa" w:w="40"/>
+              <w:right w:type="dxa" w:w="110"/>
+            </w:tcMar>
+            <w:vAlign w:val="top"/>
+          </w:tcPr>
+          <w:p>
+            <w:pPr>
+              <w:keepNext/>
+              <w:spacing w:after="0" w:before="0" w:line="264"/>
+              <w:jc w:val="center"/>
+            </w:pPr>
+            <w:r>
+              <w:rPr>
+                <w:rFonts w:ascii="Times New Roman" w:cs="Times New Roman" w:eastAsia="Times New Roman" w:hAnsi="Times New Roman"/>
+                <w:b/>
+                <w:bCs/>
+                <w:sz w:val="24"/>
+                <w:szCs w:val="24"/>
+              </w:rPr>
+              <w:t xml:space="preserve">Item</w:t>
             </w:r>
           </w:p>
         </w:tc>
@@ -8079,26 +8033,30 @@
               <w:bottom w:val="single" w:color="000000" w:sz="4"/>
               <w:right w:val="single" w:color="000000" w:sz="4"/>
             </w:tcBorders>
-            <w:tcMar>
-              <w:top w:type="dxa" w:w="40"/>
-              <w:left w:type="dxa" w:w="110"/>
-              <w:bottom w:type="dxa" w:w="40"/>
-              <w:right w:type="dxa" w:w="110"/>
-            </w:tcMar>
-            <w:vAlign w:val="center"/>
-          </w:tcPr>
-          <w:p>
-            <w:pPr>
-              <w:spacing w:after="0" w:before="0" w:line="264"/>
-              <w:jc w:val="center"/>
-            </w:pPr>
-            <w:r>
-              <w:rPr>
-                <w:rFonts w:ascii="Times New Roman" w:cs="Times New Roman" w:eastAsia="Times New Roman" w:hAnsi="Times New Roman"/>
-                <w:sz w:val="20"/>
-                <w:szCs w:val="20"/>
-              </w:rPr>
-              <w:t xml:space="preserve">Rp15.000</w:t>
+            <w:shd w:fill="D6EDF1" w:color="auto" w:val="clear"/>
+            <w:tcMar>
+              <w:top w:type="dxa" w:w="40"/>
+              <w:left w:type="dxa" w:w="110"/>
+              <w:bottom w:type="dxa" w:w="40"/>
+              <w:right w:type="dxa" w:w="110"/>
+            </w:tcMar>
+            <w:vAlign w:val="top"/>
+          </w:tcPr>
+          <w:p>
+            <w:pPr>
+              <w:keepNext/>
+              <w:spacing w:after="0" w:before="0" w:line="264"/>
+              <w:jc w:val="center"/>
+            </w:pPr>
+            <w:r>
+              <w:rPr>
+                <w:rFonts w:ascii="Times New Roman" w:cs="Times New Roman" w:eastAsia="Times New Roman" w:hAnsi="Times New Roman"/>
+                <w:b/>
+                <w:bCs/>
+                <w:sz w:val="24"/>
+                <w:szCs w:val="24"/>
+              </w:rPr>
+              <w:t xml:space="preserve">Price per unit</w:t>
             </w:r>
           </w:p>
         </w:tc>
@@ -8111,26 +8069,30 @@
               <w:bottom w:val="single" w:color="000000" w:sz="4"/>
               <w:right w:val="single" w:color="000000" w:sz="4"/>
             </w:tcBorders>
-            <w:tcMar>
-              <w:top w:type="dxa" w:w="40"/>
-              <w:left w:type="dxa" w:w="110"/>
-              <w:bottom w:type="dxa" w:w="40"/>
-              <w:right w:type="dxa" w:w="110"/>
-            </w:tcMar>
-            <w:vAlign w:val="center"/>
-          </w:tcPr>
-          <w:p>
-            <w:pPr>
-              <w:spacing w:after="0" w:before="0" w:line="264"/>
-              <w:jc w:val="center"/>
-            </w:pPr>
-            <w:r>
-              <w:rPr>
-                <w:rFonts w:ascii="Times New Roman" w:cs="Times New Roman" w:eastAsia="Times New Roman" w:hAnsi="Times New Roman"/>
-                <w:sz w:val="20"/>
-                <w:szCs w:val="20"/>
-              </w:rPr>
-              <w:t xml:space="preserve">1</w:t>
+            <w:shd w:fill="D6EDF1" w:color="auto" w:val="clear"/>
+            <w:tcMar>
+              <w:top w:type="dxa" w:w="40"/>
+              <w:left w:type="dxa" w:w="110"/>
+              <w:bottom w:type="dxa" w:w="40"/>
+              <w:right w:type="dxa" w:w="110"/>
+            </w:tcMar>
+            <w:vAlign w:val="top"/>
+          </w:tcPr>
+          <w:p>
+            <w:pPr>
+              <w:keepNext/>
+              <w:spacing w:after="0" w:before="0" w:line="264"/>
+              <w:jc w:val="center"/>
+            </w:pPr>
+            <w:r>
+              <w:rPr>
+                <w:rFonts w:ascii="Times New Roman" w:cs="Times New Roman" w:eastAsia="Times New Roman" w:hAnsi="Times New Roman"/>
+                <w:b/>
+                <w:bCs/>
+                <w:sz w:val="24"/>
+                <w:szCs w:val="24"/>
+              </w:rPr>
+              <w:t xml:space="preserve">Qty</w:t>
             </w:r>
           </w:p>
         </w:tc>
@@ -8143,26 +8105,30 @@
               <w:bottom w:val="single" w:color="000000" w:sz="4"/>
               <w:right w:val="single" w:color="000000" w:sz="4"/>
             </w:tcBorders>
-            <w:tcMar>
-              <w:top w:type="dxa" w:w="40"/>
-              <w:left w:type="dxa" w:w="110"/>
-              <w:bottom w:type="dxa" w:w="40"/>
-              <w:right w:type="dxa" w:w="110"/>
-            </w:tcMar>
-            <w:vAlign w:val="center"/>
-          </w:tcPr>
-          <w:p>
-            <w:pPr>
-              <w:spacing w:after="0" w:before="0" w:line="264"/>
-              <w:jc w:val="center"/>
-            </w:pPr>
-            <w:r>
-              <w:rPr>
-                <w:rFonts w:ascii="Times New Roman" w:cs="Times New Roman" w:eastAsia="Times New Roman" w:hAnsi="Times New Roman"/>
-                <w:sz w:val="20"/>
-                <w:szCs w:val="20"/>
-              </w:rPr>
-              <w:t xml:space="preserve">paket</w:t>
+            <w:shd w:fill="D6EDF1" w:color="auto" w:val="clear"/>
+            <w:tcMar>
+              <w:top w:type="dxa" w:w="40"/>
+              <w:left w:type="dxa" w:w="110"/>
+              <w:bottom w:type="dxa" w:w="40"/>
+              <w:right w:type="dxa" w:w="110"/>
+            </w:tcMar>
+            <w:vAlign w:val="top"/>
+          </w:tcPr>
+          <w:p>
+            <w:pPr>
+              <w:keepNext/>
+              <w:spacing w:after="0" w:before="0" w:line="264"/>
+              <w:jc w:val="center"/>
+            </w:pPr>
+            <w:r>
+              <w:rPr>
+                <w:rFonts w:ascii="Times New Roman" w:cs="Times New Roman" w:eastAsia="Times New Roman" w:hAnsi="Times New Roman"/>
+                <w:b/>
+                <w:bCs/>
+                <w:sz w:val="24"/>
+                <w:szCs w:val="24"/>
+              </w:rPr>
+              <w:t xml:space="preserve">Unit</w:t>
             </w:r>
           </w:p>
         </w:tc>
@@ -8175,26 +8141,30 @@
               <w:bottom w:val="single" w:color="000000" w:sz="4"/>
               <w:right w:val="single" w:color="000000" w:sz="4"/>
             </w:tcBorders>
-            <w:tcMar>
-              <w:top w:type="dxa" w:w="40"/>
-              <w:left w:type="dxa" w:w="110"/>
-              <w:bottom w:type="dxa" w:w="40"/>
-              <w:right w:type="dxa" w:w="110"/>
-            </w:tcMar>
-            <w:vAlign w:val="center"/>
-          </w:tcPr>
-          <w:p>
-            <w:pPr>
-              <w:spacing w:after="0" w:before="0" w:line="264"/>
-              <w:jc w:val="center"/>
-            </w:pPr>
-            <w:r>
-              <w:rPr>
-                <w:rFonts w:ascii="Times New Roman" w:cs="Times New Roman" w:eastAsia="Times New Roman" w:hAnsi="Times New Roman"/>
-                <w:sz w:val="20"/>
-                <w:szCs w:val="20"/>
-              </w:rPr>
-              <w:t xml:space="preserve">Rp15.000</w:t>
+            <w:shd w:fill="D6EDF1" w:color="auto" w:val="clear"/>
+            <w:tcMar>
+              <w:top w:type="dxa" w:w="40"/>
+              <w:left w:type="dxa" w:w="110"/>
+              <w:bottom w:type="dxa" w:w="40"/>
+              <w:right w:type="dxa" w:w="110"/>
+            </w:tcMar>
+            <w:vAlign w:val="top"/>
+          </w:tcPr>
+          <w:p>
+            <w:pPr>
+              <w:keepNext/>
+              <w:spacing w:after="0" w:before="0" w:line="264"/>
+              <w:jc w:val="center"/>
+            </w:pPr>
+            <w:r>
+              <w:rPr>
+                <w:rFonts w:ascii="Times New Roman" w:cs="Times New Roman" w:eastAsia="Times New Roman" w:hAnsi="Times New Roman"/>
+                <w:b/>
+                <w:bCs/>
+                <w:sz w:val="24"/>
+                <w:szCs w:val="24"/>
+              </w:rPr>
+              <w:t xml:space="preserve">Total Price</w:t>
             </w:r>
           </w:p>
         </w:tc>
@@ -8205,34 +8175,129 @@
         </w:trPr>
         <w:tc>
           <w:tcPr>
-            <w:tcW w:type="dxa" w:w="7760"/>
-            <w:gridSpan w:val="4"/>
-            <w:tcBorders>
-              <w:top w:val="single" w:color="000000" w:sz="4"/>
-              <w:left w:val="single" w:color="000000" w:sz="4"/>
-              <w:bottom w:val="single" w:color="000000" w:sz="4"/>
-              <w:right w:val="single" w:color="000000" w:sz="4"/>
-            </w:tcBorders>
-            <w:tcMar>
-              <w:top w:type="dxa" w:w="40"/>
-              <w:left w:type="dxa" w:w="110"/>
-              <w:bottom w:type="dxa" w:w="40"/>
-              <w:right w:type="dxa" w:w="110"/>
-            </w:tcMar>
-            <w:vAlign w:val="top"/>
-          </w:tcPr>
-          <w:p>
-            <w:pPr>
-              <w:spacing w:after="0" w:before="0" w:line="264"/>
-              <w:jc w:val="center"/>
-            </w:pPr>
-            <w:r>
-              <w:rPr>
-                <w:rFonts w:ascii="Times New Roman" w:cs="Times New Roman" w:eastAsia="Times New Roman" w:hAnsi="Times New Roman"/>
-                <w:sz w:val="20"/>
-                <w:szCs w:val="20"/>
-              </w:rPr>
-              <w:t xml:space="preserve">Sub Total</w:t>
+            <w:tcW w:type="dxa" w:w="4100"/>
+            <w:tcBorders>
+              <w:top w:val="single" w:color="000000" w:sz="4"/>
+              <w:left w:val="single" w:color="000000" w:sz="4"/>
+              <w:bottom w:val="single" w:color="000000" w:sz="4"/>
+              <w:right w:val="single" w:color="000000" w:sz="4"/>
+            </w:tcBorders>
+            <w:tcMar>
+              <w:top w:type="dxa" w:w="40"/>
+              <w:left w:type="dxa" w:w="110"/>
+              <w:bottom w:type="dxa" w:w="40"/>
+              <w:right w:type="dxa" w:w="110"/>
+            </w:tcMar>
+            <w:vAlign w:val="center"/>
+          </w:tcPr>
+          <w:p>
+            <w:pPr>
+              <w:spacing w:after="0" w:before="0" w:line="264"/>
+              <w:jc w:val="center"/>
+            </w:pPr>
+            <w:r>
+              <w:rPr>
+                <w:rFonts w:ascii="Times New Roman" w:cs="Times New Roman" w:eastAsia="Times New Roman" w:hAnsi="Times New Roman"/>
+                <w:sz w:val="20"/>
+                <w:szCs w:val="20"/>
+              </w:rPr>
+              <w:t xml:space="preserve">Timah solder + flux</w:t>
+            </w:r>
+          </w:p>
+        </w:tc>
+        <w:tc>
+          <w:tcPr>
+            <w:tcW w:type="dxa" w:w="1700"/>
+            <w:tcBorders>
+              <w:top w:val="single" w:color="000000" w:sz="4"/>
+              <w:left w:val="single" w:color="000000" w:sz="4"/>
+              <w:bottom w:val="single" w:color="000000" w:sz="4"/>
+              <w:right w:val="single" w:color="000000" w:sz="4"/>
+            </w:tcBorders>
+            <w:tcMar>
+              <w:top w:type="dxa" w:w="40"/>
+              <w:left w:type="dxa" w:w="110"/>
+              <w:bottom w:type="dxa" w:w="40"/>
+              <w:right w:type="dxa" w:w="110"/>
+            </w:tcMar>
+            <w:vAlign w:val="center"/>
+          </w:tcPr>
+          <w:p>
+            <w:pPr>
+              <w:spacing w:after="0" w:before="0" w:line="264"/>
+              <w:jc w:val="center"/>
+            </w:pPr>
+            <w:r>
+              <w:rPr>
+                <w:rFonts w:ascii="Times New Roman" w:cs="Times New Roman" w:eastAsia="Times New Roman" w:hAnsi="Times New Roman"/>
+                <w:sz w:val="20"/>
+                <w:szCs w:val="20"/>
+              </w:rPr>
+              <w:t xml:space="preserve">Rp25.000</w:t>
+            </w:r>
+          </w:p>
+        </w:tc>
+        <w:tc>
+          <w:tcPr>
+            <w:tcW w:type="dxa" w:w="800"/>
+            <w:tcBorders>
+              <w:top w:val="single" w:color="000000" w:sz="4"/>
+              <w:left w:val="single" w:color="000000" w:sz="4"/>
+              <w:bottom w:val="single" w:color="000000" w:sz="4"/>
+              <w:right w:val="single" w:color="000000" w:sz="4"/>
+            </w:tcBorders>
+            <w:tcMar>
+              <w:top w:type="dxa" w:w="40"/>
+              <w:left w:type="dxa" w:w="110"/>
+              <w:bottom w:type="dxa" w:w="40"/>
+              <w:right w:type="dxa" w:w="110"/>
+            </w:tcMar>
+            <w:vAlign w:val="center"/>
+          </w:tcPr>
+          <w:p>
+            <w:pPr>
+              <w:spacing w:after="0" w:before="0" w:line="264"/>
+              <w:jc w:val="center"/>
+            </w:pPr>
+            <w:r>
+              <w:rPr>
+                <w:rFonts w:ascii="Times New Roman" w:cs="Times New Roman" w:eastAsia="Times New Roman" w:hAnsi="Times New Roman"/>
+                <w:sz w:val="20"/>
+                <w:szCs w:val="20"/>
+              </w:rPr>
+              <w:t xml:space="preserve">1</w:t>
+            </w:r>
+          </w:p>
+        </w:tc>
+        <w:tc>
+          <w:tcPr>
+            <w:tcW w:type="dxa" w:w="1160"/>
+            <w:tcBorders>
+              <w:top w:val="single" w:color="000000" w:sz="4"/>
+              <w:left w:val="single" w:color="000000" w:sz="4"/>
+              <w:bottom w:val="single" w:color="000000" w:sz="4"/>
+              <w:right w:val="single" w:color="000000" w:sz="4"/>
+            </w:tcBorders>
+            <w:tcMar>
+              <w:top w:type="dxa" w:w="40"/>
+              <w:left w:type="dxa" w:w="110"/>
+              <w:bottom w:type="dxa" w:w="40"/>
+              <w:right w:type="dxa" w:w="110"/>
+            </w:tcMar>
+            <w:vAlign w:val="center"/>
+          </w:tcPr>
+          <w:p>
+            <w:pPr>
+              <w:spacing w:after="0" w:before="0" w:line="264"/>
+              <w:jc w:val="center"/>
+            </w:pPr>
+            <w:r>
+              <w:rPr>
+                <w:rFonts w:ascii="Times New Roman" w:cs="Times New Roman" w:eastAsia="Times New Roman" w:hAnsi="Times New Roman"/>
+                <w:sz w:val="20"/>
+                <w:szCs w:val="20"/>
+              </w:rPr>
+              <w:t xml:space="preserve">paket</w:t>
             </w:r>
           </w:p>
         </w:tc>
@@ -8251,22 +8316,20 @@
               <w:bottom w:type="dxa" w:w="40"/>
               <w:right w:type="dxa" w:w="110"/>
             </w:tcMar>
-            <w:vAlign w:val="top"/>
-          </w:tcPr>
-          <w:p>
-            <w:pPr>
-              <w:spacing w:after="0" w:before="0" w:line="264"/>
-              <w:jc w:val="center"/>
-            </w:pPr>
-            <w:r>
-              <w:rPr>
-                <w:rFonts w:ascii="Times New Roman" w:cs="Times New Roman" w:eastAsia="Times New Roman" w:hAnsi="Times New Roman"/>
-                <w:b/>
-                <w:bCs/>
-                <w:sz w:val="20"/>
-                <w:szCs w:val="20"/>
-              </w:rPr>
-              <w:t xml:space="preserve">Rp55.000</w:t>
+            <w:vAlign w:val="center"/>
+          </w:tcPr>
+          <w:p>
+            <w:pPr>
+              <w:spacing w:after="0" w:before="0" w:line="264"/>
+              <w:jc w:val="center"/>
+            </w:pPr>
+            <w:r>
+              <w:rPr>
+                <w:rFonts w:ascii="Times New Roman" w:cs="Times New Roman" w:eastAsia="Times New Roman" w:hAnsi="Times New Roman"/>
+                <w:sz w:val="20"/>
+                <w:szCs w:val="20"/>
+              </w:rPr>
+              <w:t xml:space="preserve">Rp25.000</w:t>
             </w:r>
           </w:p>
         </w:tc>
@@ -8301,18 +8364,56 @@
             <w:r>
               <w:rPr>
                 <w:rFonts w:ascii="Times New Roman" w:cs="Times New Roman" w:eastAsia="Times New Roman" w:hAnsi="Times New Roman"/>
+                <w:sz w:val="20"/>
+                <w:szCs w:val="20"/>
+              </w:rPr>
+              <w:t xml:space="preserve">Sub Total</w:t>
+            </w:r>
+          </w:p>
+        </w:tc>
+        <w:tc>
+          <w:tcPr>
+            <w:tcW w:type="dxa" w:w="2300"/>
+            <w:tcBorders>
+              <w:top w:val="single" w:color="000000" w:sz="4"/>
+              <w:left w:val="single" w:color="000000" w:sz="4"/>
+              <w:bottom w:val="single" w:color="000000" w:sz="4"/>
+              <w:right w:val="single" w:color="000000" w:sz="4"/>
+            </w:tcBorders>
+            <w:tcMar>
+              <w:top w:type="dxa" w:w="40"/>
+              <w:left w:type="dxa" w:w="110"/>
+              <w:bottom w:type="dxa" w:w="40"/>
+              <w:right w:type="dxa" w:w="110"/>
+            </w:tcMar>
+            <w:vAlign w:val="top"/>
+          </w:tcPr>
+          <w:p>
+            <w:pPr>
+              <w:spacing w:after="0" w:before="0" w:line="264"/>
+              <w:jc w:val="center"/>
+            </w:pPr>
+            <w:r>
+              <w:rPr>
+                <w:rFonts w:ascii="Times New Roman" w:cs="Times New Roman" w:eastAsia="Times New Roman" w:hAnsi="Times New Roman"/>
                 <w:b/>
                 <w:bCs/>
-                <w:sz w:val="24"/>
-                <w:szCs w:val="24"/>
-              </w:rPr>
-              <w:t xml:space="preserve">TOTAL BUDGET</w:t>
-            </w:r>
-          </w:p>
-        </w:tc>
-        <w:tc>
-          <w:tcPr>
-            <w:tcW w:type="dxa" w:w="2300"/>
+                <w:sz w:val="20"/>
+                <w:szCs w:val="20"/>
+              </w:rPr>
+              <w:t xml:space="preserve">Rp25.000</w:t>
+            </w:r>
+          </w:p>
+        </w:tc>
+      </w:tr>
+      <w:tr>
+        <w:trPr>
+          <w:cantSplit/>
+        </w:trPr>
+        <w:tc>
+          <w:tcPr>
+            <w:tcW w:type="dxa" w:w="7760"/>
+            <w:gridSpan w:val="4"/>
             <w:tcBorders>
               <w:top w:val="single" w:color="000000" w:sz="4"/>
               <w:left w:val="single" w:color="000000" w:sz="4"/>
@@ -8340,7 +8441,41 @@
                 <w:sz w:val="24"/>
                 <w:szCs w:val="24"/>
               </w:rPr>
-              <w:t xml:space="preserve">Rp887.000</w:t>
+              <w:t xml:space="preserve">TOTAL BUDGET</w:t>
+            </w:r>
+          </w:p>
+        </w:tc>
+        <w:tc>
+          <w:tcPr>
+            <w:tcW w:type="dxa" w:w="2300"/>
+            <w:tcBorders>
+              <w:top w:val="single" w:color="000000" w:sz="4"/>
+              <w:left w:val="single" w:color="000000" w:sz="4"/>
+              <w:bottom w:val="single" w:color="000000" w:sz="4"/>
+              <w:right w:val="single" w:color="000000" w:sz="4"/>
+            </w:tcBorders>
+            <w:tcMar>
+              <w:top w:type="dxa" w:w="40"/>
+              <w:left w:type="dxa" w:w="110"/>
+              <w:bottom w:type="dxa" w:w="40"/>
+              <w:right w:type="dxa" w:w="110"/>
+            </w:tcMar>
+            <w:vAlign w:val="top"/>
+          </w:tcPr>
+          <w:p>
+            <w:pPr>
+              <w:spacing w:after="0" w:before="0" w:line="264"/>
+              <w:jc w:val="center"/>
+            </w:pPr>
+            <w:r>
+              <w:rPr>
+                <w:rFonts w:ascii="Times New Roman" w:cs="Times New Roman" w:eastAsia="Times New Roman" w:hAnsi="Times New Roman"/>
+                <w:b/>
+                <w:bCs/>
+                <w:sz w:val="24"/>
+                <w:szCs w:val="24"/>
+              </w:rPr>
+              <w:t xml:space="preserve">Rp937.390</w:t>
             </w:r>
           </w:p>
         </w:tc>
@@ -8680,7 +8815,7 @@
       </w:tr>
     </w:tbl>
     <w:sectPr>
-      <w:headerReference w:type="default" r:id="rId7"/>
+      <w:headerReference w:type="default" r:id="rId6"/>
       <w:pgSz w:w="11906" w:h="16838" w:orient="portrait"/>
       <w:pgMar w:top="1440" w:right="546" w:bottom="1300" w:left="1300" w:header="0" w:footer="500" w:gutter="0"/>
       <w:pgNumType/>
@@ -8688,10 +8823,6 @@
     </w:sectPr>
   </w:body>
 </w:document>
-</file>
-
-<file path=word/comments.xml><?xml version="1.0" encoding="utf-8"?>
-<w:comments xmlns:cx="http://schemas.microsoft.com/office/drawing/2014/chartex" xmlns:cx1="http://schemas.microsoft.com/office/drawing/2015/9/8/chartex" xmlns:cx2="http://schemas.microsoft.com/office/drawing/2015/10/21/chartex" xmlns:cx3="http://schemas.microsoft.com/office/drawing/2016/5/9/chartex" xmlns:cx4="http://schemas.microsoft.com/office/drawing/2016/5/10/chartex" xmlns:cx5="http://schemas.microsoft.com/office/drawing/2016/5/11/chartex" xmlns:cx6="http://schemas.microsoft.com/office/drawing/2016/5/12/chartex" xmlns:cx7="http://schemas.microsoft.com/office/drawing/2016/5/13/chartex" xmlns:cx8="http://schemas.microsoft.com/office/drawing/2016/5/14/chartex" xmlns:mc="http://schemas.openxmlformats.org/markup-compatibility/2006" xmlns:aink="http://schemas.microsoft.com/office/drawing/2016/ink" xmlns:am3d="http://schemas.microsoft.com/office/drawing/2017/model3d" xmlns:o="urn:schemas-microsoft-com:office:office" xmlns:r="http://schemas.openxmlformats.org/officeDocument/2006/relationships" xmlns:m="http://schemas.openxmlformats.org/officeDocument/2006/math" xmlns:v="urn:schemas-microsoft-com:vml" xmlns:wp14="http://schemas.microsoft.com/office/word/2010/wordprocessingDrawing" xmlns:wp="http://schemas.openxmlformats.org/drawingml/2006/wordprocessingDrawing" xmlns:w10="urn:schemas-microsoft-com:office:word" xmlns:w="http://schemas.openxmlformats.org/wordprocessingml/2006/main" xmlns:w14="http://schemas.microsoft.com/office/word/2010/wordml" xmlns:w15="http://schemas.microsoft.com/office/word/2012/wordml" xmlns:w16cex="http://schemas.microsoft.com/office/word/2018/wordml/cex" xmlns:w16cid="http://schemas.microsoft.com/office/word/2016/wordml/cid" xmlns:w16="http://schemas.microsoft.com/office/word/2018/wordml" xmlns:w16sdtdh="http://schemas.microsoft.com/office/word/2020/wordml/sdtdatahash" xmlns:w16se="http://schemas.microsoft.com/office/word/2015/wordml/symex" xmlns:wpg="http://schemas.microsoft.com/office/word/2010/wordprocessingGroup" xmlns:wpi="http://schemas.microsoft.com/office/word/2010/wordprocessingInk" xmlns:wne="http://schemas.microsoft.com/office/word/2006/wordml" xmlns:wps="http://schemas.microsoft.com/office/word/2010/wordprocessingShape"/>
 </file>
 
 <file path=word/endnotes.xml><?xml version="1.0" encoding="utf-8"?>
@@ -8784,7 +8915,7 @@
           <wp:extent cx="7562850" cy="504825"/>
           <wp:effectExtent t="0" r="0" b="0" l="0"/>
           <wp:wrapNone/>
-          <wp:docPr id="1" name="" descr="" title=""/>
+          <wp:docPr id="1" name=""/>
           <wp:cNvGraphicFramePr>
             <a:graphicFrameLocks xmlns:a="http://schemas.openxmlformats.org/drawingml/2006/main" noChangeAspect="1"/>
           </wp:cNvGraphicFramePr>
@@ -8827,7 +8958,7 @@
 <w:numbering xmlns:wpc="http://schemas.microsoft.com/office/word/2010/wordprocessingCanvas" xmlns:mc="http://schemas.openxmlformats.org/markup-compatibility/2006" xmlns:o="urn:schemas-microsoft-com:office:office" xmlns:r="http://schemas.openxmlformats.org/officeDocument/2006/relationships" xmlns:m="http://schemas.openxmlformats.org/officeDocument/2006/math" xmlns:v="urn:schemas-microsoft-com:vml" xmlns:wp14="http://schemas.microsoft.com/office/word/2010/wordprocessingDrawing" xmlns:wp="http://schemas.openxmlformats.org/drawingml/2006/wordprocessingDrawing" xmlns:w10="urn:schemas-microsoft-com:office:word" xmlns:w="http://schemas.openxmlformats.org/wordprocessingml/2006/main" xmlns:w14="http://schemas.microsoft.com/office/word/2010/wordml" xmlns:w15="http://schemas.microsoft.com/office/word/2012/wordml" xmlns:wpg="http://schemas.microsoft.com/office/word/2010/wordprocessingGroup" xmlns:wpi="http://schemas.microsoft.com/office/word/2010/wordprocessingInk" xmlns:wne="http://schemas.microsoft.com/office/word/2006/wordml" xmlns:wps="http://schemas.microsoft.com/office/word/2010/wordprocessingShape" mc:Ignorable="w14 w15 wp14">
   <w:abstractNum w:abstractNumId="1" w15:restartNumberingAfterBreak="0">
     <w:multiLevelType w:val="hybridMultilevel"/>
-    <w:lvl w:ilvl="0" w15:tentative="1">
+    <w:lvl w:ilvl="0" w:tentative="1">
       <w:start w:val="1"/>
       <w:numFmt w:val="bullet"/>
       <w:lvlText w:val="●"/>
@@ -8836,7 +8967,7 @@
         <w:ind w:left="720" w:hanging="360"/>
       </w:pPr>
     </w:lvl>
-    <w:lvl w:ilvl="1" w15:tentative="1">
+    <w:lvl w:ilvl="1" w:tentative="1">
       <w:start w:val="1"/>
       <w:numFmt w:val="bullet"/>
       <w:lvlText w:val="○"/>
@@ -8845,7 +8976,7 @@
         <w:ind w:left="1440" w:hanging="360"/>
       </w:pPr>
     </w:lvl>
-    <w:lvl w:ilvl="2" w15:tentative="1">
+    <w:lvl w:ilvl="2" w:tentative="1">
       <w:start w:val="1"/>
       <w:numFmt w:val="bullet"/>
       <w:lvlText w:val="■"/>
@@ -8854,7 +8985,7 @@
         <w:ind w:left="2160" w:hanging="360"/>
       </w:pPr>
     </w:lvl>
-    <w:lvl w:ilvl="3" w15:tentative="1">
+    <w:lvl w:ilvl="3" w:tentative="1">
       <w:start w:val="1"/>
       <w:numFmt w:val="bullet"/>
       <w:lvlText w:val="●"/>
@@ -8863,7 +8994,7 @@
         <w:ind w:left="2880" w:hanging="360"/>
       </w:pPr>
     </w:lvl>
-    <w:lvl w:ilvl="4" w15:tentative="1">
+    <w:lvl w:ilvl="4" w:tentative="1">
       <w:start w:val="1"/>
       <w:numFmt w:val="bullet"/>
       <w:lvlText w:val="○"/>
@@ -8872,7 +9003,7 @@
         <w:ind w:left="3600" w:hanging="360"/>
       </w:pPr>
     </w:lvl>
-    <w:lvl w:ilvl="5" w15:tentative="1">
+    <w:lvl w:ilvl="5" w:tentative="1">
       <w:start w:val="1"/>
       <w:numFmt w:val="bullet"/>
       <w:lvlText w:val="■"/>
@@ -8881,7 +9012,7 @@
         <w:ind w:left="4320" w:hanging="360"/>
       </w:pPr>
     </w:lvl>
-    <w:lvl w:ilvl="6" w15:tentative="1">
+    <w:lvl w:ilvl="6" w:tentative="1">
       <w:start w:val="1"/>
       <w:numFmt w:val="bullet"/>
       <w:lvlText w:val="●"/>
@@ -8890,7 +9021,7 @@
         <w:ind w:left="5040" w:hanging="360"/>
       </w:pPr>
     </w:lvl>
-    <w:lvl w:ilvl="7" w15:tentative="1">
+    <w:lvl w:ilvl="7" w:tentative="1">
       <w:start w:val="1"/>
       <w:numFmt w:val="bullet"/>
       <w:lvlText w:val="●"/>
@@ -8899,7 +9030,7 @@
         <w:ind w:left="5760" w:hanging="360"/>
       </w:pPr>
     </w:lvl>
-    <w:lvl w:ilvl="8" w15:tentative="1">
+    <w:lvl w:ilvl="8" w:tentative="1">
       <w:start w:val="1"/>
       <w:numFmt w:val="bullet"/>
       <w:lvlText w:val="●"/>
@@ -8911,7 +9042,7 @@
   </w:abstractNum>
   <w:abstractNum w:abstractNumId="2" w15:restartNumberingAfterBreak="0">
     <w:multiLevelType w:val="hybridMultilevel"/>
-    <w:lvl w:ilvl="0" w15:tentative="1">
+    <w:lvl w:ilvl="0" w:tentative="1">
       <w:start w:val="1"/>
       <w:numFmt w:val="decimal"/>
       <w:lvlText w:val="%1."/>
@@ -8923,7 +9054,7 @@
   </w:abstractNum>
   <w:abstractNum w:abstractNumId="3" w15:restartNumberingAfterBreak="0">
     <w:multiLevelType w:val="hybridMultilevel"/>
-    <w:lvl w:ilvl="0" w15:tentative="1">
+    <w:lvl w:ilvl="0" w:tentative="1">
       <w:start w:val="1"/>
       <w:numFmt w:val="decimal"/>
       <w:lvlText w:val="%1."/>
@@ -8940,7 +9071,7 @@
   </w:abstractNum>
   <w:abstractNum w:abstractNumId="4" w15:restartNumberingAfterBreak="0">
     <w:multiLevelType w:val="hybridMultilevel"/>
-    <w:lvl w:ilvl="0" w15:tentative="1">
+    <w:lvl w:ilvl="0" w:tentative="1">
       <w:start w:val="1"/>
       <w:numFmt w:val="decimal"/>
       <w:lvlText w:val="%1."/>
@@ -8952,7 +9083,7 @@
   </w:abstractNum>
   <w:abstractNum w:abstractNumId="5" w15:restartNumberingAfterBreak="0">
     <w:multiLevelType w:val="hybridMultilevel"/>
-    <w:lvl w:ilvl="0" w15:tentative="1">
+    <w:lvl w:ilvl="0" w:tentative="1">
       <w:start w:val="1"/>
       <w:numFmt w:val="bullet"/>
       <w:lvlText w:val="●"/>
@@ -9012,6 +9143,25 @@
     </w:rPrDefault>
     <w:pPrDefault/>
   </w:docDefaults>
+  <w:style w:type="paragraph" w:styleId="Normal" w:default="1">
+    <w:name w:val="Normal"/>
+    <w:qFormat/>
+  </w:style>
+  <w:style w:type="table" w:styleId="TableNormal" w:default="true">
+    <w:name w:val="Normal Table"/>
+    <w:uiPriority w:val="99"/>
+    <w:semiHidden/>
+    <w:unhideWhenUsed/>
+    <w:tblPr>
+      <w:tblInd w:type="dxa" w:w="0"/>
+      <w:tblCellMar>
+        <w:top w:type="dxa" w:w="0"/>
+        <w:left w:type="dxa" w:w="108"/>
+        <w:bottom w:type="dxa" w:w="0"/>
+        <w:right w:type="dxa" w:w="108"/>
+      </w:tblCellMar>
+    </w:tblPr>
+  </w:style>
   <w:style w:type="paragraph" w:styleId="Title">
     <w:name w:val="Title"/>
     <w:basedOn w:val="Normal"/>
@@ -9184,4 +9334,294 @@
     </w:rPr>
   </w:style>
 </w:styles>
+</file>
+
+<file path=word/theme/theme1.xml><?xml version="1.0" encoding="utf-8"?>
+<a:theme xmlns:a="http://schemas.openxmlformats.org/drawingml/2006/main" name="Office Theme">
+  <a:themeElements>
+    <a:clrScheme name="Office">
+      <a:dk1>
+        <a:sysClr val="windowText" lastClr="000000"/>
+      </a:dk1>
+      <a:lt1>
+        <a:sysClr val="window" lastClr="FFFFFF"/>
+      </a:lt1>
+      <a:dk2>
+        <a:srgbClr val="44546A"/>
+      </a:dk2>
+      <a:lt2>
+        <a:srgbClr val="E7E6E6"/>
+      </a:lt2>
+      <a:accent1>
+        <a:srgbClr val="4472C4"/>
+      </a:accent1>
+      <a:accent2>
+        <a:srgbClr val="ED7D31"/>
+      </a:accent2>
+      <a:accent3>
+        <a:srgbClr val="A5A5A5"/>
+      </a:accent3>
+      <a:accent4>
+        <a:srgbClr val="FFC000"/>
+      </a:accent4>
+      <a:accent5>
+        <a:srgbClr val="5B9BD5"/>
+      </a:accent5>
+      <a:accent6>
+        <a:srgbClr val="70AD47"/>
+      </a:accent6>
+      <a:hlink>
+        <a:srgbClr val="0563C1"/>
+      </a:hlink>
+      <a:folHlink>
+        <a:srgbClr val="954F72"/>
+      </a:folHlink>
+    </a:clrScheme>
+    <a:fontScheme name="Office">
+      <a:majorFont>
+        <a:latin typeface="Calibri Light" panose="020F0302020204030204"/>
+        <a:ea typeface=""/>
+        <a:cs typeface=""/>
+        <a:font script="Jpan" typeface="游ゴシック Light"/>
+        <a:font script="Hang" typeface="맑은 고딕"/>
+        <a:font script="Hans" typeface="等线 Light"/>
+        <a:font script="Hant" typeface="新細明體"/>
+        <a:font script="Arab" typeface="Times New Roman"/>
+        <a:font script="Hebr" typeface="Times New Roman"/>
+        <a:font script="Thai" typeface="Angsana New"/>
+        <a:font script="Ethi" typeface="Nyala"/>
+        <a:font script="Beng" typeface="Vrinda"/>
+        <a:font script="Gujr" typeface="Shruti"/>
+        <a:font script="Khmr" typeface="MoolBoran"/>
+        <a:font script="Knda" typeface="Tunga"/>
+        <a:font script="Guru" typeface="Raavi"/>
+        <a:font script="Cans" typeface="Euphemia"/>
+        <a:font script="Cher" typeface="Plantagenet Cherokee"/>
+        <a:font script="Yiii" typeface="Microsoft Yi Baiti"/>
+        <a:font script="Tibt" typeface="Microsoft Himalaya"/>
+        <a:font script="Thaa" typeface="MV Boli"/>
+        <a:font script="Deva" typeface="Mangal"/>
+        <a:font script="Telu" typeface="Gautami"/>
+        <a:font script="Taml" typeface="Latha"/>
+        <a:font script="Syrc" typeface="Estrangelo Edessa"/>
+        <a:font script="Orya" typeface="Kalinga"/>
+        <a:font script="Mlym" typeface="Kartika"/>
+        <a:font script="Laoo" typeface="DokChampa"/>
+        <a:font script="Sinh" typeface="Iskoola Pota"/>
+        <a:font script="Mong" typeface="Mongolian Baiti"/>
+        <a:font script="Viet" typeface="Times New Roman"/>
+        <a:font script="Uigh" typeface="Microsoft Uighur"/>
+        <a:font script="Geor" typeface="Sylfaen"/>
+        <a:font script="Armn" typeface="Arial"/>
+        <a:font script="Bugi" typeface="Leelawadee UI"/>
+        <a:font script="Bopo" typeface="Microsoft JhengHei"/>
+        <a:font script="Java" typeface="Javanese Text"/>
+        <a:font script="Lisu" typeface="Segoe UI"/>
+        <a:font script="Mymr" typeface="Myanmar Text"/>
+        <a:font script="Nkoo" typeface="Ebrima"/>
+        <a:font script="Olck" typeface="Nirmala UI"/>
+        <a:font script="Osma" typeface="Ebrima"/>
+        <a:font script="Phag" typeface="Phagspa"/>
+        <a:font script="Syrn" typeface="Estrangelo Edessa"/>
+        <a:font script="Syrj" typeface="Estrangelo Edessa"/>
+        <a:font script="Syre" typeface="Estrangelo Edessa"/>
+        <a:font script="Sora" typeface="Nirmala UI"/>
+        <a:font script="Tale" typeface="Microsoft Tai Le"/>
+        <a:font script="Talu" typeface="Microsoft New Tai Lue"/>
+        <a:font script="Tfng" typeface="Ebrima"/>
+      </a:majorFont>
+      <a:minorFont>
+        <a:latin typeface="Calibri" panose="020F0502020204030204"/>
+        <a:ea typeface=""/>
+        <a:cs typeface=""/>
+        <a:font script="Jpan" typeface="游明朝"/>
+        <a:font script="Hang" typeface="맑은 고딕"/>
+        <a:font script="Hans" typeface="等线"/>
+        <a:font script="Hant" typeface="新細明體"/>
+        <a:font script="Arab" typeface="Arial"/>
+        <a:font script="Hebr" typeface="Arial"/>
+        <a:font script="Thai" typeface="Cordia New"/>
+        <a:font script="Ethi" typeface="Nyala"/>
+        <a:font script="Beng" typeface="Vrinda"/>
+        <a:font script="Gujr" typeface="Shruti"/>
+        <a:font script="Khmr" typeface="DaunPenh"/>
+        <a:font script="Knda" typeface="Tunga"/>
+        <a:font script="Guru" typeface="Raavi"/>
+        <a:font script="Cans" typeface="Euphemia"/>
+        <a:font script="Cher" typeface="Plantagenet Cherokee"/>
+        <a:font script="Yiii" typeface="Microsoft Yi Baiti"/>
+        <a:font script="Tibt" typeface="Microsoft Himalaya"/>
+        <a:font script="Thaa" typeface="MV Boli"/>
+        <a:font script="Deva" typeface="Mangal"/>
+        <a:font script="Telu" typeface="Gautami"/>
+        <a:font script="Taml" typeface="Latha"/>
+        <a:font script="Syrc" typeface="Estrangelo Edessa"/>
+        <a:font script="Orya" typeface="Kalinga"/>
+        <a:font script="Mlym" typeface="Kartika"/>
+        <a:font script="Laoo" typeface="DokChampa"/>
+        <a:font script="Sinh" typeface="Iskoola Pota"/>
+        <a:font script="Mong" typeface="Mongolian Baiti"/>
+        <a:font script="Viet" typeface="Arial"/>
+        <a:font script="Uigh" typeface="Microsoft Uighur"/>
+        <a:font script="Geor" typeface="Sylfaen"/>
+        <a:font script="Armn" typeface="Arial"/>
+        <a:font script="Bugi" typeface="Leelawadee UI"/>
+        <a:font script="Bopo" typeface="Microsoft JhengHei"/>
+        <a:font script="Java" typeface="Javanese Text"/>
+        <a:font script="Lisu" typeface="Segoe UI"/>
+        <a:font script="Mymr" typeface="Myanmar Text"/>
+        <a:font script="Nkoo" typeface="Ebrima"/>
+        <a:font script="Olck" typeface="Nirmala UI"/>
+        <a:font script="Osma" typeface="Ebrima"/>
+        <a:font script="Phag" typeface="Phagspa"/>
+        <a:font script="Syrn" typeface="Estrangelo Edessa"/>
+        <a:font script="Syrj" typeface="Estrangelo Edessa"/>
+        <a:font script="Syre" typeface="Estrangelo Edessa"/>
+        <a:font script="Sora" typeface="Nirmala UI"/>
+        <a:font script="Tale" typeface="Microsoft Tai Le"/>
+        <a:font script="Talu" typeface="Microsoft New Tai Lue"/>
+        <a:font script="Tfng" typeface="Ebrima"/>
+      </a:minorFont>
+    </a:fontScheme>
+    <a:fmtScheme name="Office">
+      <a:fillStyleLst>
+        <a:solidFill>
+          <a:schemeClr val="phClr"/>
+        </a:solidFill>
+        <a:gradFill rotWithShape="true">
+          <a:gsLst>
+            <a:gs pos="0">
+              <a:schemeClr val="phClr">
+                <a:lumMod val="110000"/>
+                <a:satMod val="105000"/>
+                <a:tint val="67000"/>
+              </a:schemeClr>
+            </a:gs>
+            <a:gs pos="50000">
+              <a:schemeClr val="phClr">
+                <a:lumMod val="105000"/>
+                <a:satMod val="103000"/>
+                <a:tint val="73000"/>
+              </a:schemeClr>
+            </a:gs>
+            <a:gs pos="100000">
+              <a:schemeClr val="phClr">
+                <a:lumMod val="105000"/>
+                <a:satMod val="109000"/>
+                <a:tint val="81000"/>
+              </a:schemeClr>
+            </a:gs>
+          </a:gsLst>
+          <a:lin ang="5400000" scaled="false"/>
+        </a:gradFill>
+        <a:gradFill rotWithShape="true">
+          <a:gsLst>
+            <a:gs pos="0">
+              <a:schemeClr val="phClr">
+                <a:satMod val="103000"/>
+                <a:lumMod val="102000"/>
+                <a:tint val="94000"/>
+              </a:schemeClr>
+            </a:gs>
+            <a:gs pos="50000">
+              <a:schemeClr val="phClr">
+                <a:satMod val="110000"/>
+                <a:lumMod val="100000"/>
+                <a:shade val="100000"/>
+              </a:schemeClr>
+            </a:gs>
+            <a:gs pos="100000">
+              <a:schemeClr val="phClr">
+                <a:lumMod val="99000"/>
+                <a:satMod val="120000"/>
+                <a:shade val="78000"/>
+              </a:schemeClr>
+            </a:gs>
+          </a:gsLst>
+          <a:lin ang="5400000" scaled="false"/>
+        </a:gradFill>
+      </a:fillStyleLst>
+      <a:lnStyleLst>
+        <a:ln w="6350" cap="flat" cmpd="sng" algn="ctr">
+          <a:solidFill>
+            <a:schemeClr val="phClr"/>
+          </a:solidFill>
+          <a:prstDash val="solid"/>
+          <a:miter lim="800000"/>
+        </a:ln>
+        <a:ln w="12700" cap="flat" cmpd="sng" algn="ctr">
+          <a:solidFill>
+            <a:schemeClr val="phClr"/>
+          </a:solidFill>
+          <a:prstDash val="solid"/>
+          <a:miter lim="800000"/>
+        </a:ln>
+        <a:ln w="19050" cap="flat" cmpd="sng" algn="ctr">
+          <a:solidFill>
+            <a:schemeClr val="phClr"/>
+          </a:solidFill>
+          <a:prstDash val="solid"/>
+          <a:miter lim="800000"/>
+        </a:ln>
+      </a:lnStyleLst>
+      <a:effectStyleLst>
+        <a:effectStyle>
+          <a:effectLst/>
+        </a:effectStyle>
+        <a:effectStyle>
+          <a:effectLst/>
+        </a:effectStyle>
+        <a:effectStyle>
+          <a:effectLst>
+            <a:outerShdw blurRad="57150" dist="19050" dir="5400000" algn="ctr" rotWithShape="false">
+              <a:srgbClr val="000000">
+                <a:alpha val="63000"/>
+              </a:srgbClr>
+            </a:outerShdw>
+          </a:effectLst>
+        </a:effectStyle>
+      </a:effectStyleLst>
+      <a:bgFillStyleLst>
+        <a:solidFill>
+          <a:schemeClr val="phClr"/>
+        </a:solidFill>
+        <a:solidFill>
+          <a:schemeClr val="phClr">
+            <a:tint val="95000"/>
+            <a:satMod val="170000"/>
+          </a:schemeClr>
+        </a:solidFill>
+        <a:gradFill rotWithShape="true">
+          <a:gsLst>
+            <a:gs pos="0">
+              <a:schemeClr val="phClr">
+                <a:tint val="93000"/>
+                <a:satMod val="150000"/>
+                <a:shade val="98000"/>
+                <a:lumMod val="102000"/>
+              </a:schemeClr>
+            </a:gs>
+            <a:gs pos="50000">
+              <a:schemeClr val="phClr">
+                <a:tint val="98000"/>
+                <a:satMod val="130000"/>
+                <a:shade val="90000"/>
+                <a:lumMod val="103000"/>
+              </a:schemeClr>
+            </a:gs>
+            <a:gs pos="100000">
+              <a:schemeClr val="phClr">
+                <a:shade val="63000"/>
+                <a:satMod val="120000"/>
+              </a:schemeClr>
+            </a:gs>
+          </a:gsLst>
+          <a:lin ang="5400000" scaled="false"/>
+        </a:gradFill>
+      </a:bgFillStyleLst>
+    </a:fmtScheme>
+  </a:themeElements>
+  <a:objectDefaults/>
+  <a:extraClrSchemeLst/>
+</a:theme>
 </file>
</xml_diff>